<commit_message>
Add robustness checks, fingerprint-free feature experiment, prior-art updates; revise manuscript
Co-Authored-By: Claude Sonnet 5.5 <noreply@anthropic.com>
Claude-Session: https://claude.ai/code/session_015BikcSiH9x3JSigSSPaTZS
</commit_message>
<xml_diff>
--- a/paper/Crop_yield_audit_conformal_manuscript.docx
+++ b/paper/Crop_yield_audit_conformal_manuscript.docx
@@ -46,7 +46,7 @@
         <w:rPr>
           <w:sz w:val="20"/>
         </w:rPr>
-        <w:t xml:space="preserve">53% of rows in a public FAO-derived yield file are join fan-out duplicates</w:t>
+        <w:t xml:space="preserve">53% of rows in a public FAO-derived yield file are join fan-out copies, traced exactly</w:t>
       </w:r>
     </w:p>
     <w:p>
@@ -61,7 +61,7 @@
         <w:rPr>
           <w:sz w:val="20"/>
         </w:rPr>
-        <w:t xml:space="preserve">Random splits reward memorising the country; held-out countries fall to R² 0.66</w:t>
+        <w:t xml:space="preserve">A country–crop lookup matches tuned boosting on random splits; held-out countries fall to R² 0.66</w:t>
       </w:r>
     </w:p>
     <w:p>
@@ -76,7 +76,7 @@
         <w:rPr>
           <w:sz w:val="20"/>
         </w:rPr>
-        <w:t xml:space="preserve">Naive conformal intervals cover 60% instead of 90% on unseen countries</w:t>
+        <w:t xml:space="preserve">Naive conformal intervals cover 60% (50% on raw rows) instead of 90% on unseen countries</w:t>
       </w:r>
     </w:p>
     <w:p>
@@ -91,7 +91,7 @@
         <w:rPr>
           <w:sz w:val="20"/>
         </w:rPr>
-        <w:t xml:space="preserve">Collapse follows how well features identify the group; ridge regression resists it</w:t>
+        <w:t xml:space="preserve">Collapse follows the group fingerprint: random forest 47%, boosting 59%, ridge 88%</w:t>
       </w:r>
     </w:p>
     <w:p>
@@ -106,7 +106,7 @@
         <w:rPr>
           <w:sz w:val="20"/>
         </w:rPr>
-        <w:t xml:space="preserve">Group-aware calibration restores nominal coverage; a learned scale helps weak groups</w:t>
+        <w:t xml:space="preserve">Group-aware calibration restores 90%; a learned scale helps weak groups modestly</w:t>
       </w:r>
     </w:p>
     <w:p>
@@ -122,7 +122,7 @@
         <w:pStyle w:val="BodyText"/>
       </w:pPr>
       <w:r>
-        <w:t xml:space="preserve">Public crop-yield tables are routinely used to train and compare machine-learning models, usually with random train–test splits and with prediction intervals calibrated on random hold-out rows. We audit two such sources, a publicly shared FAO-derived country-level file (28,242 rows, 101 countries, 10 crops, 1990–2013) and an Indian district-level production table (246,091 rows, 33 states, 652 districts, 1997–2015), and study what these evaluation habits hide. The FAO file contains only 13,130 distinct country–crop–year records: the rest are copies produced when yield records were joined to a temperature table that has several rows per country and year, so every record is multiplied by that row count (match in 100% of records), and 67% of all rows belong to a repeated record. Rainfall is constant within a country and temperature and pesticide use are nearly country labels (intraclass correlations 1.00, 0.995 and 0.78 on distinct records). Random splits therefore reward recognising the country: tuned gradient boosting reaches R² = 0.93 on random rows but 0.66 on held-out countries, while a crop-mean predictor scores 0.58 and 0.57; with Indian states held out, no model is distinguishable from the crop mean. For split conformal prediction at a nominal 90%, calibration on random rows gives 60% coverage on unseen countries (84% for states and 90% for districts), and group-aware calibration restores 90% in all three settings. The collapse follows the strength of the group fingerprint in the features: it is severe for random forest (47%), strong for gradient boosting (59%) and absent for ridge regression (88%) on the same data. A coverage-collapse relation, coverage ≈ 2Φ(z/ρ) − 1 with ρ the ratio of test to calibration residual scale, tracks a simulation to within 0.013 (cell means) and links the problem to the inflation ratio of group leakage. A learned residual-scale model flags difficult groups (Spearman 0.32 to 0.61 with group error, against 0.12 to 0.39 for a distance score) and modestly lifts coverage in the weakest groups at the cost of wider intervals, while five labelled local rows narrow FAO intervals by 12%. We provide an audit procedure, a protocol and open code.</w:t>
+        <w:t xml:space="preserve">Public crop-yield tables are routinely used to train and compare machine-learning models, usually with random train–test splits and with prediction intervals calibrated on random hold-out rows. We audit two public sources, a country-level file derived from FAOSTAT and other tables (28,242 rows, 101 countries, 10 crops, 1990–2013) and an Indian district-level production table (246,091 rows, 33 states, 652 districts, 1997–2015), and study what these habits hide. The FAO file holds 13,130 distinct country–crop–year records; the other rows are copies created when yield records were joined to a temperature table with several rows per country and year (the row count of every record equals its join multiplicity). Public code repositories have noted this duplication informally; we trace and quantify it. Rainfall is constant within a country, and temperature and pesticide use are nearly country labels (intraclass correlations 1.00, 0.995 and 0.78). Random splits therefore reward recognising the country: tuned gradient boosting reaches R² = 0.93 on random rows and 0.66 on held-out countries, a crop-mean predictor scores 0.58 and 0.57, and a country–crop lookup with no covariates already reaches 0.93 on random rows and 0.89 forward in time (tuned boosting 0.91). Within-country anomalies of temperature and pesticide use add real within-country skill (RMSE 9–11% below the lookup) but no cross-country skill. For split conformal prediction at a nominal 90%, calibration on random rows gives 60% coverage on unseen FAO countries (50% on the raw duplicated rows), 84% on unseen Indian states and 90% on districts, and group-aware calibration restores 90% in all settings. The collapse follows the group fingerprint in the features: random forest 47%, gradient boosting 59% and ridge regression 88% on the same data, and 83% when fingerprint-free features are used. A relation, coverage ≈ 2Φ(z/ρ) − 1 with ρ the ratio of test to calibration residual scale, tracks a simulation to within 0.013 (cell means) and links the problem to the inflation ratio of group leakage. Weighted conformal prediction cannot help, because calibration and test rows are perfectly separable (AUC 1.0). A learned residual-scale model flags difficult groups (group-level Spearman 0.48 to 0.61, against 0.11 to 0.39 for a distance score) and modestly lifts coverage in the weakest groups at the cost of wider intervals, while five labelled local rows narrow FAO intervals by 12%. We provide an audit procedure, a protocol and open code.</w:t>
       </w:r>
     </w:p>
     <w:p>
@@ -197,7 +197,7 @@
         <w:pStyle w:val="BodyText"/>
       </w:pPr>
       <w:r>
-        <w:t xml:space="preserve">This is the grouped-data version of data leakage, which has been shown to inflate reported results in many fields [2] and which is the reason ecologists, remote-sensing scientists and statisticians recommend blocked, spatial or leave-group-out validation [3, 4]. In crop yield the practical question is the transfer question: a model trained on some countries or districts is meant to be used in others where yield data are scarce. Critiques of validation design in published yield studies have appeared [5], and leave-one-country-out evaluation is beginning to be reported [6], but we are not aware of a quantitative audit of a specific, publicly shared benchmark file that traces why its random-split scores are inflated, nor of a study of whether the intervals attached to such models keep their nominal coverage when the target place is new.</w:t>
+        <w:t xml:space="preserve">This is the grouped-data version of data leakage, which has been shown to inflate reported results in many fields [2] and which is the reason ecologists, remote-sensing scientists and statisticians recommend blocked, spatial or leave-group-out validation [3, 4]. In crop yield the practical question is the transfer question: a model trained on some countries or districts is meant to be used in others where yield data are scarce. Critiques of validation design in published yield studies have appeared [5], and leave-one-country-out evaluation is beginning to be reported [6], and public code repositories built on the FAO-derived file below note informally that it contains repeated rows and that random splits are optimistic [7, 8]. We are not aware of a scholarly, record-level trace of why the random-split scores on this file are inflated, nor of a study of whether the intervals attached to such models keep their nominal coverage when the target place is new.</w:t>
       </w:r>
     </w:p>
     <w:p>
@@ -205,7 +205,7 @@
         <w:pStyle w:val="BodyText"/>
       </w:pPr>
       <w:r>
-        <w:t xml:space="preserve">We address both gaps with two public sources: a country-level file derived from FAOSTAT and other tables [7, 8] and a district-level production table for India [9]. Our contributions are:</w:t>
+        <w:t xml:space="preserve">We address both gaps with two public sources: a country-level file derived from FAOSTAT and other tables [9, 10] and a district-level production table for India [11]. Our contributions are:</w:t>
       </w:r>
     </w:p>
     <w:p>
@@ -221,13 +221,13 @@
           <w:b/>
           <w:bCs/>
         </w:rPr>
-        <w:t xml:space="preserve">A traceable audit of duplicated records.</w:t>
-      </w:r>
-      <w:r>
-        <w:t xml:space="preserve"> </w:t>
-      </w:r>
-      <w:r>
-        <w:t xml:space="preserve">We show that the FAO-derived file contains only 13,130 distinct country–crop–year records among 28,242 rows, that the excess is an exact join fan-out (each record is repeated as many times as the temperature table has rows for the country and year), and that the covariates are close to country identifiers (Section 6.1).</w:t>
+        <w:t xml:space="preserve">A verified, quantified audit of duplicated records.</w:t>
+      </w:r>
+      <w:r>
+        <w:t xml:space="preserve"> </w:t>
+      </w:r>
+      <w:r>
+        <w:t xml:space="preserve">The duplication has been noted in public repositories [7, 8]; we verify it against the component tables, show that the excess is an exact join fan-out (each record is repeated as many times as the temperature table has rows for the country and year), and show that the covariates are close to country identifiers (Section 6.1).</w:t>
       </w:r>
     </w:p>
     <w:p>
@@ -293,15 +293,37 @@
         <w:t xml:space="preserve"> </w:t>
       </w:r>
       <w:r>
-        <w:t xml:space="preserve">We compare six calibration schemes, including a learned residual-scale normalisation, a distance score and weighted conformal prediction, report where each helps, and quantify what a handful of local labels buys (Sections 6.5 to 6.7).</w:t>
+        <w:t xml:space="preserve">We compare six calibration schemes, including a learned residual-scale normalisation, a distance score and weighted conformal prediction, explain why weighting fails, and quantify what a handful of local labels buys (Sections 6.5 to 6.7).</w:t>
       </w:r>
     </w:p>
     <w:p>
       <w:pPr>
+        <w:pStyle w:val="Compact"/>
+        <w:numPr>
+          <w:ilvl w:val="0"/>
+          <w:numId w:val="1002"/>
+        </w:numPr>
+      </w:pPr>
+      <w:r>
+        <w:rPr>
+          <w:b/>
+          <w:bCs/>
+        </w:rPr>
+        <w:t xml:space="preserve">A test of the fingerprint explanation.</w:t>
+      </w:r>
+      <w:r>
+        <w:t xml:space="preserve"> </w:t>
+      </w:r>
+      <w:r>
+        <w:t xml:space="preserve">With a place-lookup baseline and fingerprint-free (within-country anomaly) features we separate what the covariates add within a country from what the random split rewards (Section 6.8).</w:t>
+      </w:r>
+    </w:p>
+    <w:p>
+      <w:pPr>
         <w:pStyle w:val="FirstParagraph"/>
       </w:pPr>
       <w:r>
-        <w:t xml:space="preserve">The paper is a companion to a study of group leakage in tabular regression benchmarks [10], whose inflation ratio</w:t>
+        <w:t xml:space="preserve">The paper is a companion to a study of group leakage in tabular regression benchmarks [12], whose inflation ratio</w:t>
       </w:r>
       <w:r>
         <w:t xml:space="preserve"> </w:t>
@@ -378,7 +400,7 @@
         <w:t xml:space="preserve"> </w:t>
       </w:r>
       <w:r>
-        <w:t xml:space="preserve">Leakage has been catalogued across disciplines and is a major source of irreproducible results [2]. Benchmark duplicates are a specific form: near-duplicate images shared by training and test sets of CIFAR inflate reported accuracy [11], and general guidance on avoiding machine-learning pitfalls lists such overlap among the most common errors [12]. For data with spatial, temporal, hierarchical or phylogenetic structure, blocked cross-validation gives more realistic estimates than random folds [3], and spatial validation has overturned apparent skill in large-scale ecological mapping [4]. The WILDS benchmarks make the same point for domain shift in general [13]. Mixed-effects approaches show that standard tree ensembles ignore within-cluster dependence [14]. We build on these results by tracing the origin of duplication in a specific file, by relating the memorisation of group identity to the behaviour of conformal intervals, and by comparing model families on the same data.</w:t>
+        <w:t xml:space="preserve">Leakage has been catalogued across disciplines and is a major source of irreproducible results [2]. Benchmark duplicates are a specific form: near-duplicate images shared by training and test sets of CIFAR inflate reported accuracy [13], and general guidance on avoiding machine-learning pitfalls lists such overlap among the most common errors [14]. For data with spatial, temporal, hierarchical or phylogenetic structure, blocked cross-validation gives more realistic estimates than random folds [3], and spatial validation has overturned apparent skill in large-scale ecological mapping [4]. The WILDS benchmarks make the same point for domain shift in general [15]. Mixed-effects approaches show that standard tree ensembles ignore within-cluster dependence [16]. We build on these results by tracing the origin of duplication in a specific file, by relating the memorisation of group identity to the behaviour of conformal intervals, and by comparing model families on the same data.</w:t>
       </w:r>
     </w:p>
     <w:p>
@@ -396,7 +418,43 @@
         <w:t xml:space="preserve"> </w:t>
       </w:r>
       <w:r>
-        <w:t xml:space="preserve">Split conformal prediction gives finite-sample marginal coverage for exchangeable data [15–17]. When exchangeability fails, coverage can degrade; weighted conformal prediction restores validity under a known covariate shift [18], and non-exchangeable variants bound the coverage loss [19]. Cross-conformal and jackknife+ methods reuse all data for calibration [20]. Locally adaptive intervals use a model of the residual scale [21], and Mondrian or group-conditional calibration targets coverage within groups [22, 23]. Prediction sets for two-layer hierarchical data treat groups as the exchangeable unit [24]. In agriculture, conformal prediction has been analysed for image-based decision support [25], and group-conditional calibration has been used for crop and weed classification [26]. We are not aware of work on tabular yield regression that examines how calibration on random rows fails for unseen countries or districts. Our contribution is empirical and diagnostic: we show when naive calibration collapses, relate the collapse to the inflation ratio of group leakage, and compare these existing remedies (group-aware, locally scaled, weighted and cross-conformal) under a common protocol.</w:t>
+        <w:t xml:space="preserve">Split conformal prediction gives finite-sample marginal coverage for exchangeable data [17–19]. When exchangeability fails, coverage can degrade; weighted conformal prediction restores validity under a known covariate shift [20], and non-exchangeable variants bound the coverage loss [21]. Cross-conformal and jackknife+ methods reuse all data for calibration [22]. Locally adaptive intervals use a model of the residual scale [23], and Mondrian or group-conditional calibration targets coverage within groups [24, 25]. Prediction sets for two-layer hierarchical data treat groups as the exchangeable unit [26]. In agriculture, conformal prediction has been analysed for image-based decision support [27], and group-conditional calibration has been used for crop and weed classification [28]. We are not aware of work on tabular yield regression that examines how calibration on random rows fails for unseen countries or districts. Our contribution is empirical and diagnostic: we show when naive calibration collapses, relate the collapse to the inflation ratio of group leakage, and compare these existing remedies (group-aware, locally scaled, weighted and cross-conformal) under a common protocol.</w:t>
+      </w:r>
+    </w:p>
+    <w:p>
+      <w:pPr>
+        <w:pStyle w:val="BodyText"/>
+      </w:pPr>
+      <w:r>
+        <w:rPr>
+          <w:b/>
+          <w:bCs/>
+        </w:rPr>
+        <w:t xml:space="preserve">Spatial and group-weighted conformal methods.</w:t>
+      </w:r>
+      <w:r>
+        <w:t xml:space="preserve"> </w:t>
+      </w:r>
+      <w:r>
+        <w:t xml:space="preserve">Conformal methods for spatial data localise the calibration, using localized quantile regression [29] or geographically weighted scores [30], and group-weighted conformal prediction treats the group as the determinant of covariate shift between training and test populations [31]. These methods rely on overlap between the calibration and test populations. Here the test groups are new, calibration and test sets are perfectly separable by a classifier, and we show in Section 6.5 why weighting then has nothing to work with.</w:t>
+      </w:r>
+    </w:p>
+    <w:p>
+      <w:pPr>
+        <w:pStyle w:val="BodyText"/>
+      </w:pPr>
+      <w:r>
+        <w:rPr>
+          <w:b/>
+          <w:bCs/>
+        </w:rPr>
+        <w:t xml:space="preserve">Informal notes on the FAO-derived file.</w:t>
+      </w:r>
+      <w:r>
+        <w:t xml:space="preserve"> </w:t>
+      </w:r>
+      <w:r>
+        <w:t xml:space="preserve">Public code repositories built on the file record that it has 13,130 unique keys among 28,242 rows, that the repeated rows differ only in temperature, and that random splits give optimistic scores [7, 8]. These notes are not peer-reviewed and do not trace the join mechanism row by row, quantify the effect on protocols, or study intervals; we credit them and build on them.</w:t>
       </w:r>
     </w:p>
     <w:p>
@@ -414,7 +472,7 @@
         <w:t xml:space="preserve"> </w:t>
       </w:r>
       <w:r>
-        <w:t xml:space="preserve">The area-of-applicability approach flags prediction locations whose predictor values lie outside the range seen in training [27]. We test a related group-level distance score and a learned residual-scale score as indicators of where intervals are likely to be too narrow.</w:t>
+        <w:t xml:space="preserve">The area-of-applicability approach flags prediction locations whose predictor values lie outside the range seen in training [32]. We test a related group-level distance score and a learned residual-scale score as indicators of where intervals are likely to be too narrow.</w:t>
       </w:r>
     </w:p>
     <w:p>
@@ -456,9 +514,9 @@
         <w:tblCaption w:val="Table 1. Positioning of the present study relative to the main strands of related work."/>
       </w:tblPr>
       <w:tblGrid>
-        <w:gridCol w:w="2571"/>
-        <w:gridCol w:w="2928"/>
-        <w:gridCol w:w="3571"/>
+        <w:gridCol w:w="3045"/>
+        <w:gridCol w:w="2714"/>
+        <w:gridCol w:w="3310"/>
       </w:tblGrid>
       <w:tr>
         <w:trPr>
@@ -468,7 +526,7 @@
         </w:trPr>
         <w:tc>
           <w:tcPr>
-            <w:tcW w:w="2571" w:type="dxa"/>
+            <w:tcW w:w="3045" w:type="dxa"/>
             <w:tcBorders>
               <w:bottom w:val="single" w:sz="6" w:space="0" w:color="000000"/>
             </w:tcBorders>
@@ -490,7 +548,7 @@
         </w:tc>
         <w:tc>
           <w:tcPr>
-            <w:tcW w:w="2928" w:type="dxa"/>
+            <w:tcW w:w="2714" w:type="dxa"/>
             <w:tcBorders>
               <w:bottom w:val="single" w:sz="6" w:space="0" w:color="000000"/>
             </w:tcBorders>
@@ -512,7 +570,7 @@
         </w:tc>
         <w:tc>
           <w:tcPr>
-            <w:tcW w:w="3571" w:type="dxa"/>
+            <w:tcW w:w="3310" w:type="dxa"/>
             <w:tcBorders>
               <w:bottom w:val="single" w:sz="6" w:space="0" w:color="000000"/>
             </w:tcBorders>
@@ -539,7 +597,7 @@
         </w:trPr>
         <w:tc>
           <w:tcPr>
-            <w:tcW w:w="2571" w:type="dxa"/>
+            <w:tcW w:w="3045" w:type="dxa"/>
           </w:tcPr>
           <w:p>
             <w:pPr>
@@ -557,7 +615,7 @@
         </w:tc>
         <w:tc>
           <w:tcPr>
-            <w:tcW w:w="2928" w:type="dxa"/>
+            <w:tcW w:w="2714" w:type="dxa"/>
           </w:tcPr>
           <w:p>
             <w:pPr>
@@ -575,7 +633,7 @@
         </w:tc>
         <w:tc>
           <w:tcPr>
-            <w:tcW w:w="3571" w:type="dxa"/>
+            <w:tcW w:w="3310" w:type="dxa"/>
           </w:tcPr>
           <w:p>
             <w:pPr>
@@ -598,7 +656,7 @@
         </w:trPr>
         <w:tc>
           <w:tcPr>
-            <w:tcW w:w="2571" w:type="dxa"/>
+            <w:tcW w:w="3045" w:type="dxa"/>
           </w:tcPr>
           <w:p>
             <w:pPr>
@@ -610,13 +668,13 @@
               <w:rPr>
                 <w:sz w:val="17"/>
               </w:rPr>
-              <w:t xml:space="preserve">Leakage and duplicates [2, 11]</w:t>
-            </w:r>
-          </w:p>
-        </w:tc>
-        <w:tc>
-          <w:tcPr>
-            <w:tcW w:w="2928" w:type="dxa"/>
+              <w:t xml:space="preserve">Leakage and duplicates [2, 13]</w:t>
+            </w:r>
+          </w:p>
+        </w:tc>
+        <w:tc>
+          <w:tcPr>
+            <w:tcW w:w="2714" w:type="dxa"/>
           </w:tcPr>
           <w:p>
             <w:pPr>
@@ -634,7 +692,7 @@
         </w:tc>
         <w:tc>
           <w:tcPr>
-            <w:tcW w:w="3571" w:type="dxa"/>
+            <w:tcW w:w="3310" w:type="dxa"/>
           </w:tcPr>
           <w:p>
             <w:pPr>
@@ -657,7 +715,7 @@
         </w:trPr>
         <w:tc>
           <w:tcPr>
-            <w:tcW w:w="2571" w:type="dxa"/>
+            <w:tcW w:w="3045" w:type="dxa"/>
           </w:tcPr>
           <w:p>
             <w:pPr>
@@ -675,7 +733,7 @@
         </w:tc>
         <w:tc>
           <w:tcPr>
-            <w:tcW w:w="2928" w:type="dxa"/>
+            <w:tcW w:w="2714" w:type="dxa"/>
           </w:tcPr>
           <w:p>
             <w:pPr>
@@ -693,7 +751,7 @@
         </w:tc>
         <w:tc>
           <w:tcPr>
-            <w:tcW w:w="3571" w:type="dxa"/>
+            <w:tcW w:w="3310" w:type="dxa"/>
           </w:tcPr>
           <w:p>
             <w:pPr>
@@ -716,7 +774,7 @@
         </w:trPr>
         <w:tc>
           <w:tcPr>
-            <w:tcW w:w="2571" w:type="dxa"/>
+            <w:tcW w:w="3045" w:type="dxa"/>
           </w:tcPr>
           <w:p>
             <w:pPr>
@@ -728,13 +786,13 @@
               <w:rPr>
                 <w:sz w:val="17"/>
               </w:rPr>
-              <w:t xml:space="preserve">Conformal under shift [18, 19, 22]</w:t>
-            </w:r>
-          </w:p>
-        </w:tc>
-        <w:tc>
-          <w:tcPr>
-            <w:tcW w:w="2928" w:type="dxa"/>
+              <w:t xml:space="preserve">Conformal under shift [20, 21, 24]</w:t>
+            </w:r>
+          </w:p>
+        </w:tc>
+        <w:tc>
+          <w:tcPr>
+            <w:tcW w:w="2714" w:type="dxa"/>
           </w:tcPr>
           <w:p>
             <w:pPr>
@@ -752,7 +810,7 @@
         </w:tc>
         <w:tc>
           <w:tcPr>
-            <w:tcW w:w="3571" w:type="dxa"/>
+            <w:tcW w:w="3310" w:type="dxa"/>
           </w:tcPr>
           <w:p>
             <w:pPr>
@@ -775,7 +833,7 @@
         </w:trPr>
         <w:tc>
           <w:tcPr>
-            <w:tcW w:w="2571" w:type="dxa"/>
+            <w:tcW w:w="3045" w:type="dxa"/>
           </w:tcPr>
           <w:p>
             <w:pPr>
@@ -787,13 +845,13 @@
               <w:rPr>
                 <w:sz w:val="17"/>
               </w:rPr>
-              <w:t xml:space="preserve">Applicability [27]</w:t>
-            </w:r>
-          </w:p>
-        </w:tc>
-        <w:tc>
-          <w:tcPr>
-            <w:tcW w:w="2928" w:type="dxa"/>
+              <w:t xml:space="preserve">Spatial and group-weighted conformal [29–31]</w:t>
+            </w:r>
+          </w:p>
+        </w:tc>
+        <w:tc>
+          <w:tcPr>
+            <w:tcW w:w="2714" w:type="dxa"/>
           </w:tcPr>
           <w:p>
             <w:pPr>
@@ -805,13 +863,72 @@
               <w:rPr>
                 <w:sz w:val="17"/>
               </w:rPr>
+              <w:t xml:space="preserve">Localised or group-weighted calibration</w:t>
+            </w:r>
+          </w:p>
+        </w:tc>
+        <w:tc>
+          <w:tcPr>
+            <w:tcW w:w="3310" w:type="dxa"/>
+          </w:tcPr>
+          <w:p>
+            <w:pPr>
+              <w:pStyle w:val="Compact"/>
+              <w:keepLines/>
+              <w:jc w:val="left"/>
+            </w:pPr>
+            <w:r>
+              <w:rPr>
+                <w:sz w:val="17"/>
+              </w:rPr>
+              <w:t xml:space="preserve">New groups; weights degenerate (classifier AUC 1.0)</w:t>
+            </w:r>
+          </w:p>
+        </w:tc>
+      </w:tr>
+      <w:tr>
+        <w:trPr>
+          <w:cantSplit w:val="true"/>
+        </w:trPr>
+        <w:tc>
+          <w:tcPr>
+            <w:tcW w:w="3045" w:type="dxa"/>
+          </w:tcPr>
+          <w:p>
+            <w:pPr>
+              <w:pStyle w:val="Compact"/>
+              <w:keepLines/>
+              <w:jc w:val="left"/>
+            </w:pPr>
+            <w:r>
+              <w:rPr>
+                <w:sz w:val="17"/>
+              </w:rPr>
+              <w:t xml:space="preserve">Applicability [32]</w:t>
+            </w:r>
+          </w:p>
+        </w:tc>
+        <w:tc>
+          <w:tcPr>
+            <w:tcW w:w="2714" w:type="dxa"/>
+          </w:tcPr>
+          <w:p>
+            <w:pPr>
+              <w:pStyle w:val="Compact"/>
+              <w:keepLines/>
+              <w:jc w:val="left"/>
+            </w:pPr>
+            <w:r>
+              <w:rPr>
+                <w:sz w:val="17"/>
+              </w:rPr>
               <w:t xml:space="preserve">Area of applicability</w:t>
             </w:r>
           </w:p>
         </w:tc>
         <w:tc>
           <w:tcPr>
-            <w:tcW w:w="3571" w:type="dxa"/>
+            <w:tcW w:w="3310" w:type="dxa"/>
           </w:tcPr>
           <w:p>
             <w:pPr>
@@ -824,6 +941,65 @@
                 <w:sz w:val="17"/>
               </w:rPr>
               <w:t xml:space="preserve">Distance versus learned residual-scale score</w:t>
+            </w:r>
+          </w:p>
+        </w:tc>
+      </w:tr>
+      <w:tr>
+        <w:trPr>
+          <w:cantSplit w:val="true"/>
+        </w:trPr>
+        <w:tc>
+          <w:tcPr>
+            <w:tcW w:w="3045" w:type="dxa"/>
+          </w:tcPr>
+          <w:p>
+            <w:pPr>
+              <w:pStyle w:val="Compact"/>
+              <w:keepLines/>
+              <w:jc w:val="left"/>
+            </w:pPr>
+            <w:r>
+              <w:rPr>
+                <w:sz w:val="17"/>
+              </w:rPr>
+              <w:t xml:space="preserve">Informal repository notes [7, 8]</w:t>
+            </w:r>
+          </w:p>
+        </w:tc>
+        <w:tc>
+          <w:tcPr>
+            <w:tcW w:w="2714" w:type="dxa"/>
+          </w:tcPr>
+          <w:p>
+            <w:pPr>
+              <w:pStyle w:val="Compact"/>
+              <w:keepLines/>
+              <w:jc w:val="left"/>
+            </w:pPr>
+            <w:r>
+              <w:rPr>
+                <w:sz w:val="17"/>
+              </w:rPr>
+              <w:t xml:space="preserve">Duplicates noted; optimistic scores</w:t>
+            </w:r>
+          </w:p>
+        </w:tc>
+        <w:tc>
+          <w:tcPr>
+            <w:tcW w:w="3310" w:type="dxa"/>
+          </w:tcPr>
+          <w:p>
+            <w:pPr>
+              <w:pStyle w:val="Compact"/>
+              <w:keepLines/>
+              <w:jc w:val="left"/>
+            </w:pPr>
+            <w:r>
+              <w:rPr>
+                <w:sz w:val="17"/>
+              </w:rPr>
+              <w:t xml:space="preserve">Verified join trace; protocols and intervals quantified</w:t>
             </w:r>
           </w:p>
         </w:tc>
@@ -853,7 +1029,7 @@
         <w:pStyle w:val="FirstParagraph"/>
       </w:pPr>
       <w:r>
-        <w:t xml:space="preserve">This section links the inflation of point accuracy under random splits, studied in the companion paper [10], to the coverage of split conformal intervals. Section 3.1 fixes notation, Section 3.2 recalls the inflation ratio, Section 3.3 derives the coverage-collapse relation, Section 3.4 states when group-aware calibration is valid and why per-group coverage still varies, and Section 3.5 describes why model family matters. Derivations are in Appendix A and checks against simulation and data in Section 6. Table 2 lists the notation.</w:t>
+        <w:t xml:space="preserve">This section links the inflation of point accuracy under random splits, studied in the companion paper [12], to the coverage of split conformal intervals. Section 3.1 fixes notation, Section 3.2 recalls the inflation ratio, Section 3.3 derives the coverage-collapse relation, Section 3.4 states when group-aware calibration is valid and why per-group coverage still varies, and Section 3.5 describes why model family matters. Derivations are in Appendix A and checks against simulation and data in Section 6. Table 2 lists the notation.</w:t>
       </w:r>
     </w:p>
     <w:p>
@@ -2588,7 +2764,7 @@
         <w:t xml:space="preserve"> </w:t>
       </w:r>
       <w:r>
-        <w:t xml:space="preserve">[10]. For</w:t>
+        <w:t xml:space="preserve">[12]. For</w:t>
       </w:r>
       <w:r>
         <w:t xml:space="preserve"> </w:t>
@@ -2856,7 +3032,7 @@
         <w:t xml:space="preserve"> </w:t>
       </w:r>
       <w:r>
-        <w:t xml:space="preserve">calibration rows [15, 16]:</w:t>
+        <w:t xml:space="preserve">calibration rows [17, 18]:</w:t>
       </w:r>
     </w:p>
     <w:p>
@@ -4039,7 +4215,7 @@
         <w:pStyle w:val="BodyText"/>
       </w:pPr>
       <w:r>
-        <w:t xml:space="preserve">This is split conformal prediction with the group as the exchangeable unit, as in two-layer hierarchical models [24]. When all rows of the calibration groups are pooled, as we do, the guarantee holds for a row drawn with probability proportional to its group’s share of the calibration rows, and per-group coverage is not controlled. Within group</w:t>
+        <w:t xml:space="preserve">This is split conformal prediction with the group as the exchangeable unit, as in two-layer hierarchical models [26]. When all rows of the calibration groups are pooled, as we do, the guarantee holds for a row drawn with probability proportional to its group’s share of the calibration rows, and per-group coverage is not controlled. Within group</w:t>
       </w:r>
       <w:r>
         <w:t xml:space="preserve"> </w:t>
@@ -4459,7 +4635,7 @@
         <w:t xml:space="preserve"> </w:t>
       </w:r>
       <w:r>
-        <w:t xml:space="preserve">[21, 22]; exact group-conditional guarantees require group-specific calibration sets [23].</w:t>
+        <w:t xml:space="preserve">[23, 24]; exact group-conditional guarantees require group-specific calibration sets [25].</w:t>
       </w:r>
     </w:p>
     <w:bookmarkEnd w:id="14"/>
@@ -4543,7 +4719,7 @@
         <w:t xml:space="preserve"> </w:t>
       </w:r>
       <w:r>
-        <w:t xml:space="preserve">for gradient boosting and the largest for random forests that grow deep trees [14, 28, 29]. We test this prediction in Section 6.4.</w:t>
+        <w:t xml:space="preserve">for gradient boosting and the largest for random forests that grow deep trees [16, 33, 34]. We test this prediction in Section 6.4.</w:t>
       </w:r>
     </w:p>
     <w:bookmarkEnd w:id="15"/>
@@ -4604,7 +4780,7 @@
         <w:t xml:space="preserve"> </w:t>
       </w:r>
       <w:r>
-        <w:t xml:space="preserve">from a public Kaggle dataset that combines yield and pesticide data from FAOSTAT with rainfall and temperature series from the World Bank data portal [7, 8]. The dataset page describes its provenance; we verified the structure described below directly against the four component tables distributed with it (</w:t>
+        <w:t xml:space="preserve">from a public Kaggle dataset that combines yield and pesticide data from FAOSTAT with rainfall and temperature series from the World Bank data portal [9, 10]. The dataset page describes its provenance; we verified the structure described below directly against the four component tables distributed with it (</w:t>
       </w:r>
       <w:r>
         <w:rPr>
@@ -4692,7 +4868,7 @@
         <w:pStyle w:val="FirstParagraph"/>
       </w:pPr>
       <w:r>
-        <w:t xml:space="preserve">The second source is a district-level table of area and production by crop and season in India for 1997–2015 [9]. It has 246,091 rows, 33 states, 652 districts and 124 crops, and no weather variables. We removed rows with missing production or non-positive area or production, computed yield as production divided by area, dropped crops with fewer than 20 rows, and trimmed the extreme 0.1% in each tail of log-yield. The cleaned table has 238,191 rows, 90 crops, 33 states and 652 districts. The exact cleaning rule of earlier analyses may differ; the rule above is the one used for every result reported here. We did not verify the original publication source of this table beyond the dataset page, and treat it as a convenient public benchmark.</w:t>
+        <w:t xml:space="preserve">The second source is a district-level table of area and production by crop and season in India for 1997–2015 [11]. It has 246,091 rows, 33 states, 652 districts and 124 crops, and no weather variables. We removed rows with missing production or non-positive area or production, computed yield as production divided by area, dropped crops with fewer than 20 rows, and trimmed the extreme 0.1% in each tail of log-yield. The cleaned table has 238,191 rows, 90 crops, 33 states and 652 districts. The exact cleaning rule of earlier analyses may differ; the rule above is the one used for every result reported here. We did not verify the original publication source of this table beyond the dataset page, and treat it as a convenient public benchmark.</w:t>
       </w:r>
     </w:p>
     <w:bookmarkEnd w:id="18"/>
@@ -4727,7 +4903,7 @@
         <w:pStyle w:val="TableCaption"/>
       </w:pPr>
       <w:r>
-        <w:t xml:space="preserve">Table 3. Datasets and group structure. ICC is the one-way intraclass correlation of log-yield (ANOVA estimator, unbalanced design) [30], by country and crop for FAO and by state and crop / district and crop for India.</w:t>
+        <w:t xml:space="preserve">Table 3. Datasets and group structure. ICC is the one-way intraclass correlation of log-yield (ANOVA estimator, unbalanced design) [35], by country and crop for FAO and by state and crop / district and crop for India.</w:t>
       </w:r>
     </w:p>
     <w:tbl>
@@ -4750,7 +4926,7 @@
           <w:right w:w="60" w:type="dxa"/>
         </w:tblCellMar>
         <w:tblLook w:firstRow="1" w:lastRow="0" w:firstColumn="0" w:lastColumn="0" w:noHBand="0" w:noVBand="0" w:val="0020"/>
-        <w:tblCaption w:val="Table 3. Datasets and group structure. ICC is the one-way intraclass correlation of log-yield (ANOVA estimator, unbalanced design) [30], by country and crop for FAO and by state and crop / district and crop for India."/>
+        <w:tblCaption w:val="Table 3. Datasets and group structure. ICC is the one-way intraclass correlation of log-yield (ANOVA estimator, unbalanced design) [35], by country and crop for FAO and by state and crop / district and crop for India."/>
       </w:tblPr>
       <w:tblGrid>
         <w:gridCol w:w="2673"/>
@@ -5325,7 +5501,7 @@
     </w:p>
     <w:bookmarkEnd w:id="20"/>
     <w:bookmarkEnd w:id="21"/>
-    <w:bookmarkStart w:id="28" w:name="experimental-design"/>
+    <w:bookmarkStart w:id="30" w:name="experimental-design"/>
     <w:p>
       <w:pPr>
         <w:pStyle w:val="Heading1"/>
@@ -5432,7 +5608,7 @@
         <w:pStyle w:val="FirstParagraph"/>
       </w:pPr>
       <w:r>
-        <w:t xml:space="preserve">We evaluate a crop-mean predictor (the mean log-yield of the crop in the training rows, a no-skill reference that uses no place information), ridge regression [31], random forest [28] (200 trees, minimum leaf size 2; trained on a random subset of 40,000 rows for the Indian data), gradient boosting with LightGBM defaults [29, 32], tuned gradient boosting, and gradient boosting with the group identifier as a categorical feature. Tuning selects among four configurations of leaves, learning rate, trees and minimum leaf size using an inner validation matched to the outer protocol (random, group-held-out or forward-in-time folds), on a subsample of at most 30,000 training rows. Implementations are from scikit-learn [33] and LightGBM [32].</w:t>
+        <w:t xml:space="preserve">We evaluate a crop-mean predictor (the mean log-yield of the crop in the training rows, a no-skill reference that uses no place information), ridge regression [36], random forest [33] (200 trees, minimum leaf size 2; trained on a random subset of 40,000 rows for the Indian data), gradient boosting with LightGBM defaults [34, 37], tuned gradient boosting, and gradient boosting with the group identifier as a categorical feature. Tuning selects among four configurations of leaves, learning rate, trees and minimum leaf size using an inner validation matched to the outer protocol (random, group-held-out or forward-in-time folds), on a subsample of at most 30,000 training rows. Implementations are from scikit-learn [38] and LightGBM [37].</w:t>
       </w:r>
     </w:p>
     <w:bookmarkEnd w:id="23"/>
@@ -5566,7 +5742,7 @@
         <w:t xml:space="preserve">Group-CV</w:t>
       </w:r>
       <w:r>
-        <w:t xml:space="preserve">: cross-conformal calibration with five group folds over all training groups; scores are out-of-group residuals and the prediction is the mean of the five fold models [20].</w:t>
+        <w:t xml:space="preserve">: cross-conformal calibration with five group folds over all training groups; scores are out-of-group residuals and the prediction is the mean of the five fold models [22].</w:t>
       </w:r>
     </w:p>
     <w:p>
@@ -5680,7 +5856,7 @@
         <w:t xml:space="preserve"> </w:t>
       </w:r>
       <w:r>
-        <w:t xml:space="preserve">[21].</w:t>
+        <w:t xml:space="preserve">[23].</w:t>
       </w:r>
     </w:p>
     <w:p>
@@ -5762,7 +5938,7 @@
         <w:t xml:space="preserve"> </w:t>
       </w:r>
       <w:r>
-        <w:t xml:space="preserve">are fitted by least squares on calibration groups, in the spirit of applicability scores [27].</w:t>
+        <w:t xml:space="preserve">are fitted by least squares on calibration groups, in the spirit of applicability scores [32].</w:t>
       </w:r>
     </w:p>
     <w:p>
@@ -5781,7 +5957,7 @@
         <w:t xml:space="preserve">Weighted</w:t>
       </w:r>
       <w:r>
-        <w:t xml:space="preserve">: group calibration with importance weights from a classifier separating calibration rows from test rows [18]; weights are clipped to</w:t>
+        <w:t xml:space="preserve">: group calibration with importance weights from a classifier separating calibration rows from test rows [20]; weights are clipped to</w:t>
       </w:r>
       <w:r>
         <w:t xml:space="preserve"> </w:t>
@@ -6051,7 +6227,7 @@
       </w:r>
     </w:p>
     <w:bookmarkEnd w:id="25"/>
-    <w:bookmarkStart w:id="26" w:name="fingerprint-strength-and-simulation"/>
+    <w:bookmarkStart w:id="26" w:name="robustness-analyses"/>
     <w:p>
       <w:pPr>
         <w:pStyle w:val="Heading2"/>
@@ -6061,6 +6237,92 @@
           <w:rStyle w:val="SectionNumber"/>
         </w:rPr>
         <w:t xml:space="preserve">5.5</w:t>
+      </w:r>
+      <w:r>
+        <w:tab/>
+      </w:r>
+      <w:r>
+        <w:t xml:space="preserve">Robustness analyses</w:t>
+      </w:r>
+    </w:p>
+    <w:p>
+      <w:pPr>
+        <w:pStyle w:val="FirstParagraph"/>
+      </w:pPr>
+      <w:r>
+        <w:t xml:space="preserve">Weighted conformal prediction is diagnosed by training a domain classifier (gradient boosting, cross-fitted with shuffled three-fold validation) to separate calibration rows from test rows, for the naive calibration rows and for the calibration groups, and reporting its AUC, the effective sample size of the weights, the share of weights below the lower clipping bound and the coverage with and without weights. The naive-versus-group comparison is repeated on the 28,242 raw FAO rows. For the applicability scores, each group’s score and error are averaged over seeds and folds and the correlation is bootstrapped over groups (1,000 resamples).</w:t>
+      </w:r>
+    </w:p>
+    <w:bookmarkEnd w:id="26"/>
+    <w:bookmarkStart w:id="27" w:name="Xd9cf52d8b66d32583707b64342fdbeb44c0c865"/>
+    <w:p>
+      <w:pPr>
+        <w:pStyle w:val="Heading2"/>
+      </w:pPr>
+      <w:r>
+        <w:rPr>
+          <w:rStyle w:val="SectionNumber"/>
+        </w:rPr>
+        <w:t xml:space="preserve">5.6</w:t>
+      </w:r>
+      <w:r>
+        <w:tab/>
+      </w:r>
+      <w:r>
+        <w:t xml:space="preserve">Place lookups and fingerprint-free features</w:t>
+      </w:r>
+    </w:p>
+    <w:p>
+      <w:pPr>
+        <w:pStyle w:val="FirstParagraph"/>
+      </w:pPr>
+      <w:r>
+        <w:t xml:space="preserve">A</w:t>
+      </w:r>
+      <w:r>
+        <w:t xml:space="preserve"> </w:t>
+      </w:r>
+      <w:r>
+        <w:rPr>
+          <w:b/>
+          <w:bCs/>
+        </w:rPr>
+        <w:t xml:space="preserve">country–crop lookup</w:t>
+      </w:r>
+      <w:r>
+        <w:t xml:space="preserve"> </w:t>
+      </w:r>
+      <w:r>
+        <w:t xml:space="preserve">predicts the mean log-yield of the country and crop in the training rows (the crop mean when the country-crop is unseen, as in group hold-out).</w:t>
+      </w:r>
+      <w:r>
+        <w:t xml:space="preserve"> </w:t>
+      </w:r>
+      <w:r>
+        <w:rPr>
+          <w:b/>
+          <w:bCs/>
+        </w:rPr>
+        <w:t xml:space="preserve">Anomaly features</w:t>
+      </w:r>
+      <w:r>
+        <w:t xml:space="preserve"> </w:t>
+      </w:r>
+      <w:r>
+        <w:t xml:space="preserve">remove the country level: temperature minus the country’s mean temperature, log(1 + pesticides) minus its country mean, together with crop and year; rainfall is dropped because it is constant within a country. Country means are computed from the features of the country’s own records, which uses no labels and is available whenever a feature history exists for the country. We compare ridge regression and gradient boosting on the full and anomaly feature sets, a combination of the lookup with a gradient boosting model on the lookup’s residuals, and naive and group conformal coverage and group-ID accuracy with each feature set, using the protocols above with three seeds.</w:t>
+      </w:r>
+    </w:p>
+    <w:bookmarkEnd w:id="27"/>
+    <w:bookmarkStart w:id="28" w:name="fingerprint-strength-and-simulation"/>
+    <w:p>
+      <w:pPr>
+        <w:pStyle w:val="Heading2"/>
+      </w:pPr>
+      <w:r>
+        <w:rPr>
+          <w:rStyle w:val="SectionNumber"/>
+        </w:rPr>
+        <w:t xml:space="preserve">5.7</w:t>
       </w:r>
       <w:r>
         <w:tab/>
@@ -6228,8 +6490,8 @@
         <w:t xml:space="preserve">, noise of unit variance, 60 groups and 10 or 50 rows per group, 20 replicates each, with a learner that memorises seen-group means.</w:t>
       </w:r>
     </w:p>
-    <w:bookmarkEnd w:id="26"/>
-    <w:bookmarkStart w:id="27" w:name="reproducibility"/>
+    <w:bookmarkEnd w:id="28"/>
+    <w:bookmarkStart w:id="29" w:name="reproducibility"/>
     <w:p>
       <w:pPr>
         <w:pStyle w:val="Heading2"/>
@@ -6238,7 +6500,7 @@
         <w:rPr>
           <w:rStyle w:val="SectionNumber"/>
         </w:rPr>
-        <w:t xml:space="preserve">5.6</w:t>
+        <w:t xml:space="preserve">5.8</w:t>
       </w:r>
       <w:r>
         <w:tab/>
@@ -6303,9 +6565,9 @@
         <w:t xml:space="preserve">. Random seeds are fixed. Analyses use a four-core container; each experiment runs from the command line.</w:t>
       </w:r>
     </w:p>
-    <w:bookmarkEnd w:id="27"/>
-    <w:bookmarkEnd w:id="28"/>
-    <w:bookmarkStart w:id="55" w:name="results"/>
+    <w:bookmarkEnd w:id="29"/>
+    <w:bookmarkEnd w:id="30"/>
+    <w:bookmarkStart w:id="61" w:name="results"/>
     <w:p>
       <w:pPr>
         <w:pStyle w:val="Heading1"/>
@@ -6323,7 +6585,7 @@
         <w:t xml:space="preserve">Results</w:t>
       </w:r>
     </w:p>
-    <w:bookmarkStart w:id="32" w:name="audit-of-the-fao-derived-file"/>
+    <w:bookmarkStart w:id="34" w:name="audit-of-the-fao-derived-file"/>
     <w:p>
       <w:pPr>
         <w:pStyle w:val="Heading2"/>
@@ -7119,18 +7381,18 @@
           <wp:inline>
             <wp:extent cx="5753100" cy="1862126"/>
             <wp:effectExtent b="0" l="0" r="0" t="0"/>
-            <wp:docPr descr="Fig. 1. Audit of the FAO-derived file. (a) Number of rows per country–crop–year record (log scale). (b) Rows per record in yield_df.csv against rows in temp.csv for the same country-year; all records lie on the identity line. (c) Intraclass correlation by country of the covariates (distinct records) and of log-yield." title="" id="30" name="Picture"/>
+            <wp:docPr descr="Fig. 1. Audit of the FAO-derived file. (a) Number of rows per country–crop–year record (log scale). (b) Rows per record in yield_df.csv against rows in temp.csv for the same country-year; all records lie on the identity line. (c) Intraclass correlation by country of the covariates (distinct records) and of log-yield." title="" id="32" name="Picture"/>
             <a:graphic>
               <a:graphicData uri="http://schemas.openxmlformats.org/drawingml/2006/picture">
                 <pic:pic>
                   <pic:nvPicPr>
-                    <pic:cNvPr descr="../figures/fig02_audit.png" id="31" name="Picture"/>
+                    <pic:cNvPr descr="../figures/fig02_audit.png" id="33" name="Picture"/>
                     <pic:cNvPicPr>
                       <a:picLocks noChangeArrowheads="1" noChangeAspect="1"/>
                     </pic:cNvPicPr>
                   </pic:nvPicPr>
                   <pic:blipFill>
-                    <a:blip r:embed="rId29"/>
+                    <a:blip r:embed="rId31"/>
                     <a:stretch>
                       <a:fillRect/>
                     </a:stretch>
@@ -7203,8 +7465,8 @@
         <w:t xml:space="preserve">The Indian table has no repeated state–district–year–season–crop keys, but its structure is also hierarchical (intraclass correlation of log-yield 0.88 by state and crop, 0.90 by district and crop). Its features carry little group information: log area has an intraclass correlation of 0.07 by state and 0.10 by district.</w:t>
       </w:r>
     </w:p>
-    <w:bookmarkEnd w:id="32"/>
-    <w:bookmarkStart w:id="36" w:name="transfer-what-random-splits-reward"/>
+    <w:bookmarkEnd w:id="34"/>
+    <w:bookmarkStart w:id="38" w:name="transfer-what-random-splits-reward"/>
     <w:p>
       <w:pPr>
         <w:pStyle w:val="Heading2"/>
@@ -8390,18 +8652,18 @@
           <wp:inline>
             <wp:extent cx="5753100" cy="2336788"/>
             <wp:effectExtent b="0" l="0" r="0" t="0"/>
-            <wp:docPr descr="Fig. 2. R² (95% bootstrap interval) by protocol and model. (a) FAO file, distinct records. (b) Indian district table. Models that exploit group identity (random forest, GBM with group ID) lead under random and forward-in-time protocols on FAO and fall to or below the crop-mean baseline when groups are held out." title="" id="34" name="Picture"/>
+            <wp:docPr descr="Fig. 2. R² (95% bootstrap interval) by protocol and model. (a) FAO file, distinct records. (b) Indian district table. Models that exploit group identity (random forest, GBM with group ID) lead under random and forward-in-time protocols on FAO and fall to or below the crop-mean baseline when groups are held out." title="" id="36" name="Picture"/>
             <a:graphic>
               <a:graphicData uri="http://schemas.openxmlformats.org/drawingml/2006/picture">
                 <pic:pic>
                   <pic:nvPicPr>
-                    <pic:cNvPr descr="../figures/fig03_transfer.png" id="35" name="Picture"/>
+                    <pic:cNvPr descr="../figures/fig03_transfer.png" id="37" name="Picture"/>
                     <pic:cNvPicPr>
                       <a:picLocks noChangeArrowheads="1" noChangeAspect="1"/>
                     </pic:cNvPicPr>
                   </pic:nvPicPr>
                   <pic:blipFill>
-                    <a:blip r:embed="rId33"/>
+                    <a:blip r:embed="rId35"/>
                     <a:stretch>
                       <a:fillRect/>
                     </a:stretch>
@@ -8468,8 +8730,8 @@
         <w:t xml:space="preserve">score than the distinct records (gradient boosting 0.683 against 0.636), which we suspect is because the countries with the most temperature rows are over-weighted in the raw test folds (we did not test this explanation). The direction of the duplicate effect therefore depends on the protocol, and a reported score on the raw file cannot be interpreted without knowing which rows are weighted.</w:t>
       </w:r>
     </w:p>
-    <w:bookmarkEnd w:id="36"/>
-    <w:bookmarkStart w:id="40" w:name="coverage-collapse-on-unseen-groups"/>
+    <w:bookmarkEnd w:id="38"/>
+    <w:bookmarkStart w:id="42" w:name="coverage-collapse-on-unseen-groups"/>
     <w:p>
       <w:pPr>
         <w:pStyle w:val="Heading2"/>
@@ -11935,7 +12197,7 @@
         <w:pStyle w:val="BodyText"/>
       </w:pPr>
       <w:r>
-        <w:t xml:space="preserve">Table 13 gives the simulation behind Fig. 3a. With no group effect (</w:t>
+        <w:t xml:space="preserve">Table 9 gives the simulation behind Fig. 3a. With no group effect (</w:t>
       </w:r>
       <m:oMath>
         <m:r>
@@ -12017,7 +12279,7 @@
         <w:pStyle w:val="TableCaption"/>
       </w:pPr>
       <w:r>
-        <w:t xml:space="preserve">Table 13. Simulation check of the coverage relation (nominal 90%; mean over 20 replicates). τ is the SD of group effects relative to unit noise; n is the number of rows per group; ρ is the measured ratio of test to calibration residual scale under naive calibration.</w:t>
+        <w:t xml:space="preserve">Table 9. Simulation check of the coverage relation (nominal 90%; mean over 20 replicates). τ is the SD of group effects relative to unit noise; n is the number of rows per group; ρ is the measured ratio of test to calibration residual scale under naive calibration.</w:t>
       </w:r>
     </w:p>
     <w:tbl>
@@ -12040,7 +12302,7 @@
           <w:right w:w="60" w:type="dxa"/>
         </w:tblCellMar>
         <w:tblLook w:firstRow="1" w:lastRow="0" w:firstColumn="0" w:lastColumn="0" w:noHBand="0" w:noVBand="0" w:val="0020"/>
-        <w:tblCaption w:val="Table 13. Simulation check of the coverage relation (nominal 90%; mean over 20 replicates). τ is the SD of group effects relative to unit noise; n is the number of rows per group; ρ is the measured ratio of test to calibration residual scale under naive calibration."/>
+        <w:tblCaption w:val="Table 9. Simulation check of the coverage relation (nominal 90%; mean over 20 replicates). τ is the SD of group effects relative to unit noise; n is the number of rows per group; ρ is the measured ratio of test to calibration residual scale under naive calibration."/>
       </w:tblPr>
       <w:tblGrid>
         <w:gridCol w:w="1067"/>
@@ -13784,18 +14046,18 @@
           <wp:inline>
             <wp:extent cx="5753100" cy="1980575"/>
             <wp:effectExtent b="0" l="0" r="0" t="0"/>
-            <wp:docPr descr="Fig. 3. Coverage collapse. (a) Actual coverage against the inflation ratio \rho: the curve is Eq. (5), dots are simulation cells with naive calibration, diamonds are the implied \rho of the three data settings. (b) Naive coverage of three model families (nominal 0.90, dotted). (c) Naive coverage of gradient boosting against the accuracy with which the group can be identified from the features." title="" id="38" name="Picture"/>
+            <wp:docPr descr="Fig. 3. Coverage collapse. (a) Actual coverage against the inflation ratio \rho: the curve is Eq. (5), dots are simulation cells with naive calibration, diamonds are the implied \rho of the three data settings. (b) Naive coverage of three model families (nominal 0.90, dotted). (c) Naive coverage of gradient boosting against the accuracy with which the group can be identified from the features." title="" id="40" name="Picture"/>
             <a:graphic>
               <a:graphicData uri="http://schemas.openxmlformats.org/drawingml/2006/picture">
                 <pic:pic>
                   <pic:nvPicPr>
-                    <pic:cNvPr descr="../figures/fig04_collapse.png" id="39" name="Picture"/>
+                    <pic:cNvPr descr="../figures/fig04_collapse.png" id="41" name="Picture"/>
                     <pic:cNvPicPr>
                       <a:picLocks noChangeArrowheads="1" noChangeAspect="1"/>
                     </pic:cNvPicPr>
                   </pic:nvPicPr>
                   <pic:blipFill>
-                    <a:blip r:embed="rId37"/>
+                    <a:blip r:embed="rId39"/>
                     <a:stretch>
                       <a:fillRect/>
                     </a:stretch>
@@ -13855,8 +14117,8 @@
         <w:t xml:space="preserve">of the three data settings. (b) Naive coverage of three model families (nominal 0.90, dotted). (c) Naive coverage of gradient boosting against the accuracy with which the group can be identified from the features.</w:t>
       </w:r>
     </w:p>
-    <w:bookmarkEnd w:id="40"/>
-    <w:bookmarkStart w:id="41" w:name="collapse-follows-the-group-fingerprint"/>
+    <w:bookmarkEnd w:id="42"/>
+    <w:bookmarkStart w:id="43" w:name="collapse-follows-the-group-fingerprint"/>
     <w:p>
       <w:pPr>
         <w:pStyle w:val="Heading2"/>
@@ -13879,7 +14141,7 @@
         <w:pStyle w:val="FirstParagraph"/>
       </w:pPr>
       <w:r>
-        <w:t xml:space="preserve">Table 9 and Fig. 3b and 3c relate the collapse to the group fingerprint. The features identify the country in 60% of held-out FAO rows (chance 1.8%), the state in 31% of Indian rows (chance 14%) and the district in 1.9% (chance 0.4%), with mean feature intraclass correlation 0.92 on FAO and 0.07 (states) and 0.10 (districts) for India. Naive coverage of gradient boosting is 0.59, 0.85 and 0.90 in the same order. Model family matters as the theory predicts: on FAO, naive coverage is 0.47 for random forest, 0.59 for gradient boosting and 0.88 for ridge regression, while on the three settings group calibration gives about 0.89 to 0.90 for every model. Ridge regression is therefore robust to the collapse, but it is also the least accurate model under random splits, so a practitioner who chooses a model by random-split accuracy would choose one of the models whose intervals collapse. We have three settings, which show a monotone relation but not a fitted law, and the identification accuracy and feature correlation for India rest on a single continuous feature, so we read Table 9 as a consistent pattern and not as a quantitative calibration.</w:t>
+        <w:t xml:space="preserve">Table 10 and Fig. 3b and 3c relate the collapse to the group fingerprint. The features identify the country in 60% of held-out FAO rows (chance 1.8%), the state in 31% of Indian rows (chance 14%) and the district in 1.9% (chance 0.4%), with mean feature intraclass correlation 0.92 on FAO and 0.07 (states) and 0.10 (districts) for India. Naive coverage of gradient boosting is 0.59, 0.85 and 0.90 in the same order. Model family matters as the theory predicts: on FAO, naive coverage is 0.47 for random forest, 0.59 for gradient boosting and 0.88 for ridge regression, while on the three settings group calibration gives about 0.89 to 0.90 for every model. Ridge regression is therefore robust to the collapse, but it is also the least accurate model under random splits, so a practitioner who chooses a model by random-split accuracy would choose one of the models whose intervals collapse. We have three settings, which show a monotone relation but not a fitted law, and the identification accuracy and feature correlation for India rest on a single continuous feature, so we read Table 9 as a consistent pattern and not as a quantitative calibration.</w:t>
       </w:r>
     </w:p>
     <w:p>
@@ -13887,7 +14149,7 @@
         <w:pStyle w:val="TableCaption"/>
       </w:pPr>
       <w:r>
-        <w:t xml:space="preserve">Table 9. Group fingerprint strength and conformal coverage by model family (naive / group calibration, nominal 90%). Group-ID accuracy is the five-nearest-neighbour accuracy of identifying the group from the features, with the largest-group share in brackets. Feature ICC is the mean intraclass correlation of the continuous features (the Indian table has one, log area).</w:t>
+        <w:t xml:space="preserve">Table 10. Group fingerprint strength and conformal coverage by model family (naive / group calibration, nominal 90%). Group-ID accuracy is the five-nearest-neighbour accuracy of identifying the group from the features, with the largest-group share in brackets. Feature ICC is the mean intraclass correlation of the continuous features (the Indian table has one, log area).</w:t>
       </w:r>
     </w:p>
     <w:tbl>
@@ -13910,7 +14172,7 @@
           <w:right w:w="60" w:type="dxa"/>
         </w:tblCellMar>
         <w:tblLook w:firstRow="1" w:lastRow="0" w:firstColumn="0" w:lastColumn="0" w:noHBand="0" w:noVBand="0" w:val="0020"/>
-        <w:tblCaption w:val="Table 9. Group fingerprint strength and conformal coverage by model family (naive / group calibration, nominal 90%). Group-ID accuracy is the five-nearest-neighbour accuracy of identifying the group from the features, with the largest-group share in brackets. Feature ICC is the mean intraclass correlation of the continuous features (the Indian table has one, log area)."/>
+        <w:tblCaption w:val="Table 10. Group fingerprint strength and conformal coverage by model family (naive / group calibration, nominal 90%). Group-ID accuracy is the five-nearest-neighbour accuracy of identifying the group from the features, with the largest-group share in brackets. Feature ICC is the mean intraclass correlation of the continuous features (the Indian table has one, log area)."/>
       </w:tblPr>
       <w:tblGrid>
         <w:gridCol w:w="2061"/>
@@ -14476,8 +14738,8 @@
         </w:tc>
       </w:tr>
     </w:tbl>
-    <w:bookmarkEnd w:id="41"/>
-    <w:bookmarkStart w:id="45" w:name="comparing-calibration-schemes"/>
+    <w:bookmarkEnd w:id="43"/>
+    <w:bookmarkStart w:id="47" w:name="comparing-calibration-schemes"/>
     <w:p>
       <w:pPr>
         <w:pStyle w:val="Heading2"/>
@@ -14500,15 +14762,478 @@
         <w:pStyle w:val="FirstParagraph"/>
       </w:pPr>
       <w:r>
-        <w:t xml:space="preserve">All group-aware schemes restore marginal coverage (Table 7); they differ in how coverage is distributed across groups and in width. Group-CV calibration, which uses all training groups for calibration and averages five models, gives marginal coverage 0.908, 0.900 and 0.900, with intervals as narrow as the group split (2.17, 2.33 and 1.96). The weighted scheme is indistinguishable from the plain group scheme on every setting: this is consistent with a classifier that separates calibration rows from test rows almost perfectly on FAO, where the features nearly identify the country, so that clipped weights carry little usable information (we did not inspect the weight distribution). The distance score has mixed results: it does nothing on FAO (share of countries below nominal-10: 0.204 against 0.196) but lowers the share on Indian districts (0.076 against 0.116).</w:t>
+        <w:t xml:space="preserve">All group-aware schemes restore marginal coverage (Table 7); they differ in how coverage is distributed across groups and in width. Group-CV calibration, which uses all training groups for calibration and averages five models, gives marginal coverage 0.908, 0.900 and 0.900, with intervals as narrow as the group split (2.17, 2.33 and 1.96). The weighted scheme is indistinguishable from the plain group scheme on every setting, and Table 11 shows why. A classifier that separates calibration rows from test rows reaches a cross-validated AUC of 1.0 on FAO, because the two sets contain different countries whose covariates are nearly constant. The weights of the calibration groups fall below the lower clipping bound in essentially all rows, so clipping returns uniform weights; for the naive calibration rows the unclipped effective sample size is 9% of the rows and 99% of the weights are below the bound, and weighting leaves coverage at 0.606 (0.598 unweighted). Covariate-shift weights need overlap between the calibration and test populations [20, 31], which fails when the test groups are new and the features identify the group.</w:t>
       </w:r>
     </w:p>
     <w:p>
       <w:pPr>
+        <w:pStyle w:val="TableCaption"/>
+      </w:pPr>
+      <w:r>
+        <w:t xml:space="preserve">Table 11. Weighted conformal diagnostics on FAO (domain classifier separating calibration rows from test rows; cross-fitted weights). AUC is the cross-validated classifier AUC; ESS is the effective sample size as a share of the calibration rows; clipping is at 0.05 and 20.</w:t>
+      </w:r>
+    </w:p>
+    <w:tbl>
+      <w:tblPr>
+        <w:tblStyle w:val="Table"/>
+        <w:tblW w:w="9071" w:type="dxa"/>
+        <w:tblBorders>
+          <w:top w:val="single" w:sz="12" w:space="0" w:color="000000"/>
+          <w:left w:val="nil"/>
+          <w:bottom w:val="single" w:sz="12" w:space="0" w:color="000000"/>
+          <w:right w:val="nil"/>
+          <w:insideH w:val="nil"/>
+          <w:insideV w:val="nil"/>
+        </w:tblBorders>
+        <w:tblLayout w:type="fixed"/>
+        <w:tblCellMar>
+          <w:top w:w="20" w:type="dxa"/>
+          <w:left w:w="60" w:type="dxa"/>
+          <w:bottom w:w="20" w:type="dxa"/>
+          <w:right w:w="60" w:type="dxa"/>
+        </w:tblCellMar>
+        <w:tblLook w:firstRow="1" w:lastRow="0" w:firstColumn="0" w:lastColumn="0" w:noHBand="0" w:noVBand="0" w:val="0020"/>
+        <w:tblCaption w:val="Table 11. Weighted conformal diagnostics on FAO (domain classifier separating calibration rows from test rows; cross-fitted weights). AUC is the cross-validated classifier AUC; ESS is the effective sample size as a share of the calibration rows; clipping is at 0.05 and 20."/>
+      </w:tblPr>
+      <w:tblGrid>
+        <w:gridCol w:w="2344"/>
+        <w:gridCol w:w="493"/>
+        <w:gridCol w:w="987"/>
+        <w:gridCol w:w="863"/>
+        <w:gridCol w:w="1789"/>
+        <w:gridCol w:w="1357"/>
+        <w:gridCol w:w="1234"/>
+      </w:tblGrid>
+      <w:tr>
+        <w:trPr>
+          <w:cantSplit w:val="true"/>
+          <w:tblHeader w:val="on"/>
+          <w:tblHeader w:val="true"/>
+        </w:trPr>
+        <w:tc>
+          <w:tcPr>
+            <w:tcW w:w="2344" w:type="dxa"/>
+            <w:tcBorders>
+              <w:bottom w:val="single" w:sz="6" w:space="0" w:color="000000"/>
+            </w:tcBorders>
+          </w:tcPr>
+          <w:p>
+            <w:pPr>
+              <w:pStyle w:val="Compact"/>
+              <w:keepLines/>
+              <w:jc w:val="left"/>
+            </w:pPr>
+            <w:r>
+              <w:rPr>
+                <w:b/>
+                <w:sz w:val="16"/>
+              </w:rPr>
+              <w:t xml:space="preserve">Calibration set weighted</w:t>
+            </w:r>
+          </w:p>
+        </w:tc>
+        <w:tc>
+          <w:tcPr>
+            <w:tcW w:w="493" w:type="dxa"/>
+            <w:tcBorders>
+              <w:bottom w:val="single" w:sz="6" w:space="0" w:color="000000"/>
+            </w:tcBorders>
+          </w:tcPr>
+          <w:p>
+            <w:pPr>
+              <w:pStyle w:val="Compact"/>
+              <w:keepLines/>
+              <w:jc w:val="right"/>
+            </w:pPr>
+            <w:r>
+              <w:rPr>
+                <w:b/>
+                <w:sz w:val="16"/>
+              </w:rPr>
+              <w:t xml:space="preserve">AUC</w:t>
+            </w:r>
+          </w:p>
+        </w:tc>
+        <w:tc>
+          <w:tcPr>
+            <w:tcW w:w="987" w:type="dxa"/>
+            <w:tcBorders>
+              <w:bottom w:val="single" w:sz="6" w:space="0" w:color="000000"/>
+            </w:tcBorders>
+          </w:tcPr>
+          <w:p>
+            <w:pPr>
+              <w:pStyle w:val="Compact"/>
+              <w:keepLines/>
+              <w:jc w:val="right"/>
+            </w:pPr>
+            <w:r>
+              <w:rPr>
+                <w:b/>
+                <w:sz w:val="16"/>
+              </w:rPr>
+              <w:t xml:space="preserve">ESS, unclipped</w:t>
+            </w:r>
+          </w:p>
+        </w:tc>
+        <w:tc>
+          <w:tcPr>
+            <w:tcW w:w="863" w:type="dxa"/>
+            <w:tcBorders>
+              <w:bottom w:val="single" w:sz="6" w:space="0" w:color="000000"/>
+            </w:tcBorders>
+          </w:tcPr>
+          <w:p>
+            <w:pPr>
+              <w:pStyle w:val="Compact"/>
+              <w:keepLines/>
+              <w:jc w:val="right"/>
+            </w:pPr>
+            <w:r>
+              <w:rPr>
+                <w:b/>
+                <w:sz w:val="16"/>
+              </w:rPr>
+              <w:t xml:space="preserve">ESS, clipped</w:t>
+            </w:r>
+          </w:p>
+        </w:tc>
+        <w:tc>
+          <w:tcPr>
+            <w:tcW w:w="1789" w:type="dxa"/>
+            <w:tcBorders>
+              <w:bottom w:val="single" w:sz="6" w:space="0" w:color="000000"/>
+            </w:tcBorders>
+          </w:tcPr>
+          <w:p>
+            <w:pPr>
+              <w:pStyle w:val="Compact"/>
+              <w:keepLines/>
+              <w:jc w:val="right"/>
+            </w:pPr>
+            <w:r>
+              <w:rPr>
+                <w:b/>
+                <w:sz w:val="16"/>
+              </w:rPr>
+              <w:t xml:space="preserve">Share of weights below 0.05</w:t>
+            </w:r>
+          </w:p>
+        </w:tc>
+        <w:tc>
+          <w:tcPr>
+            <w:tcW w:w="1357" w:type="dxa"/>
+            <w:tcBorders>
+              <w:bottom w:val="single" w:sz="6" w:space="0" w:color="000000"/>
+            </w:tcBorders>
+          </w:tcPr>
+          <w:p>
+            <w:pPr>
+              <w:pStyle w:val="Compact"/>
+              <w:keepLines/>
+              <w:jc w:val="right"/>
+            </w:pPr>
+            <w:r>
+              <w:rPr>
+                <w:b/>
+                <w:sz w:val="16"/>
+              </w:rPr>
+              <w:t xml:space="preserve">Coverage, unweighted</w:t>
+            </w:r>
+          </w:p>
+        </w:tc>
+        <w:tc>
+          <w:tcPr>
+            <w:tcW w:w="1234" w:type="dxa"/>
+            <w:tcBorders>
+              <w:bottom w:val="single" w:sz="6" w:space="0" w:color="000000"/>
+            </w:tcBorders>
+          </w:tcPr>
+          <w:p>
+            <w:pPr>
+              <w:pStyle w:val="Compact"/>
+              <w:keepLines/>
+              <w:jc w:val="right"/>
+            </w:pPr>
+            <w:r>
+              <w:rPr>
+                <w:b/>
+                <w:sz w:val="16"/>
+              </w:rPr>
+              <w:t xml:space="preserve">Coverage, weighted</w:t>
+            </w:r>
+          </w:p>
+        </w:tc>
+      </w:tr>
+      <w:tr>
+        <w:trPr>
+          <w:cantSplit w:val="true"/>
+        </w:trPr>
+        <w:tc>
+          <w:tcPr>
+            <w:tcW w:w="2344" w:type="dxa"/>
+          </w:tcPr>
+          <w:p>
+            <w:pPr>
+              <w:pStyle w:val="Compact"/>
+              <w:keepLines/>
+              <w:jc w:val="left"/>
+            </w:pPr>
+            <w:r>
+              <w:rPr>
+                <w:sz w:val="16"/>
+              </w:rPr>
+              <w:t xml:space="preserve">Naive calibration rows (seen groups)</w:t>
+            </w:r>
+          </w:p>
+        </w:tc>
+        <w:tc>
+          <w:tcPr>
+            <w:tcW w:w="493" w:type="dxa"/>
+          </w:tcPr>
+          <w:p>
+            <w:pPr>
+              <w:pStyle w:val="Compact"/>
+              <w:keepLines/>
+              <w:jc w:val="right"/>
+            </w:pPr>
+            <w:r>
+              <w:rPr>
+                <w:sz w:val="16"/>
+              </w:rPr>
+              <w:t xml:space="preserve">1.000</w:t>
+            </w:r>
+          </w:p>
+        </w:tc>
+        <w:tc>
+          <w:tcPr>
+            <w:tcW w:w="987" w:type="dxa"/>
+          </w:tcPr>
+          <w:p>
+            <w:pPr>
+              <w:pStyle w:val="Compact"/>
+              <w:keepLines/>
+              <w:jc w:val="right"/>
+            </w:pPr>
+            <w:r>
+              <w:rPr>
+                <w:sz w:val="16"/>
+              </w:rPr>
+              <w:t xml:space="preserve">0.093</w:t>
+            </w:r>
+          </w:p>
+        </w:tc>
+        <w:tc>
+          <w:tcPr>
+            <w:tcW w:w="863" w:type="dxa"/>
+          </w:tcPr>
+          <w:p>
+            <w:pPr>
+              <w:pStyle w:val="Compact"/>
+              <w:keepLines/>
+              <w:jc w:val="right"/>
+            </w:pPr>
+            <w:r>
+              <w:rPr>
+                <w:sz w:val="16"/>
+              </w:rPr>
+              <w:t xml:space="preserve">0.662</w:t>
+            </w:r>
+          </w:p>
+        </w:tc>
+        <w:tc>
+          <w:tcPr>
+            <w:tcW w:w="1789" w:type="dxa"/>
+          </w:tcPr>
+          <w:p>
+            <w:pPr>
+              <w:pStyle w:val="Compact"/>
+              <w:keepLines/>
+              <w:jc w:val="right"/>
+            </w:pPr>
+            <w:r>
+              <w:rPr>
+                <w:sz w:val="16"/>
+              </w:rPr>
+              <w:t xml:space="preserve">0.986</w:t>
+            </w:r>
+          </w:p>
+        </w:tc>
+        <w:tc>
+          <w:tcPr>
+            <w:tcW w:w="1357" w:type="dxa"/>
+          </w:tcPr>
+          <w:p>
+            <w:pPr>
+              <w:pStyle w:val="Compact"/>
+              <w:keepLines/>
+              <w:jc w:val="right"/>
+            </w:pPr>
+            <w:r>
+              <w:rPr>
+                <w:sz w:val="16"/>
+              </w:rPr>
+              <w:t xml:space="preserve">0.598</w:t>
+            </w:r>
+          </w:p>
+        </w:tc>
+        <w:tc>
+          <w:tcPr>
+            <w:tcW w:w="1234" w:type="dxa"/>
+          </w:tcPr>
+          <w:p>
+            <w:pPr>
+              <w:pStyle w:val="Compact"/>
+              <w:keepLines/>
+              <w:jc w:val="right"/>
+            </w:pPr>
+            <w:r>
+              <w:rPr>
+                <w:sz w:val="16"/>
+              </w:rPr>
+              <w:t xml:space="preserve">0.606</w:t>
+            </w:r>
+          </w:p>
+        </w:tc>
+      </w:tr>
+      <w:tr>
+        <w:trPr>
+          <w:cantSplit w:val="true"/>
+        </w:trPr>
+        <w:tc>
+          <w:tcPr>
+            <w:tcW w:w="2344" w:type="dxa"/>
+          </w:tcPr>
+          <w:p>
+            <w:pPr>
+              <w:pStyle w:val="Compact"/>
+              <w:keepLines/>
+              <w:jc w:val="left"/>
+            </w:pPr>
+            <w:r>
+              <w:rPr>
+                <w:sz w:val="16"/>
+              </w:rPr>
+              <w:t xml:space="preserve">Calibration groups (unseen)</w:t>
+            </w:r>
+          </w:p>
+        </w:tc>
+        <w:tc>
+          <w:tcPr>
+            <w:tcW w:w="493" w:type="dxa"/>
+          </w:tcPr>
+          <w:p>
+            <w:pPr>
+              <w:pStyle w:val="Compact"/>
+              <w:keepLines/>
+              <w:jc w:val="right"/>
+            </w:pPr>
+            <w:r>
+              <w:rPr>
+                <w:sz w:val="16"/>
+              </w:rPr>
+              <w:t xml:space="preserve">1.000</w:t>
+            </w:r>
+          </w:p>
+        </w:tc>
+        <w:tc>
+          <w:tcPr>
+            <w:tcW w:w="987" w:type="dxa"/>
+          </w:tcPr>
+          <w:p>
+            <w:pPr>
+              <w:pStyle w:val="Compact"/>
+              <w:keepLines/>
+              <w:jc w:val="right"/>
+            </w:pPr>
+            <w:r>
+              <w:rPr>
+                <w:sz w:val="16"/>
+              </w:rPr>
+              <w:t xml:space="preserve">0.724</w:t>
+            </w:r>
+          </w:p>
+        </w:tc>
+        <w:tc>
+          <w:tcPr>
+            <w:tcW w:w="863" w:type="dxa"/>
+          </w:tcPr>
+          <w:p>
+            <w:pPr>
+              <w:pStyle w:val="Compact"/>
+              <w:keepLines/>
+              <w:jc w:val="right"/>
+            </w:pPr>
+            <w:r>
+              <w:rPr>
+                <w:sz w:val="16"/>
+              </w:rPr>
+              <w:t xml:space="preserve">0.960</w:t>
+            </w:r>
+          </w:p>
+        </w:tc>
+        <w:tc>
+          <w:tcPr>
+            <w:tcW w:w="1789" w:type="dxa"/>
+          </w:tcPr>
+          <w:p>
+            <w:pPr>
+              <w:pStyle w:val="Compact"/>
+              <w:keepLines/>
+              <w:jc w:val="right"/>
+            </w:pPr>
+            <w:r>
+              <w:rPr>
+                <w:sz w:val="16"/>
+              </w:rPr>
+              <w:t xml:space="preserve">1.000</w:t>
+            </w:r>
+          </w:p>
+        </w:tc>
+        <w:tc>
+          <w:tcPr>
+            <w:tcW w:w="1357" w:type="dxa"/>
+          </w:tcPr>
+          <w:p>
+            <w:pPr>
+              <w:pStyle w:val="Compact"/>
+              <w:keepLines/>
+              <w:jc w:val="right"/>
+            </w:pPr>
+            <w:r>
+              <w:rPr>
+                <w:sz w:val="16"/>
+              </w:rPr>
+              <w:t xml:space="preserve">0.895</w:t>
+            </w:r>
+          </w:p>
+        </w:tc>
+        <w:tc>
+          <w:tcPr>
+            <w:tcW w:w="1234" w:type="dxa"/>
+          </w:tcPr>
+          <w:p>
+            <w:pPr>
+              <w:pStyle w:val="Compact"/>
+              <w:keepLines/>
+              <w:jc w:val="right"/>
+            </w:pPr>
+            <w:r>
+              <w:rPr>
+                <w:sz w:val="16"/>
+              </w:rPr>
+              <w:t xml:space="preserve">0.895</w:t>
+            </w:r>
+          </w:p>
+        </w:tc>
+      </w:tr>
+    </w:tbl>
+    <w:p>
+      <w:pPr>
         <w:pStyle w:val="BodyText"/>
       </w:pPr>
       <w:r>
-        <w:t xml:space="preserve">Normalising scores by the learned scale gives modest, consistent improvements in the weak tail (Table 10). The 10th-percentile group coverage rises by 0.051 on FAO (95% interval 0.018–0.085), by 0.024 on states (0.007–0.043) and by 0.012 on districts (0.006–0.019), and the share of groups more than 10 points below nominal falls by 0.059 on states (0.002–0.116, border of significance) and 0.016 on districts, with a non-significant change on FAO (−0.029, interval −0.078 to 0.023). The cost is width: intervals are wider by 0.26 on FAO and 0.18 on states, and slightly narrower on districts (−0.04). The method does not remove the tail: even with scaling, 17% of FAO countries and 10% of Indian districts remain more than 10 points below nominal, consistent with Eq. (7) and with the absence of group-conditional guarantees in the pooled approach.</w:t>
+        <w:t xml:space="preserve">Normalising scores by the learned scale gives modest, consistent improvements in the weak tail (Table 12). The 10th-percentile group coverage rises by 0.051 on FAO (95% interval 0.018–0.085), by 0.024 on states (0.007–0.043) and by 0.012 on districts (0.006–0.019), and the share of groups more than 10 points below nominal falls by 0.059 on states (0.002–0.116, border of significance) and 0.016 on districts, with a non-significant change on FAO (−0.029, interval −0.078 to 0.023). The cost is width: intervals are wider by 0.26 on FAO and 0.18 on states, and slightly narrower on districts (−0.04). The method does not remove the tail: even with scaling, 17% of FAO countries and 10% of Indian districts remain more than 10 points below nominal, consistent with Eq. (7) and with the absence of group-conditional guarantees in the pooled approach.</w:t>
       </w:r>
     </w:p>
     <w:p>
@@ -14523,18 +15248,18 @@
           <wp:inline>
             <wp:extent cx="5753100" cy="2203481"/>
             <wp:effectExtent b="0" l="0" r="0" t="0"/>
-            <wp:docPr descr="Fig. 4. Calibration schemes at nominal 90% on unseen groups. (a) 10th-percentile group coverage. (b) Share of groups more than 10 points below nominal. (c) Mean interval width (log-yield units). Error bars are 95% bootstrap intervals over seeds and folds." title="" id="43" name="Picture"/>
+            <wp:docPr descr="Fig. 4. Calibration schemes at nominal 90% on unseen groups. (a) 10th-percentile group coverage. (b) Share of groups more than 10 points below nominal. (c) Mean interval width (log-yield units). Error bars are 95% bootstrap intervals over seeds and folds." title="" id="45" name="Picture"/>
             <a:graphic>
               <a:graphicData uri="http://schemas.openxmlformats.org/drawingml/2006/picture">
                 <pic:pic>
                   <pic:nvPicPr>
-                    <pic:cNvPr descr="../figures/fig05_methods.png" id="44" name="Picture"/>
+                    <pic:cNvPr descr="../figures/fig05_methods.png" id="46" name="Picture"/>
                     <pic:cNvPicPr>
                       <a:picLocks noChangeArrowheads="1" noChangeAspect="1"/>
                     </pic:cNvPicPr>
                   </pic:nvPicPr>
                   <pic:blipFill>
-                    <a:blip r:embed="rId42"/>
+                    <a:blip r:embed="rId44"/>
                     <a:stretch>
                       <a:fillRect/>
                     </a:stretch>
@@ -14574,7 +15299,7 @@
         <w:pStyle w:val="TableCaption"/>
       </w:pPr>
       <w:r>
-        <w:t xml:space="preserve">Table 10. Paired difference between scaled and plain group calibration at nominal 90% (scaled minus group; mean over seeds and folds with 95% bootstrap interval).</w:t>
+        <w:t xml:space="preserve">Table 12. Paired difference between scaled and plain group calibration at nominal 90% (scaled minus group; mean over seeds and folds with 95% bootstrap interval).</w:t>
       </w:r>
     </w:p>
     <w:tbl>
@@ -14597,7 +15322,7 @@
           <w:right w:w="60" w:type="dxa"/>
         </w:tblCellMar>
         <w:tblLook w:firstRow="1" w:lastRow="0" w:firstColumn="0" w:lastColumn="0" w:noHBand="0" w:noVBand="0" w:val="0020"/>
-        <w:tblCaption w:val="Table 10. Paired difference between scaled and plain group calibration at nominal 90% (scaled minus group; mean over seeds and folds with 95% bootstrap interval)."/>
+        <w:tblCaption w:val="Table 12. Paired difference between scaled and plain group calibration at nominal 90% (scaled minus group; mean over seeds and folds with 95% bootstrap interval)."/>
       </w:tblPr>
       <w:tblGrid>
         <w:gridCol w:w="2412"/>
@@ -14932,8 +15657,8 @@
         </w:tc>
       </w:tr>
     </w:tbl>
-    <w:bookmarkEnd w:id="45"/>
-    <w:bookmarkStart w:id="49" w:name="which-groups-are-at-risk"/>
+    <w:bookmarkEnd w:id="47"/>
+    <w:bookmarkStart w:id="51" w:name="which-groups-are-at-risk"/>
     <w:p>
       <w:pPr>
         <w:pStyle w:val="Heading2"/>
@@ -14956,7 +15681,7 @@
         <w:pStyle w:val="FirstParagraph"/>
       </w:pPr>
       <w:r>
-        <w:t xml:space="preserve">If intervals are to be trusted for a new place, it helps to know in advance whether the place is hard. Table 11 and Fig. 5 compare the two group-level scores. The learned scale correlates positively with a group’s error in all three settings (Spearman 0.32 on FAO, 0.50 for states, 0.61 for districts), and clearly more than the distance of the group’s covariate profile to the training groups (0.13, 0.12 and 0.39). The intervals are optimistic because group–fold pairs from different seeds are treated as independent, but the ordering of the two scores is stable across settings. The distance score is weak on FAO because the covariates are nearly country labels, so every new country is far from every training country and distance does not separate hard from easy ones, whereas the learned scale uses the model’s own error structure. A correlation of 0.3 to 0.6 is useful for flagging, not for a decision rule.</w:t>
+        <w:t xml:space="preserve">If intervals are to be trusted for a new place, it helps to know in advance whether the place is hard. Table 13 and Fig. 5 compare the two group-level scores. The learned scale correlates positively with a group’s error in all three settings (Spearman 0.48 on FAO, 0.53 for states, 0.61 for districts, with groups as the resampling unit), and more than the distance of the group’s covariate profile to the training groups (0.14, 0.11 and 0.39). The distance interval includes zero for FAO and for states, while that of the learned scale does not for any setting. The distance score is weak on FAO because the covariates are nearly country labels, so every new country is far from every training country and distance does not separate hard from easy ones, whereas the learned scale uses the model’s own error structure. A correlation of 0.3 to 0.6 is useful for flagging, not for a decision rule.</w:t>
       </w:r>
     </w:p>
     <w:p>
@@ -14964,7 +15689,7 @@
         <w:pStyle w:val="TableCaption"/>
       </w:pPr>
       <w:r>
-        <w:t xml:space="preserve">Table 11. Spearman correlation between a group-level score and the group’s mean absolute error (95% bootstrap interval over group–fold pairs, which treats repeated groups as independent and is therefore optimistic).</w:t>
+        <w:t xml:space="preserve">Table 13. Spearman correlation between a group-level score and the group’s mean absolute error. Scores and errors are averaged over seeds and folds for each group, and the 95% interval is a bootstrap over groups.</w:t>
       </w:r>
     </w:p>
     <w:tbl>
@@ -14987,12 +15712,13 @@
           <w:right w:w="60" w:type="dxa"/>
         </w:tblCellMar>
         <w:tblLook w:firstRow="1" w:lastRow="0" w:firstColumn="0" w:lastColumn="0" w:noHBand="0" w:noVBand="0" w:val="0020"/>
-        <w:tblCaption w:val="Table 11. Spearman correlation between a group-level score and the group’s mean absolute error (95% bootstrap interval over group–fold pairs, which treats repeated groups as independent and is therefore optimistic)."/>
+        <w:tblCaption w:val="Table 13. Spearman correlation between a group-level score and the group’s mean absolute error. Scores and errors are averaged over seeds and folds for each group, and the 95% interval is a bootstrap over groups."/>
       </w:tblPr>
       <w:tblGrid>
-        <w:gridCol w:w="3488"/>
-        <w:gridCol w:w="2791"/>
-        <w:gridCol w:w="2791"/>
+        <w:gridCol w:w="3106"/>
+        <w:gridCol w:w="994"/>
+        <w:gridCol w:w="2485"/>
+        <w:gridCol w:w="2485"/>
       </w:tblGrid>
       <w:tr>
         <w:trPr>
@@ -15002,7 +15728,7 @@
         </w:trPr>
         <w:tc>
           <w:tcPr>
-            <w:tcW w:w="3488" w:type="dxa"/>
+            <w:tcW w:w="3106" w:type="dxa"/>
             <w:tcBorders>
               <w:bottom w:val="single" w:sz="6" w:space="0" w:color="000000"/>
             </w:tcBorders>
@@ -15024,7 +15750,7 @@
         </w:tc>
         <w:tc>
           <w:tcPr>
-            <w:tcW w:w="2791" w:type="dxa"/>
+            <w:tcW w:w="994" w:type="dxa"/>
             <w:tcBorders>
               <w:bottom w:val="single" w:sz="6" w:space="0" w:color="000000"/>
             </w:tcBorders>
@@ -15033,6 +15759,28 @@
             <w:pPr>
               <w:pStyle w:val="Compact"/>
               <w:keepLines/>
+              <w:jc w:val="right"/>
+            </w:pPr>
+            <w:r>
+              <w:rPr>
+                <w:b/>
+                <w:sz w:val="17"/>
+              </w:rPr>
+              <w:t xml:space="preserve">Groups</w:t>
+            </w:r>
+          </w:p>
+        </w:tc>
+        <w:tc>
+          <w:tcPr>
+            <w:tcW w:w="2485" w:type="dxa"/>
+            <w:tcBorders>
+              <w:bottom w:val="single" w:sz="6" w:space="0" w:color="000000"/>
+            </w:tcBorders>
+          </w:tcPr>
+          <w:p>
+            <w:pPr>
+              <w:pStyle w:val="Compact"/>
+              <w:keepLines/>
               <w:jc w:val="left"/>
             </w:pPr>
             <w:r>
@@ -15046,7 +15794,7 @@
         </w:tc>
         <w:tc>
           <w:tcPr>
-            <w:tcW w:w="2791" w:type="dxa"/>
+            <w:tcW w:w="2485" w:type="dxa"/>
             <w:tcBorders>
               <w:bottom w:val="single" w:sz="6" w:space="0" w:color="000000"/>
             </w:tcBorders>
@@ -15073,7 +15821,7 @@
         </w:trPr>
         <w:tc>
           <w:tcPr>
-            <w:tcW w:w="3488" w:type="dxa"/>
+            <w:tcW w:w="3106" w:type="dxa"/>
           </w:tcPr>
           <w:p>
             <w:pPr>
@@ -15091,7 +15839,25 @@
         </w:tc>
         <w:tc>
           <w:tcPr>
-            <w:tcW w:w="2791" w:type="dxa"/>
+            <w:tcW w:w="994" w:type="dxa"/>
+          </w:tcPr>
+          <w:p>
+            <w:pPr>
+              <w:pStyle w:val="Compact"/>
+              <w:keepLines/>
+              <w:jc w:val="right"/>
+            </w:pPr>
+            <w:r>
+              <w:rPr>
+                <w:sz w:val="17"/>
+              </w:rPr>
+              <w:t xml:space="preserve">101</w:t>
+            </w:r>
+          </w:p>
+        </w:tc>
+        <w:tc>
+          <w:tcPr>
+            <w:tcW w:w="2485" w:type="dxa"/>
           </w:tcPr>
           <w:p>
             <w:pPr>
@@ -15103,13 +15869,13 @@
               <w:rPr>
                 <w:sz w:val="17"/>
               </w:rPr>
-              <w:t xml:space="preserve">0.13 [0.04, 0.21]</w:t>
-            </w:r>
-          </w:p>
-        </w:tc>
-        <w:tc>
-          <w:tcPr>
-            <w:tcW w:w="2791" w:type="dxa"/>
+              <w:t xml:space="preserve">0.14 [-0.06, 0.34]</w:t>
+            </w:r>
+          </w:p>
+        </w:tc>
+        <w:tc>
+          <w:tcPr>
+            <w:tcW w:w="2485" w:type="dxa"/>
           </w:tcPr>
           <w:p>
             <w:pPr>
@@ -15121,7 +15887,7 @@
               <w:rPr>
                 <w:sz w:val="17"/>
               </w:rPr>
-              <w:t xml:space="preserve">0.32 [0.24, 0.39]</w:t>
+              <w:t xml:space="preserve">0.48 [0.29, 0.62]</w:t>
             </w:r>
           </w:p>
         </w:tc>
@@ -15132,7 +15898,7 @@
         </w:trPr>
         <w:tc>
           <w:tcPr>
-            <w:tcW w:w="3488" w:type="dxa"/>
+            <w:tcW w:w="3106" w:type="dxa"/>
           </w:tcPr>
           <w:p>
             <w:pPr>
@@ -15150,7 +15916,25 @@
         </w:tc>
         <w:tc>
           <w:tcPr>
-            <w:tcW w:w="2791" w:type="dxa"/>
+            <w:tcW w:w="994" w:type="dxa"/>
+          </w:tcPr>
+          <w:p>
+            <w:pPr>
+              <w:pStyle w:val="Compact"/>
+              <w:keepLines/>
+              <w:jc w:val="right"/>
+            </w:pPr>
+            <w:r>
+              <w:rPr>
+                <w:sz w:val="17"/>
+              </w:rPr>
+              <w:t xml:space="preserve">33</w:t>
+            </w:r>
+          </w:p>
+        </w:tc>
+        <w:tc>
+          <w:tcPr>
+            <w:tcW w:w="2485" w:type="dxa"/>
           </w:tcPr>
           <w:p>
             <w:pPr>
@@ -15162,13 +15946,13 @@
               <w:rPr>
                 <w:sz w:val="17"/>
               </w:rPr>
-              <w:t xml:space="preserve">0.12 [-0.07, 0.33]</w:t>
-            </w:r>
-          </w:p>
-        </w:tc>
-        <w:tc>
-          <w:tcPr>
-            <w:tcW w:w="2791" w:type="dxa"/>
+              <w:t xml:space="preserve">0.11 [-0.28, 0.47]</w:t>
+            </w:r>
+          </w:p>
+        </w:tc>
+        <w:tc>
+          <w:tcPr>
+            <w:tcW w:w="2485" w:type="dxa"/>
           </w:tcPr>
           <w:p>
             <w:pPr>
@@ -15180,7 +15964,7 @@
               <w:rPr>
                 <w:sz w:val="17"/>
               </w:rPr>
-              <w:t xml:space="preserve">0.50 [0.32, 0.64]</w:t>
+              <w:t xml:space="preserve">0.53 [0.22, 0.77]</w:t>
             </w:r>
           </w:p>
         </w:tc>
@@ -15191,7 +15975,7 @@
         </w:trPr>
         <w:tc>
           <w:tcPr>
-            <w:tcW w:w="3488" w:type="dxa"/>
+            <w:tcW w:w="3106" w:type="dxa"/>
           </w:tcPr>
           <w:p>
             <w:pPr>
@@ -15209,7 +15993,25 @@
         </w:tc>
         <w:tc>
           <w:tcPr>
-            <w:tcW w:w="2791" w:type="dxa"/>
+            <w:tcW w:w="994" w:type="dxa"/>
+          </w:tcPr>
+          <w:p>
+            <w:pPr>
+              <w:pStyle w:val="Compact"/>
+              <w:keepLines/>
+              <w:jc w:val="right"/>
+            </w:pPr>
+            <w:r>
+              <w:rPr>
+                <w:sz w:val="17"/>
+              </w:rPr>
+              <w:t xml:space="preserve">652</w:t>
+            </w:r>
+          </w:p>
+        </w:tc>
+        <w:tc>
+          <w:tcPr>
+            <w:tcW w:w="2485" w:type="dxa"/>
           </w:tcPr>
           <w:p>
             <w:pPr>
@@ -15221,13 +16023,13 @@
               <w:rPr>
                 <w:sz w:val="17"/>
               </w:rPr>
-              <w:t xml:space="preserve">0.39 [0.35, 0.42]</w:t>
-            </w:r>
-          </w:p>
-        </w:tc>
-        <w:tc>
-          <w:tcPr>
-            <w:tcW w:w="2791" w:type="dxa"/>
+              <w:t xml:space="preserve">0.39 [0.32, 0.46]</w:t>
+            </w:r>
+          </w:p>
+        </w:tc>
+        <w:tc>
+          <w:tcPr>
+            <w:tcW w:w="2485" w:type="dxa"/>
           </w:tcPr>
           <w:p>
             <w:pPr>
@@ -15239,7 +16041,7 @@
               <w:rPr>
                 <w:sz w:val="17"/>
               </w:rPr>
-              <w:t xml:space="preserve">0.61 [0.58, 0.63]</w:t>
+              <w:t xml:space="preserve">0.61 [0.57, 0.66]</w:t>
             </w:r>
           </w:p>
         </w:tc>
@@ -15255,20 +16057,20 @@
       <w:r>
         <w:drawing>
           <wp:inline>
-            <wp:extent cx="5753100" cy="1944454"/>
+            <wp:extent cx="5753100" cy="1963006"/>
             <wp:effectExtent b="0" l="0" r="0" t="0"/>
-            <wp:docPr descr="Fig. 5. Learned residual scale σ(x) against the group’s mean absolute error on test rows, by setting. Each point is a group in one outer fold." title="" id="47" name="Picture"/>
+            <wp:docPr descr="Fig. 5. Learned residual scale σ(x) against the group’s mean absolute error on test rows, by setting. Each point is a group (mean over seeds and folds)." title="" id="49" name="Picture"/>
             <a:graphic>
               <a:graphicData uri="http://schemas.openxmlformats.org/drawingml/2006/picture">
                 <pic:pic>
                   <pic:nvPicPr>
-                    <pic:cNvPr descr="../figures/fig06_applicability.png" id="48" name="Picture"/>
+                    <pic:cNvPr descr="../figures/fig06_applicability.png" id="50" name="Picture"/>
                     <pic:cNvPicPr>
                       <a:picLocks noChangeArrowheads="1" noChangeAspect="1"/>
                     </pic:cNvPicPr>
                   </pic:nvPicPr>
                   <pic:blipFill>
-                    <a:blip r:embed="rId46"/>
+                    <a:blip r:embed="rId48"/>
                     <a:stretch>
                       <a:fillRect/>
                     </a:stretch>
@@ -15276,7 +16078,7 @@
                   <pic:spPr bwMode="auto">
                     <a:xfrm>
                       <a:off x="0" y="0"/>
-                      <a:ext cx="5753100" cy="1944454"/>
+                      <a:ext cx="5753100" cy="1963006"/>
                     </a:xfrm>
                     <a:prstGeom prst="rect">
                       <a:avLst/>
@@ -15300,11 +16102,11 @@
         <w:pStyle w:val="ImageCaption"/>
       </w:pPr>
       <w:r>
-        <w:t xml:space="preserve">Fig. 5. Learned residual scale σ(x) against the group’s mean absolute error on test rows, by setting. Each point is a group in one outer fold.</w:t>
+        <w:t xml:space="preserve">Fig. 5. Learned residual scale σ(x) against the group’s mean absolute error on test rows, by setting. Each point is a group (mean over seeds and folds).</w:t>
       </w:r>
     </w:p>
-    <w:bookmarkEnd w:id="49"/>
-    <w:bookmarkStart w:id="53" w:name="what-a-few-local-labels-buy"/>
+    <w:bookmarkEnd w:id="51"/>
+    <w:bookmarkStart w:id="55" w:name="what-a-few-local-labels-buy"/>
     <w:p>
       <w:pPr>
         <w:pStyle w:val="Heading2"/>
@@ -15327,7 +16129,7 @@
         <w:pStyle w:val="FirstParagraph"/>
       </w:pPr>
       <w:r>
-        <w:t xml:space="preserve">Table 12 and Fig. 6 show the effect of labelled local rows. On FAO, five rows per country reduce the interval width from 2.21 to 1.95 (12%) at unchanged coverage (0.894), and twenty rows to 1.94; the RMSE after the shift falls from 0.677 to 0.592. On the Indian districts the effect is small: width 1.95 at five rows and 1.88 at twenty (4%), RMSE from 0.697 to 0.671. The share of groups below 80% coverage moves little (0.195 to 0.167 on FAO and 0.115 to 0.109 on India), so local labels sharpen the intervals but do not repair the heterogeneity across groups. The largest relative gain comes from the first few rows, in line with the shrinkage form</w:t>
+        <w:t xml:space="preserve">Table 14 and Fig. 6 show the effect of labelled local rows. On FAO, five rows per country reduce the interval width from 2.21 to 1.95 (12%) at unchanged coverage (0.894), and twenty rows to 1.94; the RMSE after the shift falls from 0.677 to 0.592. On the Indian districts the effect is small: width 1.95 at five rows and 1.88 at twenty (4%), RMSE from 0.697 to 0.671. The share of groups below 80% coverage moves little (0.195 to 0.167 on FAO and 0.115 to 0.109 on India), so local labels sharpen the intervals but do not repair the heterogeneity across groups. The largest relative gain comes from the first few rows, in line with the shrinkage form</w:t>
       </w:r>
       <w:r>
         <w:t xml:space="preserve"> </w:t>
@@ -15386,18 +16188,18 @@
           <wp:inline>
             <wp:extent cx="4754880" cy="1897769"/>
             <wp:effectExtent b="0" l="0" r="0" t="0"/>
-            <wp:docPr descr="Fig. 6. Effect of m labelled local rows per test group on (a) interval width and (b) RMSE after the local shift, nominal 90%." title="" id="51" name="Picture"/>
+            <wp:docPr descr="Fig. 6. Effect of m labelled local rows per test group on (a) interval width and (b) RMSE after the local shift, nominal 90%." title="" id="53" name="Picture"/>
             <a:graphic>
               <a:graphicData uri="http://schemas.openxmlformats.org/drawingml/2006/picture">
                 <pic:pic>
                   <pic:nvPicPr>
-                    <pic:cNvPr descr="../figures/fig07_local.png" id="52" name="Picture"/>
+                    <pic:cNvPr descr="../figures/fig07_local.png" id="54" name="Picture"/>
                     <pic:cNvPicPr>
                       <a:picLocks noChangeArrowheads="1" noChangeAspect="1"/>
                     </pic:cNvPicPr>
                   </pic:nvPicPr>
                   <pic:blipFill>
-                    <a:blip r:embed="rId50"/>
+                    <a:blip r:embed="rId52"/>
                     <a:stretch>
                       <a:fillRect/>
                     </a:stretch>
@@ -15437,7 +16239,7 @@
         <w:pStyle w:val="TableCaption"/>
       </w:pPr>
       <w:r>
-        <w:t xml:space="preserve">Table 12. Effect of m labelled local rows per test group (nominal 90%; mean over seeds and folds).</w:t>
+        <w:t xml:space="preserve">Table 14. Effect of m labelled local rows per test group (nominal 90%; mean over seeds and folds).</w:t>
       </w:r>
     </w:p>
     <w:tbl>
@@ -15460,7 +16262,7 @@
           <w:right w:w="60" w:type="dxa"/>
         </w:tblCellMar>
         <w:tblLook w:firstRow="1" w:lastRow="0" w:firstColumn="0" w:lastColumn="0" w:noHBand="0" w:noVBand="0" w:val="0020"/>
-        <w:tblCaption w:val="Table 12. Effect of m labelled local rows per test group (nominal 90%; mean over seeds and folds)."/>
+        <w:tblCaption w:val="Table 14. Effect of m labelled local rows per test group (nominal 90%; mean over seeds and folds)."/>
       </w:tblPr>
       <w:tblGrid>
         <w:gridCol w:w="1752"/>
@@ -16966,8 +17768,8 @@
         </w:tc>
       </w:tr>
     </w:tbl>
-    <w:bookmarkEnd w:id="53"/>
-    <w:bookmarkStart w:id="54" w:name="checks"/>
+    <w:bookmarkEnd w:id="55"/>
+    <w:bookmarkStart w:id="59" w:name="X40dc2d1b7e0c60fbe14252d8a9f7e61d87ba034"/>
     <w:p>
       <w:pPr>
         <w:pStyle w:val="Heading2"/>
@@ -16982,7 +17784,7 @@
         <w:tab/>
       </w:r>
       <w:r>
-        <w:t xml:space="preserve">Checks</w:t>
+        <w:t xml:space="preserve">What the covariates add: place lookups and fingerprint-free features</w:t>
       </w:r>
     </w:p>
     <w:p>
@@ -16990,12 +17792,1103 @@
         <w:pStyle w:val="FirstParagraph"/>
       </w:pPr>
       <w:r>
-        <w:t xml:space="preserve">The group shuffle used by the split generator was corrected during the study (shuffling a pandas string array in place); we reran the FAO group-held-out point-accuracy and the first conformal experiments and the results were unchanged to the reported precision; the later experiments were run with the corrected code. Conformal coverage was measured on distinct FAO records only: with raw duplicated rows the same intervals would be scored on a pool in which heavily duplicated countries dominate, and we did not study that case. Gradient boosting in the conformal experiments uses default settings; the tuned variant was used in the point-accuracy comparison only.</w:t>
+        <w:t xml:space="preserve">Table 15 and Fig. 7 separate what the covariates contribute from what the random split rewards. A country–crop lookup, the mean log-yield of the country and crop in the training rows with no covariates at all, scores R² = 0.932 on random rows and 0.893 forward in time (RMSE 0.293 and 0.369). Default gradient boosting scores 0.918 and 0.897 (RMSE 0.323 and 0.362), tuned gradient boosting 0.931 and 0.907, and random forest 0.952 and 0.924. Most of the apparent skill of the flexible models on random and forward splits is therefore what a table of past yields for the place provides, and only random forest clearly exceeds it on random rows. On held-out countries the lookup is unavailable and falls back to the crop mean (R² 0.566).</w:t>
       </w:r>
     </w:p>
-    <w:bookmarkEnd w:id="54"/>
-    <w:bookmarkEnd w:id="55"/>
-    <w:bookmarkStart w:id="60" w:name="discussion"/>
+    <w:p>
+      <w:pPr>
+        <w:pStyle w:val="BodyText"/>
+      </w:pPr>
+      <w:r>
+        <w:t xml:space="preserve">The anomaly features, which carry no country level, do contain real within-country information. Adding a gradient boosting model on the anomalies and year to the lookup lowers RMSE from 0.293 to 0.262 on random rows (−11%) and from 0.369 to 0.337 forward in time (−9%), so temperature and pesticide anomalies help within a country. On held-out countries the same combination is at the crop-mean level (R² 0.572 against 0.566), and the anomaly models alone score 0.570 (gradient boosting) and 0.573 (ridge): no cross-country skill is added.</w:t>
+      </w:r>
+    </w:p>
+    <w:p>
+      <w:pPr>
+        <w:pStyle w:val="TableCaption"/>
+      </w:pPr>
+      <w:r>
+        <w:t xml:space="preserve">Table 15. Place lookups and fingerprint-free features on the FAO file (distinct records). Upper block: RMSE of log-yield (R² in brackets) by protocol. Lower block: conformal coverage on unseen countries at nominal 90% with each feature set (gradient boosting).</w:t>
+      </w:r>
+    </w:p>
+    <w:tbl>
+      <w:tblPr>
+        <w:tblStyle w:val="Table"/>
+        <w:tblW w:w="9071" w:type="dxa"/>
+        <w:tblBorders>
+          <w:top w:val="single" w:sz="12" w:space="0" w:color="000000"/>
+          <w:left w:val="nil"/>
+          <w:bottom w:val="single" w:sz="12" w:space="0" w:color="000000"/>
+          <w:right w:val="nil"/>
+          <w:insideH w:val="nil"/>
+          <w:insideV w:val="nil"/>
+        </w:tblBorders>
+        <w:tblLayout w:type="fixed"/>
+        <w:tblCellMar>
+          <w:top w:w="20" w:type="dxa"/>
+          <w:left w:w="60" w:type="dxa"/>
+          <w:bottom w:w="20" w:type="dxa"/>
+          <w:right w:w="60" w:type="dxa"/>
+        </w:tblCellMar>
+        <w:tblLook w:firstRow="1" w:lastRow="0" w:firstColumn="0" w:lastColumn="0" w:noHBand="0" w:noVBand="0" w:val="0020"/>
+        <w:tblCaption w:val="Table 15. Place lookups and fingerprint-free features on the FAO file (distinct records). Upper block: RMSE of log-yield (R² in brackets) by protocol. Lower block: conformal coverage on unseen countries at nominal 90% with each feature set (gradient boosting)."/>
+      </w:tblPr>
+      <w:tblGrid>
+        <w:gridCol w:w="3256"/>
+        <w:gridCol w:w="1744"/>
+        <w:gridCol w:w="1977"/>
+        <w:gridCol w:w="2093"/>
+      </w:tblGrid>
+      <w:tr>
+        <w:trPr>
+          <w:cantSplit w:val="true"/>
+          <w:tblHeader w:val="on"/>
+          <w:tblHeader w:val="true"/>
+        </w:trPr>
+        <w:tc>
+          <w:tcPr>
+            <w:tcW w:w="3256" w:type="dxa"/>
+            <w:tcBorders>
+              <w:bottom w:val="single" w:sz="6" w:space="0" w:color="000000"/>
+            </w:tcBorders>
+          </w:tcPr>
+          <w:p>
+            <w:pPr>
+              <w:pStyle w:val="Compact"/>
+              <w:keepLines/>
+              <w:jc w:val="left"/>
+            </w:pPr>
+            <w:r>
+              <w:rPr>
+                <w:b/>
+                <w:sz w:val="17"/>
+              </w:rPr>
+              <w:t xml:space="preserve">Model</w:t>
+            </w:r>
+          </w:p>
+        </w:tc>
+        <w:tc>
+          <w:tcPr>
+            <w:tcW w:w="1744" w:type="dxa"/>
+            <w:tcBorders>
+              <w:bottom w:val="single" w:sz="6" w:space="0" w:color="000000"/>
+            </w:tcBorders>
+          </w:tcPr>
+          <w:p>
+            <w:pPr>
+              <w:pStyle w:val="Compact"/>
+              <w:keepLines/>
+              <w:jc w:val="left"/>
+            </w:pPr>
+            <w:r>
+              <w:rPr>
+                <w:b/>
+                <w:sz w:val="17"/>
+              </w:rPr>
+              <w:t xml:space="preserve">Random</w:t>
+            </w:r>
+          </w:p>
+        </w:tc>
+        <w:tc>
+          <w:tcPr>
+            <w:tcW w:w="1977" w:type="dxa"/>
+            <w:tcBorders>
+              <w:bottom w:val="single" w:sz="6" w:space="0" w:color="000000"/>
+            </w:tcBorders>
+          </w:tcPr>
+          <w:p>
+            <w:pPr>
+              <w:pStyle w:val="Compact"/>
+              <w:keepLines/>
+              <w:jc w:val="left"/>
+            </w:pPr>
+            <w:r>
+              <w:rPr>
+                <w:b/>
+                <w:sz w:val="17"/>
+              </w:rPr>
+              <w:t xml:space="preserve">Forward in time</w:t>
+            </w:r>
+          </w:p>
+        </w:tc>
+        <w:tc>
+          <w:tcPr>
+            <w:tcW w:w="2093" w:type="dxa"/>
+            <w:tcBorders>
+              <w:bottom w:val="single" w:sz="6" w:space="0" w:color="000000"/>
+            </w:tcBorders>
+          </w:tcPr>
+          <w:p>
+            <w:pPr>
+              <w:pStyle w:val="Compact"/>
+              <w:keepLines/>
+              <w:jc w:val="left"/>
+            </w:pPr>
+            <w:r>
+              <w:rPr>
+                <w:b/>
+                <w:sz w:val="17"/>
+              </w:rPr>
+              <w:t xml:space="preserve">Country held out</w:t>
+            </w:r>
+          </w:p>
+        </w:tc>
+      </w:tr>
+      <w:tr>
+        <w:trPr>
+          <w:cantSplit w:val="true"/>
+        </w:trPr>
+        <w:tc>
+          <w:tcPr>
+            <w:tcW w:w="3256" w:type="dxa"/>
+          </w:tcPr>
+          <w:p>
+            <w:pPr>
+              <w:pStyle w:val="Compact"/>
+              <w:keepLines/>
+              <w:jc w:val="left"/>
+            </w:pPr>
+            <w:r>
+              <w:rPr>
+                <w:sz w:val="17"/>
+              </w:rPr>
+              <w:t xml:space="preserve">Crop mean</w:t>
+            </w:r>
+          </w:p>
+        </w:tc>
+        <w:tc>
+          <w:tcPr>
+            <w:tcW w:w="1744" w:type="dxa"/>
+          </w:tcPr>
+          <w:p>
+            <w:pPr>
+              <w:pStyle w:val="Compact"/>
+              <w:keepLines/>
+              <w:jc w:val="left"/>
+            </w:pPr>
+            <w:r>
+              <w:rPr>
+                <w:sz w:val="17"/>
+              </w:rPr>
+              <w:t xml:space="preserve">0.731 (0.580)</w:t>
+            </w:r>
+          </w:p>
+        </w:tc>
+        <w:tc>
+          <w:tcPr>
+            <w:tcW w:w="1977" w:type="dxa"/>
+          </w:tcPr>
+          <w:p>
+            <w:pPr>
+              <w:pStyle w:val="Compact"/>
+              <w:keepLines/>
+              <w:jc w:val="left"/>
+            </w:pPr>
+            <w:r>
+              <w:rPr>
+                <w:sz w:val="17"/>
+              </w:rPr>
+              <w:t xml:space="preserve">0.749 (0.560)</w:t>
+            </w:r>
+          </w:p>
+        </w:tc>
+        <w:tc>
+          <w:tcPr>
+            <w:tcW w:w="2093" w:type="dxa"/>
+          </w:tcPr>
+          <w:p>
+            <w:pPr>
+              <w:pStyle w:val="Compact"/>
+              <w:keepLines/>
+              <w:jc w:val="left"/>
+            </w:pPr>
+            <w:r>
+              <w:rPr>
+                <w:sz w:val="17"/>
+              </w:rPr>
+              <w:t xml:space="preserve">0.739 (0.566)</w:t>
+            </w:r>
+          </w:p>
+        </w:tc>
+      </w:tr>
+      <w:tr>
+        <w:trPr>
+          <w:cantSplit w:val="true"/>
+        </w:trPr>
+        <w:tc>
+          <w:tcPr>
+            <w:tcW w:w="3256" w:type="dxa"/>
+          </w:tcPr>
+          <w:p>
+            <w:pPr>
+              <w:pStyle w:val="Compact"/>
+              <w:keepLines/>
+              <w:jc w:val="left"/>
+            </w:pPr>
+            <w:r>
+              <w:rPr>
+                <w:sz w:val="17"/>
+              </w:rPr>
+              <w:t xml:space="preserve">Country–crop mean (lookup)</w:t>
+            </w:r>
+          </w:p>
+        </w:tc>
+        <w:tc>
+          <w:tcPr>
+            <w:tcW w:w="1744" w:type="dxa"/>
+          </w:tcPr>
+          <w:p>
+            <w:pPr>
+              <w:pStyle w:val="Compact"/>
+              <w:keepLines/>
+              <w:jc w:val="left"/>
+            </w:pPr>
+            <w:r>
+              <w:rPr>
+                <w:sz w:val="17"/>
+              </w:rPr>
+              <w:t xml:space="preserve">0.293 (0.932)</w:t>
+            </w:r>
+          </w:p>
+        </w:tc>
+        <w:tc>
+          <w:tcPr>
+            <w:tcW w:w="1977" w:type="dxa"/>
+          </w:tcPr>
+          <w:p>
+            <w:pPr>
+              <w:pStyle w:val="Compact"/>
+              <w:keepLines/>
+              <w:jc w:val="left"/>
+            </w:pPr>
+            <w:r>
+              <w:rPr>
+                <w:sz w:val="17"/>
+              </w:rPr>
+              <w:t xml:space="preserve">0.369 (0.893)</w:t>
+            </w:r>
+          </w:p>
+        </w:tc>
+        <w:tc>
+          <w:tcPr>
+            <w:tcW w:w="2093" w:type="dxa"/>
+          </w:tcPr>
+          <w:p>
+            <w:pPr>
+              <w:pStyle w:val="Compact"/>
+              <w:keepLines/>
+              <w:jc w:val="left"/>
+            </w:pPr>
+            <w:r>
+              <w:rPr>
+                <w:sz w:val="17"/>
+              </w:rPr>
+              <w:t xml:space="preserve">0.739 (0.566)</w:t>
+            </w:r>
+          </w:p>
+        </w:tc>
+      </w:tr>
+      <w:tr>
+        <w:trPr>
+          <w:cantSplit w:val="true"/>
+        </w:trPr>
+        <w:tc>
+          <w:tcPr>
+            <w:tcW w:w="3256" w:type="dxa"/>
+          </w:tcPr>
+          <w:p>
+            <w:pPr>
+              <w:pStyle w:val="Compact"/>
+              <w:keepLines/>
+              <w:jc w:val="left"/>
+            </w:pPr>
+            <w:r>
+              <w:rPr>
+                <w:sz w:val="17"/>
+              </w:rPr>
+              <w:t xml:space="preserve">Ridge, anomaly features</w:t>
+            </w:r>
+          </w:p>
+        </w:tc>
+        <w:tc>
+          <w:tcPr>
+            <w:tcW w:w="1744" w:type="dxa"/>
+          </w:tcPr>
+          <w:p>
+            <w:pPr>
+              <w:pStyle w:val="Compact"/>
+              <w:keepLines/>
+              <w:jc w:val="left"/>
+            </w:pPr>
+            <w:r>
+              <w:rPr>
+                <w:sz w:val="17"/>
+              </w:rPr>
+              <w:t xml:space="preserve">0.724 (0.587)</w:t>
+            </w:r>
+          </w:p>
+        </w:tc>
+        <w:tc>
+          <w:tcPr>
+            <w:tcW w:w="1977" w:type="dxa"/>
+          </w:tcPr>
+          <w:p>
+            <w:pPr>
+              <w:pStyle w:val="Compact"/>
+              <w:keepLines/>
+              <w:jc w:val="left"/>
+            </w:pPr>
+            <w:r>
+              <w:rPr>
+                <w:sz w:val="17"/>
+              </w:rPr>
+              <w:t xml:space="preserve">0.737 (0.574)</w:t>
+            </w:r>
+          </w:p>
+        </w:tc>
+        <w:tc>
+          <w:tcPr>
+            <w:tcW w:w="2093" w:type="dxa"/>
+          </w:tcPr>
+          <w:p>
+            <w:pPr>
+              <w:pStyle w:val="Compact"/>
+              <w:keepLines/>
+              <w:jc w:val="left"/>
+            </w:pPr>
+            <w:r>
+              <w:rPr>
+                <w:sz w:val="17"/>
+              </w:rPr>
+              <w:t xml:space="preserve">0.733 (0.573)</w:t>
+            </w:r>
+          </w:p>
+        </w:tc>
+      </w:tr>
+      <w:tr>
+        <w:trPr>
+          <w:cantSplit w:val="true"/>
+        </w:trPr>
+        <w:tc>
+          <w:tcPr>
+            <w:tcW w:w="3256" w:type="dxa"/>
+          </w:tcPr>
+          <w:p>
+            <w:pPr>
+              <w:pStyle w:val="Compact"/>
+              <w:keepLines/>
+              <w:jc w:val="left"/>
+            </w:pPr>
+            <w:r>
+              <w:rPr>
+                <w:sz w:val="17"/>
+              </w:rPr>
+              <w:t xml:space="preserve">GBM, anomaly features</w:t>
+            </w:r>
+          </w:p>
+        </w:tc>
+        <w:tc>
+          <w:tcPr>
+            <w:tcW w:w="1744" w:type="dxa"/>
+          </w:tcPr>
+          <w:p>
+            <w:pPr>
+              <w:pStyle w:val="Compact"/>
+              <w:keepLines/>
+              <w:jc w:val="left"/>
+            </w:pPr>
+            <w:r>
+              <w:rPr>
+                <w:sz w:val="17"/>
+              </w:rPr>
+              <w:t xml:space="preserve">0.609 (0.708)</w:t>
+            </w:r>
+          </w:p>
+        </w:tc>
+        <w:tc>
+          <w:tcPr>
+            <w:tcW w:w="1977" w:type="dxa"/>
+          </w:tcPr>
+          <w:p>
+            <w:pPr>
+              <w:pStyle w:val="Compact"/>
+              <w:keepLines/>
+              <w:jc w:val="left"/>
+            </w:pPr>
+            <w:r>
+              <w:rPr>
+                <w:sz w:val="17"/>
+              </w:rPr>
+              <w:t xml:space="preserve">0.688 (0.629)</w:t>
+            </w:r>
+          </w:p>
+        </w:tc>
+        <w:tc>
+          <w:tcPr>
+            <w:tcW w:w="2093" w:type="dxa"/>
+          </w:tcPr>
+          <w:p>
+            <w:pPr>
+              <w:pStyle w:val="Compact"/>
+              <w:keepLines/>
+              <w:jc w:val="left"/>
+            </w:pPr>
+            <w:r>
+              <w:rPr>
+                <w:sz w:val="17"/>
+              </w:rPr>
+              <w:t xml:space="preserve">0.736 (0.570)</w:t>
+            </w:r>
+          </w:p>
+        </w:tc>
+      </w:tr>
+      <w:tr>
+        <w:trPr>
+          <w:cantSplit w:val="true"/>
+        </w:trPr>
+        <w:tc>
+          <w:tcPr>
+            <w:tcW w:w="3256" w:type="dxa"/>
+          </w:tcPr>
+          <w:p>
+            <w:pPr>
+              <w:pStyle w:val="Compact"/>
+              <w:keepLines/>
+              <w:jc w:val="left"/>
+            </w:pPr>
+            <w:r>
+              <w:rPr>
+                <w:sz w:val="17"/>
+              </w:rPr>
+              <w:t xml:space="preserve">GBM, full features</w:t>
+            </w:r>
+          </w:p>
+        </w:tc>
+        <w:tc>
+          <w:tcPr>
+            <w:tcW w:w="1744" w:type="dxa"/>
+          </w:tcPr>
+          <w:p>
+            <w:pPr>
+              <w:pStyle w:val="Compact"/>
+              <w:keepLines/>
+              <w:jc w:val="left"/>
+            </w:pPr>
+            <w:r>
+              <w:rPr>
+                <w:sz w:val="17"/>
+              </w:rPr>
+              <w:t xml:space="preserve">0.323 (0.918)</w:t>
+            </w:r>
+          </w:p>
+        </w:tc>
+        <w:tc>
+          <w:tcPr>
+            <w:tcW w:w="1977" w:type="dxa"/>
+          </w:tcPr>
+          <w:p>
+            <w:pPr>
+              <w:pStyle w:val="Compact"/>
+              <w:keepLines/>
+              <w:jc w:val="left"/>
+            </w:pPr>
+            <w:r>
+              <w:rPr>
+                <w:sz w:val="17"/>
+              </w:rPr>
+              <w:t xml:space="preserve">0.362 (0.897)</w:t>
+            </w:r>
+          </w:p>
+        </w:tc>
+        <w:tc>
+          <w:tcPr>
+            <w:tcW w:w="2093" w:type="dxa"/>
+          </w:tcPr>
+          <w:p>
+            <w:pPr>
+              <w:pStyle w:val="Compact"/>
+              <w:keepLines/>
+              <w:jc w:val="left"/>
+            </w:pPr>
+            <w:r>
+              <w:rPr>
+                <w:sz w:val="17"/>
+              </w:rPr>
+              <w:t xml:space="preserve">0.670 (0.643)</w:t>
+            </w:r>
+          </w:p>
+        </w:tc>
+      </w:tr>
+      <w:tr>
+        <w:trPr>
+          <w:cantSplit w:val="true"/>
+        </w:trPr>
+        <w:tc>
+          <w:tcPr>
+            <w:tcW w:w="3256" w:type="dxa"/>
+          </w:tcPr>
+          <w:p>
+            <w:pPr>
+              <w:pStyle w:val="Compact"/>
+              <w:keepLines/>
+              <w:jc w:val="left"/>
+            </w:pPr>
+            <w:r>
+              <w:rPr>
+                <w:sz w:val="17"/>
+              </w:rPr>
+              <w:t xml:space="preserve">Lookup + GBM on anomalies</w:t>
+            </w:r>
+          </w:p>
+        </w:tc>
+        <w:tc>
+          <w:tcPr>
+            <w:tcW w:w="1744" w:type="dxa"/>
+          </w:tcPr>
+          <w:p>
+            <w:pPr>
+              <w:pStyle w:val="Compact"/>
+              <w:keepLines/>
+              <w:jc w:val="left"/>
+            </w:pPr>
+            <w:r>
+              <w:rPr>
+                <w:sz w:val="17"/>
+              </w:rPr>
+              <w:t xml:space="preserve">0.262 (0.946)</w:t>
+            </w:r>
+          </w:p>
+        </w:tc>
+        <w:tc>
+          <w:tcPr>
+            <w:tcW w:w="1977" w:type="dxa"/>
+          </w:tcPr>
+          <w:p>
+            <w:pPr>
+              <w:pStyle w:val="Compact"/>
+              <w:keepLines/>
+              <w:jc w:val="left"/>
+            </w:pPr>
+            <w:r>
+              <w:rPr>
+                <w:sz w:val="17"/>
+              </w:rPr>
+              <w:t xml:space="preserve">0.337 (0.911)</w:t>
+            </w:r>
+          </w:p>
+        </w:tc>
+        <w:tc>
+          <w:tcPr>
+            <w:tcW w:w="2093" w:type="dxa"/>
+          </w:tcPr>
+          <w:p>
+            <w:pPr>
+              <w:pStyle w:val="Compact"/>
+              <w:keepLines/>
+              <w:jc w:val="left"/>
+            </w:pPr>
+            <w:r>
+              <w:rPr>
+                <w:sz w:val="17"/>
+              </w:rPr>
+              <w:t xml:space="preserve">0.734 (0.572)</w:t>
+            </w:r>
+          </w:p>
+        </w:tc>
+      </w:tr>
+    </w:tbl>
+    <w:p/>
+    <w:tbl>
+      <w:tblPr>
+        <w:tblStyle w:val="Table"/>
+        <w:tblW w:w="9071" w:type="dxa"/>
+        <w:tblBorders>
+          <w:top w:val="single" w:sz="12" w:space="0" w:color="000000"/>
+          <w:left w:val="nil"/>
+          <w:bottom w:val="single" w:sz="12" w:space="0" w:color="000000"/>
+          <w:right w:val="nil"/>
+          <w:insideH w:val="nil"/>
+          <w:insideV w:val="nil"/>
+        </w:tblBorders>
+        <w:tblLayout w:type="fixed"/>
+        <w:tblCellMar>
+          <w:top w:w="20" w:type="dxa"/>
+          <w:left w:w="60" w:type="dxa"/>
+          <w:bottom w:w="20" w:type="dxa"/>
+          <w:right w:w="60" w:type="dxa"/>
+        </w:tblCellMar>
+        <w:tblLook w:firstRow="1" w:lastRow="0" w:firstColumn="0" w:lastColumn="0" w:noHBand="0" w:noVBand="0" w:val="0020"/>
+      </w:tblPr>
+      <w:tblGrid>
+        <w:gridCol w:w="1042"/>
+        <w:gridCol w:w="1981"/>
+        <w:gridCol w:w="1668"/>
+        <w:gridCol w:w="1668"/>
+        <w:gridCol w:w="1355"/>
+        <w:gridCol w:w="1355"/>
+      </w:tblGrid>
+      <w:tr>
+        <w:trPr>
+          <w:cantSplit w:val="true"/>
+          <w:tblHeader w:val="on"/>
+          <w:tblHeader w:val="true"/>
+        </w:trPr>
+        <w:tc>
+          <w:tcPr>
+            <w:tcW w:w="1042" w:type="dxa"/>
+            <w:tcBorders>
+              <w:bottom w:val="single" w:sz="6" w:space="0" w:color="000000"/>
+            </w:tcBorders>
+          </w:tcPr>
+          <w:p>
+            <w:pPr>
+              <w:pStyle w:val="Compact"/>
+              <w:keepLines/>
+              <w:jc w:val="left"/>
+            </w:pPr>
+            <w:r>
+              <w:rPr>
+                <w:b/>
+                <w:sz w:val="17"/>
+              </w:rPr>
+              <w:t xml:space="preserve">Features</w:t>
+            </w:r>
+          </w:p>
+        </w:tc>
+        <w:tc>
+          <w:tcPr>
+            <w:tcW w:w="1981" w:type="dxa"/>
+            <w:tcBorders>
+              <w:bottom w:val="single" w:sz="6" w:space="0" w:color="000000"/>
+            </w:tcBorders>
+          </w:tcPr>
+          <w:p>
+            <w:pPr>
+              <w:pStyle w:val="Compact"/>
+              <w:keepLines/>
+              <w:jc w:val="right"/>
+            </w:pPr>
+            <w:r>
+              <w:rPr>
+                <w:b/>
+                <w:sz w:val="17"/>
+              </w:rPr>
+              <w:t xml:space="preserve">Group-ID accuracy</w:t>
+            </w:r>
+          </w:p>
+        </w:tc>
+        <w:tc>
+          <w:tcPr>
+            <w:tcW w:w="1668" w:type="dxa"/>
+            <w:tcBorders>
+              <w:bottom w:val="single" w:sz="6" w:space="0" w:color="000000"/>
+            </w:tcBorders>
+          </w:tcPr>
+          <w:p>
+            <w:pPr>
+              <w:pStyle w:val="Compact"/>
+              <w:keepLines/>
+              <w:jc w:val="right"/>
+            </w:pPr>
+            <w:r>
+              <w:rPr>
+                <w:b/>
+                <w:sz w:val="17"/>
+              </w:rPr>
+              <w:t xml:space="preserve">Naive coverage</w:t>
+            </w:r>
+          </w:p>
+        </w:tc>
+        <w:tc>
+          <w:tcPr>
+            <w:tcW w:w="1668" w:type="dxa"/>
+            <w:tcBorders>
+              <w:bottom w:val="single" w:sz="6" w:space="0" w:color="000000"/>
+            </w:tcBorders>
+          </w:tcPr>
+          <w:p>
+            <w:pPr>
+              <w:pStyle w:val="Compact"/>
+              <w:keepLines/>
+              <w:jc w:val="right"/>
+            </w:pPr>
+            <w:r>
+              <w:rPr>
+                <w:b/>
+                <w:sz w:val="17"/>
+              </w:rPr>
+              <w:t xml:space="preserve">Group coverage</w:t>
+            </w:r>
+          </w:p>
+        </w:tc>
+        <w:tc>
+          <w:tcPr>
+            <w:tcW w:w="1355" w:type="dxa"/>
+            <w:tcBorders>
+              <w:bottom w:val="single" w:sz="6" w:space="0" w:color="000000"/>
+            </w:tcBorders>
+          </w:tcPr>
+          <w:p>
+            <w:pPr>
+              <w:pStyle w:val="Compact"/>
+              <w:keepLines/>
+              <w:jc w:val="right"/>
+            </w:pPr>
+            <w:r>
+              <w:rPr>
+                <w:b/>
+                <w:sz w:val="17"/>
+              </w:rPr>
+              <w:t xml:space="preserve">Naive width</w:t>
+            </w:r>
+          </w:p>
+        </w:tc>
+        <w:tc>
+          <w:tcPr>
+            <w:tcW w:w="1355" w:type="dxa"/>
+            <w:tcBorders>
+              <w:bottom w:val="single" w:sz="6" w:space="0" w:color="000000"/>
+            </w:tcBorders>
+          </w:tcPr>
+          <w:p>
+            <w:pPr>
+              <w:pStyle w:val="Compact"/>
+              <w:keepLines/>
+              <w:jc w:val="right"/>
+            </w:pPr>
+            <w:r>
+              <w:rPr>
+                <w:b/>
+                <w:sz w:val="17"/>
+              </w:rPr>
+              <w:t xml:space="preserve">Group width</w:t>
+            </w:r>
+          </w:p>
+        </w:tc>
+      </w:tr>
+      <w:tr>
+        <w:trPr>
+          <w:cantSplit w:val="true"/>
+        </w:trPr>
+        <w:tc>
+          <w:tcPr>
+            <w:tcW w:w="1042" w:type="dxa"/>
+          </w:tcPr>
+          <w:p>
+            <w:pPr>
+              <w:pStyle w:val="Compact"/>
+              <w:keepLines/>
+              <w:jc w:val="left"/>
+            </w:pPr>
+            <w:r>
+              <w:rPr>
+                <w:sz w:val="17"/>
+              </w:rPr>
+              <w:t xml:space="preserve">full</w:t>
+            </w:r>
+          </w:p>
+        </w:tc>
+        <w:tc>
+          <w:tcPr>
+            <w:tcW w:w="1981" w:type="dxa"/>
+          </w:tcPr>
+          <w:p>
+            <w:pPr>
+              <w:pStyle w:val="Compact"/>
+              <w:keepLines/>
+              <w:jc w:val="right"/>
+            </w:pPr>
+            <w:r>
+              <w:rPr>
+                <w:sz w:val="17"/>
+              </w:rPr>
+              <w:t xml:space="preserve">0.596</w:t>
+            </w:r>
+          </w:p>
+        </w:tc>
+        <w:tc>
+          <w:tcPr>
+            <w:tcW w:w="1668" w:type="dxa"/>
+          </w:tcPr>
+          <w:p>
+            <w:pPr>
+              <w:pStyle w:val="Compact"/>
+              <w:keepLines/>
+              <w:jc w:val="right"/>
+            </w:pPr>
+            <w:r>
+              <w:rPr>
+                <w:sz w:val="17"/>
+              </w:rPr>
+              <w:t xml:space="preserve">0.602</w:t>
+            </w:r>
+          </w:p>
+        </w:tc>
+        <w:tc>
+          <w:tcPr>
+            <w:tcW w:w="1668" w:type="dxa"/>
+          </w:tcPr>
+          <w:p>
+            <w:pPr>
+              <w:pStyle w:val="Compact"/>
+              <w:keepLines/>
+              <w:jc w:val="right"/>
+            </w:pPr>
+            <w:r>
+              <w:rPr>
+                <w:sz w:val="17"/>
+              </w:rPr>
+              <w:t xml:space="preserve">0.904</w:t>
+            </w:r>
+          </w:p>
+        </w:tc>
+        <w:tc>
+          <w:tcPr>
+            <w:tcW w:w="1355" w:type="dxa"/>
+          </w:tcPr>
+          <w:p>
+            <w:pPr>
+              <w:pStyle w:val="Compact"/>
+              <w:keepLines/>
+              <w:jc w:val="right"/>
+            </w:pPr>
+            <w:r>
+              <w:rPr>
+                <w:sz w:val="17"/>
+              </w:rPr>
+              <w:t xml:space="preserve">0.96</w:t>
+            </w:r>
+          </w:p>
+        </w:tc>
+        <w:tc>
+          <w:tcPr>
+            <w:tcW w:w="1355" w:type="dxa"/>
+          </w:tcPr>
+          <w:p>
+            <w:pPr>
+              <w:pStyle w:val="Compact"/>
+              <w:keepLines/>
+              <w:jc w:val="right"/>
+            </w:pPr>
+            <w:r>
+              <w:rPr>
+                <w:sz w:val="17"/>
+              </w:rPr>
+              <w:t xml:space="preserve">2.21</w:t>
+            </w:r>
+          </w:p>
+        </w:tc>
+      </w:tr>
+      <w:tr>
+        <w:trPr>
+          <w:cantSplit w:val="true"/>
+        </w:trPr>
+        <w:tc>
+          <w:tcPr>
+            <w:tcW w:w="1042" w:type="dxa"/>
+          </w:tcPr>
+          <w:p>
+            <w:pPr>
+              <w:pStyle w:val="Compact"/>
+              <w:keepLines/>
+              <w:jc w:val="left"/>
+            </w:pPr>
+            <w:r>
+              <w:rPr>
+                <w:sz w:val="17"/>
+              </w:rPr>
+              <w:t xml:space="preserve">anomaly</w:t>
+            </w:r>
+          </w:p>
+        </w:tc>
+        <w:tc>
+          <w:tcPr>
+            <w:tcW w:w="1981" w:type="dxa"/>
+          </w:tcPr>
+          <w:p>
+            <w:pPr>
+              <w:pStyle w:val="Compact"/>
+              <w:keepLines/>
+              <w:jc w:val="right"/>
+            </w:pPr>
+            <w:r>
+              <w:rPr>
+                <w:sz w:val="17"/>
+              </w:rPr>
+              <w:t xml:space="preserve">0.062</w:t>
+            </w:r>
+          </w:p>
+        </w:tc>
+        <w:tc>
+          <w:tcPr>
+            <w:tcW w:w="1668" w:type="dxa"/>
+          </w:tcPr>
+          <w:p>
+            <w:pPr>
+              <w:pStyle w:val="Compact"/>
+              <w:keepLines/>
+              <w:jc w:val="right"/>
+            </w:pPr>
+            <w:r>
+              <w:rPr>
+                <w:sz w:val="17"/>
+              </w:rPr>
+              <w:t xml:space="preserve">0.829</w:t>
+            </w:r>
+          </w:p>
+        </w:tc>
+        <w:tc>
+          <w:tcPr>
+            <w:tcW w:w="1668" w:type="dxa"/>
+          </w:tcPr>
+          <w:p>
+            <w:pPr>
+              <w:pStyle w:val="Compact"/>
+              <w:keepLines/>
+              <w:jc w:val="right"/>
+            </w:pPr>
+            <w:r>
+              <w:rPr>
+                <w:sz w:val="17"/>
+              </w:rPr>
+              <w:t xml:space="preserve">0.897</w:t>
+            </w:r>
+          </w:p>
+        </w:tc>
+        <w:tc>
+          <w:tcPr>
+            <w:tcW w:w="1355" w:type="dxa"/>
+          </w:tcPr>
+          <w:p>
+            <w:pPr>
+              <w:pStyle w:val="Compact"/>
+              <w:keepLines/>
+              <w:jc w:val="right"/>
+            </w:pPr>
+            <w:r>
+              <w:rPr>
+                <w:sz w:val="17"/>
+              </w:rPr>
+              <w:t xml:space="preserve">1.91</w:t>
+            </w:r>
+          </w:p>
+        </w:tc>
+        <w:tc>
+          <w:tcPr>
+            <w:tcW w:w="1355" w:type="dxa"/>
+          </w:tcPr>
+          <w:p>
+            <w:pPr>
+              <w:pStyle w:val="Compact"/>
+              <w:keepLines/>
+              <w:jc w:val="right"/>
+            </w:pPr>
+            <w:r>
+              <w:rPr>
+                <w:sz w:val="17"/>
+              </w:rPr>
+              <w:t xml:space="preserve">2.37</w:t>
+            </w:r>
+          </w:p>
+        </w:tc>
+      </w:tr>
+    </w:tbl>
+    <w:p>
+      <w:pPr>
+        <w:pStyle w:val="BodyText"/>
+      </w:pPr>
+      <w:r>
+        <w:t xml:space="preserve">Removing the country level also weakens the fingerprint. The accuracy of identifying the country from the anomaly features is 0.062 (0.596 for the full features; chance 0.018), and naive conformal coverage on unseen countries rises from 0.602 to 0.829, while group calibration still gives 0.897. The collapse is therefore reduced but not removed: year and the anomalies still carry a weak country signature, and the anomaly model scores above the crop mean on random rows (R² 0.708), which suggests it still recognises some country-specific patterns. The trade-off is the practical message of this section. The features that make random splits look good are levels that identify the country, and they are the same features that break naive intervals; features that do not identify the country keep the intervals closer to nominal but, in this file, bring no cross-country skill.</w:t>
+      </w:r>
+    </w:p>
+    <w:p>
+      <w:pPr>
+        <w:pStyle w:val="CaptionedFigure"/>
+        <w:keepNext/>
+        <w:spacing w:before="120"/>
+        <w:jc w:val="center"/>
+      </w:pPr>
+      <w:r>
+        <w:drawing>
+          <wp:inline>
+            <wp:extent cx="5753100" cy="2118043"/>
+            <wp:effectExtent b="0" l="0" r="0" t="0"/>
+            <wp:docPr descr="Fig. 7. Place lookups and fingerprint-free features on the FAO file. (a) R² (95% bootstrap interval) by protocol for the crop mean, the country–crop lookup, gradient boosting on full and anomaly features and the lookup combined with boosting on anomalies. (b) Conformal coverage on unseen countries with naive and group calibration for the full and anomaly feature sets (nominal 0.90, dotted)." title="" id="57" name="Picture"/>
+            <a:graphic>
+              <a:graphicData uri="http://schemas.openxmlformats.org/drawingml/2006/picture">
+                <pic:pic>
+                  <pic:nvPicPr>
+                    <pic:cNvPr descr="../figures/fig08_fingerprint_free.png" id="58" name="Picture"/>
+                    <pic:cNvPicPr>
+                      <a:picLocks noChangeArrowheads="1" noChangeAspect="1"/>
+                    </pic:cNvPicPr>
+                  </pic:nvPicPr>
+                  <pic:blipFill>
+                    <a:blip r:embed="rId56"/>
+                    <a:stretch>
+                      <a:fillRect/>
+                    </a:stretch>
+                  </pic:blipFill>
+                  <pic:spPr bwMode="auto">
+                    <a:xfrm>
+                      <a:off x="0" y="0"/>
+                      <a:ext cx="5753100" cy="2118043"/>
+                    </a:xfrm>
+                    <a:prstGeom prst="rect">
+                      <a:avLst/>
+                    </a:prstGeom>
+                    <a:noFill/>
+                    <a:ln w="9525">
+                      <a:noFill/>
+                      <a:headEnd/>
+                      <a:tailEnd/>
+                    </a:ln>
+                  </pic:spPr>
+                </pic:pic>
+              </a:graphicData>
+            </a:graphic>
+          </wp:inline>
+        </w:drawing>
+      </w:r>
+    </w:p>
+    <w:p>
+      <w:pPr>
+        <w:pStyle w:val="ImageCaption"/>
+      </w:pPr>
+      <w:r>
+        <w:t xml:space="preserve">Fig. 7. Place lookups and fingerprint-free features on the FAO file. (a) R² (95% bootstrap interval) by protocol for the crop mean, the country–crop lookup, gradient boosting on full and anomaly features and the lookup combined with boosting on anomalies. (b) Conformal coverage on unseen countries with naive and group calibration for the full and anomaly feature sets (nominal 0.90, dotted).</w:t>
+      </w:r>
+    </w:p>
+    <w:bookmarkEnd w:id="59"/>
+    <w:bookmarkStart w:id="60" w:name="checks"/>
+    <w:p>
+      <w:pPr>
+        <w:pStyle w:val="Heading2"/>
+      </w:pPr>
+      <w:r>
+        <w:rPr>
+          <w:rStyle w:val="SectionNumber"/>
+        </w:rPr>
+        <w:t xml:space="preserve">6.9</w:t>
+      </w:r>
+      <w:r>
+        <w:tab/>
+      </w:r>
+      <w:r>
+        <w:t xml:space="preserve">Checks</w:t>
+      </w:r>
+    </w:p>
+    <w:p>
+      <w:pPr>
+        <w:pStyle w:val="FirstParagraph"/>
+      </w:pPr>
+      <w:r>
+        <w:t xml:space="preserve">The group shuffle used by the split generator was corrected during the study (shuffling a pandas string array in place); we reran the FAO group-held-out point-accuracy and the first conformal experiments and the results were unchanged to the reported precision; the later experiments were run with the corrected code. The primary conformal results use distinct FAO records. Applying the same procedure to the 28,242 raw rows, naive calibration covers 0.501 of rows from unseen countries (0.598 on distinct records), while group calibration gives 0.901; duplicated calibration rows make calibration on seen groups still more optimistic. Gradient boosting in the conformal experiments uses default settings; the tuned variant was used in the point-accuracy comparison only.</w:t>
+      </w:r>
+    </w:p>
+    <w:bookmarkEnd w:id="60"/>
+    <w:bookmarkEnd w:id="61"/>
+    <w:bookmarkStart w:id="66" w:name="discussion"/>
     <w:p>
       <w:pPr>
         <w:pStyle w:val="Heading1"/>
@@ -17013,7 +18906,7 @@
         <w:t xml:space="preserve">Discussion</w:t>
       </w:r>
     </w:p>
-    <w:bookmarkStart w:id="56" w:name="what-the-results-mean"/>
+    <w:bookmarkStart w:id="62" w:name="what-the-results-mean"/>
     <w:p>
       <w:pPr>
         <w:pStyle w:val="Heading2"/>
@@ -17036,7 +18929,7 @@
         <w:pStyle w:val="FirstParagraph"/>
       </w:pPr>
       <w:r>
-        <w:t xml:space="preserve">The duplicated rows and the collapsing intervals share a cause: the file lets a model recognise the place. The fan-out inflates the number of rows of the best-documented countries and carries no information beyond the record it copies, so random splits put copies of every test row in the training set. Beyond the duplicates, the covariates are nearly constant within a country, so even distinct records are mostly informative about which country they belong to. The result is that a random-split score of 0.93 to 0.95 means little about use in a new country, where the same models are within about 0.1 of a crop-mean predictor and the model that is given the country is no better than it. Our results do not say that yield cannot be predicted across countries; they say that this file, with these four covariates, does not support that claim, and that the benchmark rewards the wrong behaviour.</w:t>
+        <w:t xml:space="preserve">The duplicated rows and the collapsing intervals share a cause: the file lets a model recognise the place. The duplication itself has been noted informally in public repositories [7, 8]; what we add is the exact trace, its effect on evaluation and the consequences for intervals. The fan-out inflates the number of rows of the best-documented countries and carries no information beyond the record it copies, so random splits put copies of every test row in the training set. Beyond the duplicates, the covariates are nearly constant within a country, so even distinct records are mostly informative about which country they belong to. The result is that a random-split score of 0.93 to 0.95 means little about use in a new country, where the same models are within about 0.1 of a crop-mean predictor and the model that is given the country is no better than it. Our results do not say that yield cannot be predicted across countries; they say that this file, with these four covariates, does not support that claim, and that the benchmark rewards the wrong behaviour.</w:t>
       </w:r>
     </w:p>
     <w:p>
@@ -17067,8 +18960,8 @@
         <w:t xml:space="preserve">for FAO) is a quick diagnostic for a practitioner who has only naive coverage numbers. The remedy is cheap: calibrating on groups that the model has not seen restores marginal coverage in every setting we tried.</w:t>
       </w:r>
     </w:p>
-    <w:bookmarkEnd w:id="56"/>
-    <w:bookmarkStart w:id="57" w:name="recommendations"/>
+    <w:bookmarkEnd w:id="62"/>
+    <w:bookmarkStart w:id="63" w:name="recommendations"/>
     <w:p>
       <w:pPr>
         <w:pStyle w:val="Heading2"/>
@@ -17151,13 +19044,13 @@
           <w:b/>
           <w:bCs/>
         </w:rPr>
-        <w:t xml:space="preserve">Report a no-skill baseline that uses no place information.</w:t>
-      </w:r>
-      <w:r>
-        <w:t xml:space="preserve"> </w:t>
-      </w:r>
-      <w:r>
-        <w:t xml:space="preserve">The crop mean is enough here and shows immediately how little the covariates add for new places.</w:t>
+        <w:t xml:space="preserve">Report two baselines: one that uses no place information and one that does.</w:t>
+      </w:r>
+      <w:r>
+        <w:t xml:space="preserve"> </w:t>
+      </w:r>
+      <w:r>
+        <w:t xml:space="preserve">The crop mean shows how little the covariates add for new places, and a country–crop lookup shows how much of a random-split score is available without any covariates (R² 0.93 here).</w:t>
       </w:r>
     </w:p>
     <w:p>
@@ -17226,8 +19119,8 @@
         <w:t xml:space="preserve">In our experiments they improve the tail modestly and sharpen intervals when a few local rows exist, but they do not give group-conditional guarantees.</w:t>
       </w:r>
     </w:p>
-    <w:bookmarkEnd w:id="57"/>
-    <w:bookmarkStart w:id="58" w:name="limitations"/>
+    <w:bookmarkEnd w:id="63"/>
+    <w:bookmarkStart w:id="64" w:name="limitations"/>
     <w:p>
       <w:pPr>
         <w:pStyle w:val="Heading2"/>
@@ -17250,11 +19143,11 @@
         <w:pStyle w:val="FirstParagraph"/>
       </w:pPr>
       <w:r>
-        <w:t xml:space="preserve">Several limitations qualify the results. First, there are two datasets and a handful of settings; the relation between fingerprint strength and collapse rests on three points, and the fingerprint measures for India depend on one continuous feature. Second, the covariates are those distributed with the files: we did not add weather, soil or remote-sensing features, which could reduce the dependence on place and raise cross-country skill, and the Indian table has no weather at all. Our statements concern these files and the evaluation protocols, not the best achievable cross-country yield model. Third, the models are standard and lightly tuned; a model designed for transfer, for instance with random effects or domain-specific features, might behave differently. Fourth, Eq. (5) assumes roughly Gaussian residuals and is a diagnostic: it is slightly pessimistic on FAO, and the bound in Eq. (6) assumes an idealised memorising learner and a residual intraclass correlation that we cannot measure directly. Fifth, the calibration comparison uses pooled rows from calibration groups; exact group-conditional coverage would need group-specific calibration sets [23]. Sixth, the interval statistics for the applicability scores are optimistic because group–fold pairs are pooled over seeds. Seventh, we cleaned the Indian table with our own documented rule, which differs from the rule of earlier analyses, and the conformal results were computed on distinct FAO records only. Finally, we did not verify the upstream provenance of the Indian table beyond its dataset page, and we make no claim about the quality of the underlying FAOSTAT or national statistics, only about how they were packaged for machine learning.</w:t>
+        <w:t xml:space="preserve">Several limitations qualify the results. First, there are two datasets and a handful of settings; the relation between fingerprint strength and collapse rests on three points, and the fingerprint measures for India depend on one continuous feature. Second, the covariates are those distributed with the files: we did not add weather, soil or remote-sensing features, which could reduce the dependence on place and raise cross-country skill, and the Indian table has no weather at all. Our statements concern these files and the evaluation protocols, not the best achievable cross-country yield model. Third, the models are standard and lightly tuned; a model designed for transfer, for instance with random effects or domain-specific features, might behave differently. Fourth, Eq. (5) assumes roughly Gaussian residuals and is a diagnostic: it is slightly pessimistic on FAO, and the bound in Eq. (6) assumes an idealised memorising learner and a residual intraclass correlation that we cannot measure directly. Fifth, the calibration comparison uses pooled rows from calibration groups; exact group-conditional coverage would need group-specific calibration sets [25]. Sixth, the anomaly features reduce but do not remove the country signature, so the fingerprint-free comparison is a partial test. Seventh, we cleaned the Indian table with our own documented rule, which differs from the rule of earlier analyses, and the main conformal results use distinct FAO records (the raw-row check is in Section 6.8). Finally, we did not verify the upstream provenance of the Indian table beyond its dataset page, and we make no claim about the quality of the underlying FAOSTAT or national statistics, only about how they were packaged for machine learning.</w:t>
       </w:r>
     </w:p>
-    <w:bookmarkEnd w:id="58"/>
-    <w:bookmarkStart w:id="59" w:name="relation-to-prior-work"/>
+    <w:bookmarkEnd w:id="64"/>
+    <w:bookmarkStart w:id="65" w:name="relation-to-prior-work"/>
     <w:p>
       <w:pPr>
         <w:pStyle w:val="Heading2"/>
@@ -17277,12 +19170,12 @@
         <w:pStyle w:val="FirstParagraph"/>
       </w:pPr>
       <w:r>
-        <w:t xml:space="preserve">The qualitative message agrees with the literature on structured validation [3, 4] and with evidence that cross-country transfer of yield models is far harder than within-country skill suggests [6]. The coverage results complement the conformal literature on shift [18, 19] by showing, in a concrete tabular setting, how large the loss is and which feature of the data and model predicts it, and they agree with the use of group-conditional calibration in crop applications [26]. We did not find that weighted conformal prediction helped here, which is consistent with the near-separability of calibration and test sets when features identify the group, but we did not examine the weights in detail.</w:t>
+        <w:t xml:space="preserve">The qualitative message agrees with the literature on structured validation [3, 4] and with evidence that cross-country transfer of yield models is far harder than within-country skill suggests [6]. The coverage results complement the conformal literature on shift [20, 21] by showing, in a concrete tabular setting, how large the loss is and which feature of the data and model predicts it, and they agree with the use of group-conditional calibration in crop applications [28]. Weighted conformal prediction did not help here, because calibration and test sets are perfectly separable when the features identify the group (Table 11); methods that localise or weight the calibration [29–31] assume overlap that new groups do not provide.</w:t>
       </w:r>
     </w:p>
-    <w:bookmarkEnd w:id="59"/>
-    <w:bookmarkEnd w:id="60"/>
-    <w:bookmarkStart w:id="61" w:name="conclusions"/>
+    <w:bookmarkEnd w:id="65"/>
+    <w:bookmarkEnd w:id="66"/>
+    <w:bookmarkStart w:id="67" w:name="conclusions"/>
     <w:p>
       <w:pPr>
         <w:pStyle w:val="Heading1"/>
@@ -17305,7 +19198,7 @@
         <w:pStyle w:val="FirstParagraph"/>
       </w:pPr>
       <w:r>
-        <w:t xml:space="preserve">A publicly shared FAO-derived crop-yield file contains 13,130 distinct country–crop–year records in 28,242 rows, the excess arising from a join to a temperature table with several rows per country and year, and its covariates are nearly country identifiers. Random splits on this file, and on a district-level Indian table with the same hierarchical structure, measure how well a model recognises the place: tuned gradient boosting scores R² = 0.93 on random rows and 0.66 on unseen countries, a crop-mean predictor scores 0.57, and a model given the country as a feature is no better than the crop mean on unseen countries. Prediction intervals calibrated on random rows inherit the problem: they cover 60% of rows from unseen countries at a nominal 90%, 84% for unseen Indian states and 90% for districts, and the loss follows how well the features identify the group and the flexibility of the model, with random forest at 47%, gradient boosting at 59% and ridge regression at 88% on the same data. A simple relation between coverage and the inflation ratio of group leakage describes this loss, and calibrating on held-out groups restores nominal marginal coverage in every setting. A learned residual scale flags harder groups and modestly improves coverage in the weakest tail, and a few labelled local rows sharpen intervals on the FAO file, but group-level under-coverage remains for a sizeable share of groups.</w:t>
+        <w:t xml:space="preserve">A publicly shared FAO-derived crop-yield file contains 13,130 distinct country–crop–year records in 28,242 rows, the excess arising from a join to a temperature table with several rows per country and year, its covariates are nearly country identifiers and a country–crop lookup with no covariates already reaches R² = 0.93 on random rows. Random splits on this file, and on a district-level Indian table with the same hierarchical structure, measure how well a model recognises the place: tuned gradient boosting scores R² = 0.93 on random rows and 0.66 on unseen countries, a crop-mean predictor scores 0.57, and a model given the country as a feature is no better than the crop mean on unseen countries. Prediction intervals calibrated on random rows inherit the problem: they cover 60% of rows from unseen countries at a nominal 90%, 84% for unseen Indian states and 90% for districts, and the loss follows how well the features identify the group and the flexibility of the model, with random forest at 47%, gradient boosting at 59% and ridge regression at 88% on the same data. Within-country anomaly features add real skill within a country (RMSE 9–11% below the lookup) but none across countries, and they weaken the collapse (naive coverage 83%) without removing it. A simple relation between coverage and the inflation ratio of group leakage describes this loss, and calibrating on held-out groups restores nominal marginal coverage in every setting. A learned residual scale flags harder groups and modestly improves coverage in the weakest tail, and a few labelled local rows sharpen intervals on the FAO file, but group-level under-coverage remains for a sizeable share of groups.</w:t>
       </w:r>
     </w:p>
     <w:p>
@@ -17316,8 +19209,8 @@
         <w:t xml:space="preserve">We recommend that users of crop-yield tables audit record keys, split on the unit of intended generalisation, report a no-skill baseline and group-level coverage, and calibrate intervals on held-out groups. The code, per-fold results and figures accompanying this paper make it straightforward to apply the same audit to other tables.</w:t>
       </w:r>
     </w:p>
-    <w:bookmarkEnd w:id="61"/>
-    <w:bookmarkStart w:id="62" w:name="declarations"/>
+    <w:bookmarkEnd w:id="67"/>
+    <w:bookmarkStart w:id="68" w:name="declarations"/>
     <w:p>
       <w:pPr>
         <w:pStyle w:val="Heading1"/>
@@ -17456,8 +19349,8 @@
         <w:t xml:space="preserve">To be completed by the authors.</w:t>
       </w:r>
     </w:p>
-    <w:bookmarkEnd w:id="62"/>
-    <w:bookmarkStart w:id="67" w:name="appendix-a.-derivations"/>
+    <w:bookmarkEnd w:id="68"/>
+    <w:bookmarkStart w:id="73" w:name="appendix-a.-derivations"/>
     <w:p>
       <w:pPr>
         <w:pStyle w:val="Heading1"/>
@@ -17466,7 +19359,7 @@
         <w:t xml:space="preserve">Appendix A. Derivations</w:t>
       </w:r>
     </w:p>
-    <w:bookmarkStart w:id="63" w:name="X18908d5bdfc7ffbc02f9b6ce26d9a839bc90cd0"/>
+    <w:bookmarkStart w:id="69" w:name="X18908d5bdfc7ffbc02f9b6ce26d9a839bc90cd0"/>
     <w:p>
       <w:pPr>
         <w:pStyle w:val="Heading2"/>
@@ -18376,8 +20269,8 @@
         <w:t xml:space="preserve">.</w:t>
       </w:r>
     </w:p>
-    <w:bookmarkEnd w:id="63"/>
-    <w:bookmarkStart w:id="64" w:name="X54d74311bc9240c695e21986725e56f4ce5865f"/>
+    <w:bookmarkEnd w:id="69"/>
+    <w:bookmarkStart w:id="70" w:name="X54d74311bc9240c695e21986725e56f4ce5865f"/>
     <w:p>
       <w:pPr>
         <w:pStyle w:val="Heading2"/>
@@ -18635,7 +20528,7 @@
         </m:r>
       </m:oMath>
       <w:r>
-        <w:t xml:space="preserve">, which is Eq. (3) [10], and substituting the largest</w:t>
+        <w:t xml:space="preserve">, which is Eq. (3) [12], and substituting the largest</w:t>
       </w:r>
       <w:r>
         <w:t xml:space="preserve"> </w:t>
@@ -18694,8 +20587,8 @@
         <w:t xml:space="preserve">only under the same assumptions.</w:t>
       </w:r>
     </w:p>
-    <w:bookmarkEnd w:id="64"/>
-    <w:bookmarkStart w:id="65" w:name="a.3-proof-of-proposition-1"/>
+    <w:bookmarkEnd w:id="70"/>
+    <w:bookmarkStart w:id="71" w:name="a.3-proof-of-proposition-1"/>
     <w:p>
       <w:pPr>
         <w:pStyle w:val="Heading2"/>
@@ -19066,11 +20959,11 @@
         </m:r>
       </m:oMath>
       <w:r>
-        <w:t xml:space="preserve">, the standard split-conformal argument [15, 16]. When all rows of the calibration groups are pooled, the same argument applies to a row of each group drawn with probability proportional to the group’s number of calibration rows, with the weights known in advance; coverage for an arbitrary fixed group is not controlled.</w:t>
+        <w:t xml:space="preserve">, the standard split-conformal argument [17, 18]. When all rows of the calibration groups are pooled, the same argument applies to a row of each group drawn with probability proportional to the group’s number of calibration rows, with the weights known in advance; coverage for an arbitrary fixed group is not controlled.</w:t>
       </w:r>
     </w:p>
-    <w:bookmarkEnd w:id="65"/>
-    <w:bookmarkStart w:id="66" w:name="a.4-group-specific-coverage-eq.-7"/>
+    <w:bookmarkEnd w:id="71"/>
+    <w:bookmarkStart w:id="72" w:name="a.4-group-specific-coverage-eq.-7"/>
     <w:p>
       <w:pPr>
         <w:pStyle w:val="Heading2"/>
@@ -19777,9 +21670,9 @@
         <w:t xml:space="preserve">, whose spread is smaller to the extent that the prediction is accurate.</w:t>
       </w:r>
     </w:p>
-    <w:bookmarkEnd w:id="66"/>
-    <w:bookmarkEnd w:id="67"/>
-    <w:bookmarkStart w:id="68" w:name="appendix-b.-reproducibility-details"/>
+    <w:bookmarkEnd w:id="72"/>
+    <w:bookmarkEnd w:id="73"/>
+    <w:bookmarkStart w:id="74" w:name="appendix-b.-reproducibility-details"/>
     <w:p>
       <w:pPr>
         <w:pStyle w:val="Heading1"/>
@@ -21169,8 +23062,8 @@
         </w:tc>
       </w:tr>
     </w:tbl>
-    <w:bookmarkEnd w:id="68"/>
-    <w:bookmarkStart w:id="69" w:name="references"/>
+    <w:bookmarkEnd w:id="74"/>
+    <w:bookmarkStart w:id="75" w:name="references"/>
     <w:p>
       <w:pPr>
         <w:pStyle w:val="Heading1"/>
@@ -21232,7 +23125,7 @@
         <w:pStyle w:val="BodyText"/>
       </w:pPr>
       <w:r>
-        <w:t xml:space="preserve">[7] R. Patel, Crop Yield Prediction Dataset, Kaggle, https://www.kaggle.com/datasets/patelris/crop-yield-prediction-dataset (accessed 2026).</w:t>
+        <w:t xml:space="preserve">[7] pnastra, crop-yield-forecast, GitHub repository, https://github.com/pnastra/crop-yield-forecast (accessed 2026).</w:t>
       </w:r>
     </w:p>
     <w:p>
@@ -21240,7 +23133,7 @@
         <w:pStyle w:val="BodyText"/>
       </w:pPr>
       <w:r>
-        <w:t xml:space="preserve">[8] FAO, FAOSTAT: Production: Crops and livestock products (QCL), https://www.fao.org/faostat/en/#data/QCL (accessed 2026).</w:t>
+        <w:t xml:space="preserve">[8] sivarjun21, crop-yield-prediction, GitHub repository, https://github.com/sivarjun21/crop-yield-prediction (accessed 2026).</w:t>
       </w:r>
     </w:p>
     <w:p>
@@ -21248,7 +23141,7 @@
         <w:pStyle w:val="BodyText"/>
       </w:pPr>
       <w:r>
-        <w:t xml:space="preserve">[9] Abhinand, Crop Production in India, Kaggle, https://www.kaggle.com/datasets/abhinand05/crop-production-in-india (accessed 2026).</w:t>
+        <w:t xml:space="preserve">[9] R. Patel, Crop Yield Prediction Dataset, Kaggle, https://www.kaggle.com/datasets/patelris/crop-yield-prediction-dataset (accessed 2026).</w:t>
       </w:r>
     </w:p>
     <w:p>
@@ -21256,7 +23149,7 @@
         <w:pStyle w:val="BodyText"/>
       </w:pPr>
       <w:r>
-        <w:t xml:space="preserve">[10] [Authors to be added], Group leakage in tabular regression benchmarks: theory, measurement and remedies, companion manuscript (2026), https://github.com/deep1789/Energy-efficient.</w:t>
+        <w:t xml:space="preserve">[10] FAO, FAOSTAT: Production: Crops and livestock products (QCL), https://www.fao.org/faostat/en/#data/QCL (accessed 2026).</w:t>
       </w:r>
     </w:p>
     <w:p>
@@ -21264,7 +23157,7 @@
         <w:pStyle w:val="BodyText"/>
       </w:pPr>
       <w:r>
-        <w:t xml:space="preserve">[11] B. Barz, J. Denzler, Do we train on test data? Purging CIFAR of near-duplicates, Journal of Imaging 6 (6) (2020) 41.</w:t>
+        <w:t xml:space="preserve">[11] Abhinand, Crop Production in India, Kaggle, https://www.kaggle.com/datasets/abhinand05/crop-production-in-india (accessed 2026).</w:t>
       </w:r>
     </w:p>
     <w:p>
@@ -21272,7 +23165,7 @@
         <w:pStyle w:val="BodyText"/>
       </w:pPr>
       <w:r>
-        <w:t xml:space="preserve">[12] M.A. Lones, How to avoid machine learning pitfalls: a guide for academic researchers, arXiv:2108.02497 (2021).</w:t>
+        <w:t xml:space="preserve">[12] [Authors to be added], Group leakage in tabular regression benchmarks: theory, measurement and remedies, companion manuscript (2026), https://github.com/deep1789/Energy-efficient.</w:t>
       </w:r>
     </w:p>
     <w:p>
@@ -21280,7 +23173,7 @@
         <w:pStyle w:val="BodyText"/>
       </w:pPr>
       <w:r>
-        <w:t xml:space="preserve">[13] P.W. Koh, et al., WILDS: a benchmark of in-the-wild distribution shifts, Proceedings of the 38th International Conference on Machine Learning, PMLR 139 (2021) 5637–5664.</w:t>
+        <w:t xml:space="preserve">[13] B. Barz, J. Denzler, Do we train on test data? Purging CIFAR of near-duplicates, Journal of Imaging 6 (6) (2020) 41.</w:t>
       </w:r>
     </w:p>
     <w:p>
@@ -21288,7 +23181,7 @@
         <w:pStyle w:val="BodyText"/>
       </w:pPr>
       <w:r>
-        <w:t xml:space="preserve">[14] A. Hajjem, F. Bellavance, D. Larocque, Mixed-effects random forest for clustered data, Journal of Statistical Computation and Simulation 84 (6) (2014) 1313–1328. doi:10.1080/00949655.2012.741599.</w:t>
+        <w:t xml:space="preserve">[14] M.A. Lones, How to avoid machine learning pitfalls: a guide for academic researchers, arXiv:2108.02497 (2021).</w:t>
       </w:r>
     </w:p>
     <w:p>
@@ -21296,7 +23189,7 @@
         <w:pStyle w:val="BodyText"/>
       </w:pPr>
       <w:r>
-        <w:t xml:space="preserve">[15] V. Vovk, A. Gammerman, G. Shafer, Algorithmic Learning in a Random World, Springer, New York, 2005. doi:10.1007/b106715.</w:t>
+        <w:t xml:space="preserve">[15] P.W. Koh, et al., WILDS: a benchmark of in-the-wild distribution shifts, Proceedings of the 38th International Conference on Machine Learning, PMLR 139 (2021) 5637–5664.</w:t>
       </w:r>
     </w:p>
     <w:p>
@@ -21304,7 +23197,7 @@
         <w:pStyle w:val="BodyText"/>
       </w:pPr>
       <w:r>
-        <w:t xml:space="preserve">[16] J. Lei, M. G’Sell, A. Rinaldo, R.J. Tibshirani, L. Wasserman, Distribution-free predictive inference for regression, Journal of the American Statistical Association 113 (523) (2018) 1094–1111. doi:10.1080/01621459.2017.1307116.</w:t>
+        <w:t xml:space="preserve">[16] A. Hajjem, F. Bellavance, D. Larocque, Mixed-effects random forest for clustered data, Journal of Statistical Computation and Simulation 84 (6) (2014) 1313–1328. doi:10.1080/00949655.2012.741599.</w:t>
       </w:r>
     </w:p>
     <w:p>
@@ -21312,7 +23205,7 @@
         <w:pStyle w:val="BodyText"/>
       </w:pPr>
       <w:r>
-        <w:t xml:space="preserve">[17] A.N. Angelopoulos, S. Bates, Conformal prediction: a gentle introduction, Foundations and Trends in Machine Learning 16 (4) (2023) 494–591. doi:10.1561/2200000101.</w:t>
+        <w:t xml:space="preserve">[17] V. Vovk, A. Gammerman, G. Shafer, Algorithmic Learning in a Random World, Springer, New York, 2005. doi:10.1007/b106715.</w:t>
       </w:r>
     </w:p>
     <w:p>
@@ -21320,7 +23213,7 @@
         <w:pStyle w:val="BodyText"/>
       </w:pPr>
       <w:r>
-        <w:t xml:space="preserve">[18] R.J. Tibshirani, R.F. Barber, E.J. Candès, A. Ramdas, Conformal prediction under covariate shift, Advances in Neural Information Processing Systems 32 (2019). arXiv:1904.06019.</w:t>
+        <w:t xml:space="preserve">[18] J. Lei, M. G’Sell, A. Rinaldo, R.J. Tibshirani, L. Wasserman, Distribution-free predictive inference for regression, Journal of the American Statistical Association 113 (523) (2018) 1094–1111. doi:10.1080/01621459.2017.1307116.</w:t>
       </w:r>
     </w:p>
     <w:p>
@@ -21328,7 +23221,7 @@
         <w:pStyle w:val="BodyText"/>
       </w:pPr>
       <w:r>
-        <w:t xml:space="preserve">[19] R.F. Barber, E.J. Candès, A. Ramdas, R.J. Tibshirani, Conformal prediction beyond exchangeability, Annals of Statistics 51 (2) (2023) 816–845. doi:10.1214/23-AOS2276.</w:t>
+        <w:t xml:space="preserve">[19] A.N. Angelopoulos, S. Bates, Conformal prediction: a gentle introduction, Foundations and Trends in Machine Learning 16 (4) (2023) 494–591. doi:10.1561/2200000101.</w:t>
       </w:r>
     </w:p>
     <w:p>
@@ -21336,7 +23229,7 @@
         <w:pStyle w:val="BodyText"/>
       </w:pPr>
       <w:r>
-        <w:t xml:space="preserve">[20] R.F. Barber, E.J. Candès, A. Ramdas, R.J. Tibshirani, Predictive inference with the jackknife+, Annals of Statistics 49 (1) (2021) 486–507. doi:10.1214/20-AOS1965.</w:t>
+        <w:t xml:space="preserve">[20] R.J. Tibshirani, R.F. Barber, E.J. Candès, A. Ramdas, Conformal prediction under covariate shift, Advances in Neural Information Processing Systems 32 (2019). arXiv:1904.06019.</w:t>
       </w:r>
     </w:p>
     <w:p>
@@ -21344,7 +23237,7 @@
         <w:pStyle w:val="BodyText"/>
       </w:pPr>
       <w:r>
-        <w:t xml:space="preserve">[21] Y. Romano, E. Patterson, E.J. Candès, Conformalized quantile regression, Advances in Neural Information Processing Systems 32 (2019). arXiv:1905.03222.</w:t>
+        <w:t xml:space="preserve">[21] R.F. Barber, E.J. Candès, A. Ramdas, R.J. Tibshirani, Conformal prediction beyond exchangeability, Annals of Statistics 51 (2) (2023) 816–845. doi:10.1214/23-AOS2276.</w:t>
       </w:r>
     </w:p>
     <w:p>
@@ -21352,7 +23245,7 @@
         <w:pStyle w:val="BodyText"/>
       </w:pPr>
       <w:r>
-        <w:t xml:space="preserve">[22] V. Vovk, Conditional validity of inductive conformal predictors, Machine Learning 92 (2–3) (2013) 349–376. doi:10.1007/s10994-013-5355-6.</w:t>
+        <w:t xml:space="preserve">[22] R.F. Barber, E.J. Candès, A. Ramdas, R.J. Tibshirani, Predictive inference with the jackknife+, Annals of Statistics 49 (1) (2021) 486–507. doi:10.1214/20-AOS1965.</w:t>
       </w:r>
     </w:p>
     <w:p>
@@ -21360,7 +23253,7 @@
         <w:pStyle w:val="BodyText"/>
       </w:pPr>
       <w:r>
-        <w:t xml:space="preserve">[23] I. Gibbs, J.J. Cherian, E.J. Candès, Conformal prediction with conditional guarantees, Journal of the Royal Statistical Society Series B 87 (4) (2025) 1100–1126. doi:10.1093/jrsssb/qkaf008.</w:t>
+        <w:t xml:space="preserve">[23] Y. Romano, E. Patterson, E.J. Candès, Conformalized quantile regression, Advances in Neural Information Processing Systems 32 (2019). arXiv:1905.03222.</w:t>
       </w:r>
     </w:p>
     <w:p>
@@ -21368,7 +23261,7 @@
         <w:pStyle w:val="BodyText"/>
       </w:pPr>
       <w:r>
-        <w:t xml:space="preserve">[24] R. Dunn, L. Wasserman, A. Ramdas, Distribution-free prediction sets for two-layer hierarchical models, Journal of the American Statistical Association 118 (544) (2023) 2491–2502. doi:10.1080/01621459.2022.2060112.</w:t>
+        <w:t xml:space="preserve">[24] V. Vovk, Conditional validity of inductive conformal predictors, Machine Learning 92 (2–3) (2013) 349–376. doi:10.1007/s10994-013-5355-6.</w:t>
       </w:r>
     </w:p>
     <w:p>
@@ -21376,7 +23269,7 @@
         <w:pStyle w:val="BodyText"/>
       </w:pPr>
       <w:r>
-        <w:t xml:space="preserve">[25] M. Farag, A. Emam, J. Leonhardt, R. Roscher, Enhancing decision support in crop production: analyzing conformal prediction for uncertainty quantification, Computers and Electronics in Agriculture 237 (2025). doi:10.1016/j.compag.2025.110559.</w:t>
+        <w:t xml:space="preserve">[25] I. Gibbs, J.J. Cherian, E.J. Candès, Conformal prediction with conditional guarantees, Journal of the Royal Statistical Society Series B 87 (4) (2025) 1100–1126. doi:10.1093/jrsssb/qkaf008.</w:t>
       </w:r>
     </w:p>
     <w:p>
@@ -21384,7 +23277,7 @@
         <w:pStyle w:val="BodyText"/>
       </w:pPr>
       <w:r>
-        <w:t xml:space="preserve">[26] P. Melki, L. Bombrun, B. Diallo, J. Dias, J.-P. da Costa, Group-conditional conformal prediction via quantile regression calibration for crop and weed classification, Proceedings of the IEEE/CVF International Conference on Computer Vision Workshops (2023) 614–623.</w:t>
+        <w:t xml:space="preserve">[26] R. Dunn, L. Wasserman, A. Ramdas, Distribution-free prediction sets for two-layer hierarchical models, Journal of the American Statistical Association 118 (544) (2023) 2491–2502. doi:10.1080/01621459.2022.2060112.</w:t>
       </w:r>
     </w:p>
     <w:p>
@@ -21392,7 +23285,7 @@
         <w:pStyle w:val="BodyText"/>
       </w:pPr>
       <w:r>
-        <w:t xml:space="preserve">[27] H. Meyer, E. Pebesma, Predicting into unknown space? Estimating the area of applicability of spatial prediction models, Methods in Ecology and Evolution 12 (2021) 1620–1633. doi:10.1111/2041-210X.13650.</w:t>
+        <w:t xml:space="preserve">[27] M. Farag, A. Emam, J. Leonhardt, R. Roscher, Enhancing decision support in crop production: analyzing conformal prediction for uncertainty quantification, Computers and Electronics in Agriculture 237 (2025). doi:10.1016/j.compag.2025.110559.</w:t>
       </w:r>
     </w:p>
     <w:p>
@@ -21400,7 +23293,7 @@
         <w:pStyle w:val="BodyText"/>
       </w:pPr>
       <w:r>
-        <w:t xml:space="preserve">[28] L. Breiman, Random forests, Machine Learning 45 (1) (2001) 5–32. doi:10.1023/A:1010933404324.</w:t>
+        <w:t xml:space="preserve">[28] P. Melki, L. Bombrun, B. Diallo, J. Dias, J.-P. da Costa, Group-conditional conformal prediction via quantile regression calibration for crop and weed classification, Proceedings of the IEEE/CVF International Conference on Computer Vision Workshops (2023) 614–623.</w:t>
       </w:r>
     </w:p>
     <w:p>
@@ -21408,7 +23301,7 @@
         <w:pStyle w:val="BodyText"/>
       </w:pPr>
       <w:r>
-        <w:t xml:space="preserve">[29] J.H. Friedman, Greedy function approximation: a gradient boosting machine, Annals of Statistics 29 (5) (2001) 1189–1232. doi:10.1214/aos/1013203451.</w:t>
+        <w:t xml:space="preserve">[29] H. Jiang, Y. Xie, Spatial conformal inference through localized quantile regression, arXiv:2412.01098 (2024).</w:t>
       </w:r>
     </w:p>
     <w:p>
@@ -21416,7 +23309,7 @@
         <w:pStyle w:val="BodyText"/>
       </w:pPr>
       <w:r>
-        <w:t xml:space="preserve">[30] P.E. Shrout, J.L. Fleiss, Intraclass correlations: uses in assessing rater reliability, Psychological Bulletin 86 (2) (1979) 420–428. doi:10.1037/0033-2909.86.2.420.</w:t>
+        <w:t xml:space="preserve">[30] X. Lou, P. Luo, L. Meng, GeoConformal prediction: a model-agnostic framework for measuring the uncertainty of spatial prediction, Annals of the American Association of Geographers 115 (8) (2025) 1971–1998. doi:10.1080/24694452.2025.2516091.</w:t>
       </w:r>
     </w:p>
     <w:p>
@@ -21424,7 +23317,7 @@
         <w:pStyle w:val="BodyText"/>
       </w:pPr>
       <w:r>
-        <w:t xml:space="preserve">[31] A.E. Hoerl, R.W. Kennard, Ridge regression: biased estimation for nonorthogonal problems, Technometrics 12 (1) (1970) 55–67.</w:t>
+        <w:t xml:space="preserve">[31] A. Bhattacharyya, R.F. Barber, Group-weighted conformal prediction, Electronic Journal of Statistics 20 (1) (2026). doi:10.1214/26-EJS2506.</w:t>
       </w:r>
     </w:p>
     <w:p>
@@ -21432,7 +23325,7 @@
         <w:pStyle w:val="BodyText"/>
       </w:pPr>
       <w:r>
-        <w:t xml:space="preserve">[32] G. Ke, Q. Meng, T. Finley, T. Wang, W. Chen, W. Ma, Q. Ye, T.-Y. Liu, LightGBM: a highly efficient gradient boosting decision tree, Advances in Neural Information Processing Systems 30 (2017) 3146–3154.</w:t>
+        <w:t xml:space="preserve">[32] H. Meyer, E. Pebesma, Predicting into unknown space? Estimating the area of applicability of spatial prediction models, Methods in Ecology and Evolution 12 (2021) 1620–1633. doi:10.1111/2041-210X.13650.</w:t>
       </w:r>
     </w:p>
     <w:p>
@@ -21440,10 +23333,50 @@
         <w:pStyle w:val="BodyText"/>
       </w:pPr>
       <w:r>
-        <w:t xml:space="preserve">[33] F. Pedregosa, G. Varoquaux, et al., Scikit-learn: machine learning in Python, Journal of Machine Learning Research 12 (2011) 2825–2830.</w:t>
+        <w:t xml:space="preserve">[33] L. Breiman, Random forests, Machine Learning 45 (1) (2001) 5–32. doi:10.1023/A:1010933404324.</w:t>
       </w:r>
     </w:p>
-    <w:bookmarkEnd w:id="69"/>
+    <w:p>
+      <w:pPr>
+        <w:pStyle w:val="BodyText"/>
+      </w:pPr>
+      <w:r>
+        <w:t xml:space="preserve">[34] J.H. Friedman, Greedy function approximation: a gradient boosting machine, Annals of Statistics 29 (5) (2001) 1189–1232. doi:10.1214/aos/1013203451.</w:t>
+      </w:r>
+    </w:p>
+    <w:p>
+      <w:pPr>
+        <w:pStyle w:val="BodyText"/>
+      </w:pPr>
+      <w:r>
+        <w:t xml:space="preserve">[35] P.E. Shrout, J.L. Fleiss, Intraclass correlations: uses in assessing rater reliability, Psychological Bulletin 86 (2) (1979) 420–428. doi:10.1037/0033-2909.86.2.420.</w:t>
+      </w:r>
+    </w:p>
+    <w:p>
+      <w:pPr>
+        <w:pStyle w:val="BodyText"/>
+      </w:pPr>
+      <w:r>
+        <w:t xml:space="preserve">[36] A.E. Hoerl, R.W. Kennard, Ridge regression: biased estimation for nonorthogonal problems, Technometrics 12 (1) (1970) 55–67.</w:t>
+      </w:r>
+    </w:p>
+    <w:p>
+      <w:pPr>
+        <w:pStyle w:val="BodyText"/>
+      </w:pPr>
+      <w:r>
+        <w:t xml:space="preserve">[37] G. Ke, Q. Meng, T. Finley, T. Wang, W. Chen, W. Ma, Q. Ye, T.-Y. Liu, LightGBM: a highly efficient gradient boosting decision tree, Advances in Neural Information Processing Systems 30 (2017) 3146–3154.</w:t>
+      </w:r>
+    </w:p>
+    <w:p>
+      <w:pPr>
+        <w:pStyle w:val="BodyText"/>
+      </w:pPr>
+      <w:r>
+        <w:t xml:space="preserve">[38] F. Pedregosa, G. Varoquaux, et al., Scikit-learn: machine learning in Python, Journal of Machine Learning Research 12 (2011) 2825–2830.</w:t>
+      </w:r>
+    </w:p>
+    <w:bookmarkEnd w:id="75"/>
     <w:sectPr>
       <w:footerReference w:type="default" r:id="rId9"/>
       <w:footnotePr>

</xml_diff>

<commit_message>
Apply independent numerical audit corrections to manuscript and tables
Co-Authored-By: Claude Sonnet 5.5 <noreply@anthropic.com>
Claude-Session: https://claude.ai/code/session_015BikcSiH9x3JSigSSPaTZS
</commit_message>
<xml_diff>
--- a/paper/Crop_yield_audit_conformal_manuscript.docx
+++ b/paper/Crop_yield_audit_conformal_manuscript.docx
@@ -122,7 +122,7 @@
         <w:pStyle w:val="BodyText"/>
       </w:pPr>
       <w:r>
-        <w:t xml:space="preserve">Public crop-yield tables are routinely used to train and compare machine-learning models, usually with random train–test splits and with prediction intervals calibrated on random hold-out rows. We audit two public sources, a country-level file derived from FAOSTAT and other tables (28,242 rows, 101 countries, 10 crops, 1990–2013) and an Indian district-level production table (246,091 rows, 33 states, 652 districts, 1997–2015), and study what these habits hide. The FAO file holds 13,130 distinct country–crop–year records; the other rows are copies created when yield records were joined to a temperature table with several rows per country and year (the row count of every record equals its join multiplicity). Public code repositories have noted this duplication informally; we trace and quantify it. Rainfall is constant within a country, and temperature and pesticide use are nearly country labels (intraclass correlations 1.00, 0.995 and 0.78). Random splits therefore reward recognising the country: tuned gradient boosting reaches R² = 0.93 on random rows and 0.66 on held-out countries, a crop-mean predictor scores 0.58 and 0.57, and a country–crop lookup with no covariates already reaches 0.93 on random rows and 0.89 forward in time (tuned boosting 0.91). Within-country anomalies of temperature and pesticide use add real within-country skill (RMSE 9–11% below the lookup) but no cross-country skill. For split conformal prediction at a nominal 90%, calibration on random rows gives 60% coverage on unseen FAO countries (50% on the raw duplicated rows), 84% on unseen Indian states and 90% on districts, and group-aware calibration restores 90% in all settings. The collapse follows the group fingerprint in the features: random forest 47%, gradient boosting 59% and ridge regression 88% on the same data, and 83% when fingerprint-free features are used. A relation, coverage ≈ 2Φ(z/ρ) − 1 with ρ the ratio of test to calibration residual scale, tracks a simulation to within 0.013 (cell means) and links the problem to the inflation ratio of group leakage. Weighted conformal prediction cannot help, because calibration and test rows are perfectly separable (AUC 1.0). A learned residual-scale model flags difficult groups (group-level Spearman 0.48 to 0.61, against 0.11 to 0.39 for a distance score) and modestly lifts coverage in the weakest groups at the cost of wider intervals, while five labelled local rows narrow FAO intervals by 12%. We provide an audit procedure, a protocol and open code.</w:t>
+        <w:t xml:space="preserve">Public crop-yield tables are routinely used to train and compare machine-learning models, usually with random train–test splits and with prediction intervals calibrated on random hold-out rows. We audit two public sources, a country-level file derived from FAOSTAT and other tables (28,242 rows, 101 countries, 10 crops, 1990–2013) and an Indian district-level production table (246,091 rows, 33 states, 652 districts, 1997–2015), and study what these habits hide. The FAO file holds 13,130 distinct country–crop–year records; the other rows are copies created when yield records were joined to a temperature table with several rows per country and year (the row count of every record equals its join multiplicity). Public code repositories have noted this duplication informally; we trace and quantify it. Rainfall is constant within a country, and temperature and pesticide use are nearly country labels (intraclass correlations 1.00, 0.995 and 0.78). Random splits therefore reward recognising the country: tuned gradient boosting reaches R² = 0.93 on random rows and 0.66 on held-out countries, a crop-mean predictor scores 0.58 and 0.57, and a country–crop lookup with no covariates already reaches 0.93 on random rows and 0.89 forward in time (tuned boosting 0.91). Within-country anomalies of temperature and pesticide use add real within-country skill (RMSE 9–11% below the lookup) but no cross-country skill. For split conformal prediction at a nominal 90%, calibration on random rows gives 60% coverage on unseen FAO countries (50% on the raw duplicated rows), 84% on unseen Indian states and 90% on districts, and group-aware calibration restores 90% in all settings. The collapse follows the group fingerprint in the features: random forest 47%, gradient boosting 59% and ridge regression 88% on the same data, and 83% when fingerprint-free features are used. A relation, coverage ≈ 2Φ(z/ρ) − 1 with ρ the ratio of test to calibration residual scale, tracks a simulation to within 0.013 (cell means) and links the problem to the inflation ratio of group leakage. Weighted conformal prediction cannot help, because calibration and test rows are perfectly separable (AUC 1.0). A learned residual-scale model flags difficult groups (group-level Spearman 0.48 to 0.61, against 0.11 to 0.39 for a distance score; clearly better only for districts) and modestly lifts coverage in the weakest groups at the cost of wider intervals, while five labelled local rows narrow FAO intervals by 12%. We provide an audit procedure, a protocol and open code.</w:t>
       </w:r>
     </w:p>
     <w:p>
@@ -8703,7 +8703,7 @@
         <w:pStyle w:val="BodyText"/>
       </w:pPr>
       <w:r>
-        <w:t xml:space="preserve">The Indian table shows the same pattern with a smaller gap, as expected from weaker fingerprints. Random-split R² is 0.778 for default gradient boosting and 0.833 when the district is given as a feature, against 0.734 for the crop mean; with districts held out the values are 0.758 (tuned gradient boosting) and 0.732 (with district ID), against 0.732 for the crop mean. With whole states held out, performance falls below the crop-mean level for the flexible models (R² 0.662 for tuned gradient boosting and 0.598 for random forest against 0.675), and none of the models is distinguishable from the crop mean given the intervals (ridge 0.683).</w:t>
+        <w:t xml:space="preserve">The Indian table shows the same pattern with a smaller gap, as expected from weaker fingerprints. Random-split R² is 0.778 for default gradient boosting and 0.833 when the district is given as a feature, against 0.734 for the crop mean; with districts held out the values are 0.758 (tuned gradient boosting) and 0.732 (with district ID), against 0.732 for the crop mean. With whole states held out, only random forest is clearly below the crop mean (R² 0.598 against 0.675, with non-overlapping intervals); tuned gradient boosting (0.662), the model with district ID (0.648) and ridge regression (0.683) are indistinguishable from it.</w:t>
       </w:r>
     </w:p>
     <w:p>
@@ -8711,7 +8711,7 @@
         <w:pStyle w:val="BodyText"/>
       </w:pPr>
       <w:r>
-        <w:t xml:space="preserve">Two cautions apply to the apparent benefit of cleaning. In the earlier runs with default models, random forest on the raw FAO rows reaches R² = 0.976 against 0.953 on the distinct records, so duplicates inflate the random-split score further; with countries held out the raw rows give a slightly</w:t>
+        <w:t xml:space="preserve">Two cautions apply to the apparent benefit of cleaning. In the earlier runs with default models, random forest on the raw FAO rows reaches R² = 0.976 against 0.953 on the distinct records, so duplicates inflate the random-split score further; with countries held out the raw rows give a</w:t>
       </w:r>
       <w:r>
         <w:t xml:space="preserve"> </w:t>
@@ -12189,7 +12189,7 @@
         </m:r>
       </m:oMath>
       <w:r>
-        <w:t xml:space="preserve">. The relation tracks the simulation closely (Fig. 3a): across the 28 simulation cells the mean actual coverage differs from Eq. (5) by at most 0.013 (by at most 0.071 for single replicates). On the FAO folds the relation is slightly pessimistic: for naive calibration the predicted coverage is 0.56 against 0.60 observed, a mean absolute error of 0.04 across folds with correlation 0.94 between predicted and observed fold coverage, which we attribute to heavier-than-Gaussian residual tails. For the Indian districts the predicted and observed values agree (0.892 and 0.897).</w:t>
+        <w:t xml:space="preserve">. The relation tracks the simulation closely (Fig. 3a): across the 28 simulation cells the mean actual coverage differs from Eq. (5) by at most 0.013 (by at most 0.071 for single replicates). On the FAO folds the relation is slightly pessimistic: for naive calibration the predicted coverage is 0.56 against 0.60 observed, a mean absolute error of 0.04 across folds with correlation 0.94 between predicted and observed fold coverage, which is possibly due to heavier-than-Gaussian residual tails (we did not examine the tails). For the Indian districts the predicted and observed values agree (0.892 and 0.897).</w:t>
       </w:r>
     </w:p>
     <w:p>
@@ -12214,7 +12214,7 @@
         </m:r>
       </m:oMath>
       <w:r>
-        <w:t xml:space="preserve">) naive and group calibration both cover about 0.90, and as</w:t>
+        <w:t xml:space="preserve">) naive calibration covers 0.90–0.93 and group calibration about 0.90, and as</w:t>
       </w:r>
       <w:r>
         <w:t xml:space="preserve"> </w:t>
@@ -12228,7 +12228,7 @@
         <w:t xml:space="preserve"> </w:t>
       </w:r>
       <w:r>
-        <w:t xml:space="preserve">grows naive coverage falls along Eq. (5), from 0.89 at</w:t>
+        <w:t xml:space="preserve">grows naive coverage falls along Eq. (5), from 0.86–0.89 at</w:t>
       </w:r>
       <w:r>
         <w:t xml:space="preserve"> </w:t>
@@ -12251,7 +12251,7 @@
         <w:t xml:space="preserve"> </w:t>
       </w:r>
       <w:r>
-        <w:t xml:space="preserve">to 0.42 at</w:t>
+        <w:t xml:space="preserve">to 0.39–0.42 at</w:t>
       </w:r>
       <w:r>
         <w:t xml:space="preserve"> </w:t>
@@ -12271,7 +12271,10 @@
         </m:r>
       </m:oMath>
       <w:r>
-        <w:t xml:space="preserve">, while group calibration stays between 0.89 and 0.90. Because the simulated residuals are Gaussian by construction, this agreement checks the algebra and the calibration logic, not the Gaussian assumption; the FAO folds, where the residuals are not Gaussian, are the real test and show the modest pessimism noted above.</w:t>
+        <w:t xml:space="preserve"> </w:t>
+      </w:r>
+      <w:r>
+        <w:t xml:space="preserve">(the ranges cover the 50- and 10-row cases), while group calibration stays between 0.89 and 0.90. Because the simulated residuals are Gaussian by construction, this agreement checks the algebra and the calibration logic, not the Gaussian assumption; the FAO folds, where the residuals are not Gaussian, are the real test and show the modest pessimism noted above.</w:t>
       </w:r>
     </w:p>
     <w:p>
@@ -14141,7 +14144,7 @@
         <w:pStyle w:val="FirstParagraph"/>
       </w:pPr>
       <w:r>
-        <w:t xml:space="preserve">Table 10 and Fig. 3b and 3c relate the collapse to the group fingerprint. The features identify the country in 60% of held-out FAO rows (chance 1.8%), the state in 31% of Indian rows (chance 14%) and the district in 1.9% (chance 0.4%), with mean feature intraclass correlation 0.92 on FAO and 0.07 (states) and 0.10 (districts) for India. Naive coverage of gradient boosting is 0.59, 0.85 and 0.90 in the same order. Model family matters as the theory predicts: on FAO, naive coverage is 0.47 for random forest, 0.59 for gradient boosting and 0.88 for ridge regression, while on the three settings group calibration gives about 0.89 to 0.90 for every model. Ridge regression is therefore robust to the collapse, but it is also the least accurate model under random splits, so a practitioner who chooses a model by random-split accuracy would choose one of the models whose intervals collapse. We have three settings, which show a monotone relation but not a fitted law, and the identification accuracy and feature correlation for India rest on a single continuous feature, so we read Table 9 as a consistent pattern and not as a quantitative calibration.</w:t>
+        <w:t xml:space="preserve">Table 10 and Fig. 3b and 3c relate the collapse to the group fingerprint. The features identify the country in 60% of held-out FAO rows (chance 1.8%), the state in 31% of Indian rows (chance 14%) and the district in 1.9% (chance 0.4%), with mean feature intraclass correlation 0.92 on FAO and 0.07 (states) and 0.10 (districts) for India. Naive coverage of gradient boosting is 0.59, 0.85 and 0.90 in the same order. Model family matters as the theory predicts: on FAO, naive coverage is 0.47 for random forest, 0.59 for gradient boosting and 0.88 for ridge regression, while on the three settings group calibration gives about 0.89 to 0.90 for every model. Ridge regression is therefore robust to the collapse, but it is also the least accurate of the covariate models under random splits, so a practitioner who chooses a model by random-split accuracy would choose one of the models whose intervals collapse. We have three settings, which show a monotone relation with the identification accuracy (but not with the mean feature correlation, which is lower for states than for districts) and not a fitted law, and the Indian feature correlations rest on a single continuous feature, so we read Table 10 as a consistent pattern and not as a quantitative calibration.</w:t>
       </w:r>
     </w:p>
     <w:p>
@@ -14149,7 +14152,7 @@
         <w:pStyle w:val="TableCaption"/>
       </w:pPr>
       <w:r>
-        <w:t xml:space="preserve">Table 10. Group fingerprint strength and conformal coverage by model family (naive / group calibration, nominal 90%). Group-ID accuracy is the five-nearest-neighbour accuracy of identifying the group from the features, with the largest-group share in brackets. Feature ICC is the mean intraclass correlation of the continuous features (the Indian table has one, log area).</w:t>
+        <w:t xml:space="preserve">Table 10. Group fingerprint strength and conformal coverage by model family (naive / group calibration, nominal 90%). Group-ID accuracy is the five-nearest-neighbour accuracy of identifying the group from the features, with the largest-group share in brackets. Feature ICC is the mean intraclass correlation of the continuous features (the Indian table has one, log area). Values come from a separate two-seed run with the Indian data subsampled to 60,000 rows (651 districts present), so they differ slightly from Table 7.</w:t>
       </w:r>
     </w:p>
     <w:tbl>
@@ -14172,7 +14175,7 @@
           <w:right w:w="60" w:type="dxa"/>
         </w:tblCellMar>
         <w:tblLook w:firstRow="1" w:lastRow="0" w:firstColumn="0" w:lastColumn="0" w:noHBand="0" w:noVBand="0" w:val="0020"/>
-        <w:tblCaption w:val="Table 10. Group fingerprint strength and conformal coverage by model family (naive / group calibration, nominal 90%). Group-ID accuracy is the five-nearest-neighbour accuracy of identifying the group from the features, with the largest-group share in brackets. Feature ICC is the mean intraclass correlation of the continuous features (the Indian table has one, log area)."/>
+        <w:tblCaption w:val="Table 10. Group fingerprint strength and conformal coverage by model family (naive / group calibration, nominal 90%). Group-ID accuracy is the five-nearest-neighbour accuracy of identifying the group from the features, with the largest-group share in brackets. Feature ICC is the mean intraclass correlation of the continuous features (the Indian table has one, log area). Values come from a separate two-seed run with the Indian data subsampled to 60,000 rows (651 districts present), so they differ slightly from Table 7."/>
       </w:tblPr>
       <w:tblGrid>
         <w:gridCol w:w="2061"/>
@@ -15228,6 +15231,14 @@
         </w:tc>
       </w:tr>
     </w:tbl>
+    <w:p>
+      <w:pPr>
+        <w:pStyle w:val="BodyText"/>
+      </w:pPr>
+      <w:r>
+        <w:t xml:space="preserve">The distance score has mixed results: it does nothing on FAO (share of countries below nominal-10: 0.204 against 0.196) but lowers the share on Indian districts (0.076 against 0.116).</w:t>
+      </w:r>
+    </w:p>
     <w:p>
       <w:pPr>
         <w:pStyle w:val="BodyText"/>
@@ -15681,7 +15692,7 @@
         <w:pStyle w:val="FirstParagraph"/>
       </w:pPr>
       <w:r>
-        <w:t xml:space="preserve">If intervals are to be trusted for a new place, it helps to know in advance whether the place is hard. Table 13 and Fig. 5 compare the two group-level scores. The learned scale correlates positively with a group’s error in all three settings (Spearman 0.48 on FAO, 0.53 for states, 0.61 for districts, with groups as the resampling unit), and more than the distance of the group’s covariate profile to the training groups (0.14, 0.11 and 0.39). The distance interval includes zero for FAO and for states, while that of the learned scale does not for any setting. The distance score is weak on FAO because the covariates are nearly country labels, so every new country is far from every training country and distance does not separate hard from easy ones, whereas the learned scale uses the model’s own error structure. A correlation of 0.3 to 0.6 is useful for flagging, not for a decision rule.</w:t>
+        <w:t xml:space="preserve">If intervals are to be trusted for a new place, it helps to know in advance whether the place is hard. Table 13 and Fig. 5 compare the two group-level scores. The learned scale correlates positively with a group’s error in all three settings (Spearman 0.48 on FAO, 0.53 for states, 0.61 for districts, with groups as the resampling unit), and numerically more than the distance of the group’s covariate profile to the training groups (0.14, 0.11 and 0.39). The distance interval includes zero for FAO and for states, while that of the learned scale does not for any setting, but the two intervals overlap on FAO and on states, so the learned scale is clearly better only for districts. A plausible reason for the weak distance score on FAO is that the covariates are nearly country labels, so every new country is far from every training country and distance does not separate hard from easy ones, whereas the learned scale uses the model’s own error structure (we did not test this explanation). A correlation of 0.3 to 0.6 is useful for flagging, not for a decision rule.</w:t>
       </w:r>
     </w:p>
     <w:p>
@@ -16129,7 +16140,7 @@
         <w:pStyle w:val="FirstParagraph"/>
       </w:pPr>
       <w:r>
-        <w:t xml:space="preserve">Table 14 and Fig. 6 show the effect of labelled local rows. On FAO, five rows per country reduce the interval width from 2.21 to 1.95 (12%) at unchanged coverage (0.894), and twenty rows to 1.94; the RMSE after the shift falls from 0.677 to 0.592. On the Indian districts the effect is small: width 1.95 at five rows and 1.88 at twenty (4%), RMSE from 0.697 to 0.671. The share of groups below 80% coverage moves little (0.195 to 0.167 on FAO and 0.115 to 0.109 on India), so local labels sharpen the intervals but do not repair the heterogeneity across groups. The largest relative gain comes from the first few rows, in line with the shrinkage form</w:t>
+        <w:t xml:space="preserve">Table 14 and Fig. 6 show the effect of labelled local rows. On FAO, five rows per country reduce the interval width from 2.21 to 1.95 (12%) at unchanged coverage (0.894), and twenty rows to 1.94; the RMSE after the shift falls from 0.677 to 0.592. On the Indian districts the effect is small: width 1.95 at five rows and 1.88 at twenty (4%), RMSE from 0.697 to 0.671. The share of groups below 80% coverage moves little (0.195 to 0.167 on FAO and 0.115 to 0.109 on India), so local labels sharpen the intervals but do not repair the heterogeneity across groups. On FAO the largest relative gain comes from the first few rows, in line with the shrinkage form</w:t>
       </w:r>
       <w:r>
         <w:t xml:space="preserve"> </w:t>
@@ -16173,7 +16184,7 @@
         <w:t xml:space="preserve"> </w:t>
       </w:r>
       <w:r>
-        <w:t xml:space="preserve">of the shift.</w:t>
+        <w:t xml:space="preserve">of the shift; on the Indian districts one to three rows give no gain and the benefit appears from about ten rows.</w:t>
       </w:r>
     </w:p>
     <w:p>
@@ -16239,7 +16250,7 @@
         <w:pStyle w:val="TableCaption"/>
       </w:pPr>
       <w:r>
-        <w:t xml:space="preserve">Table 14. Effect of m labelled local rows per test group (nominal 90%; mean over seeds and folds).</w:t>
+        <w:t xml:space="preserve">Table 14. Effect of m labelled local rows per test group (nominal 90%; mean over seeds and folds). The m = 0 rows differ slightly from the group scheme of Table 7 because the runs use different random draws.</w:t>
       </w:r>
     </w:p>
     <w:tbl>
@@ -16262,7 +16273,7 @@
           <w:right w:w="60" w:type="dxa"/>
         </w:tblCellMar>
         <w:tblLook w:firstRow="1" w:lastRow="0" w:firstColumn="0" w:lastColumn="0" w:noHBand="0" w:noVBand="0" w:val="0020"/>
-        <w:tblCaption w:val="Table 14. Effect of m labelled local rows per test group (nominal 90%; mean over seeds and folds)."/>
+        <w:tblCaption w:val="Table 14. Effect of m labelled local rows per test group (nominal 90%; mean over seeds and folds). The m = 0 rows differ slightly from the group scheme of Table 7 because the runs use different random draws."/>
       </w:tblPr>
       <w:tblGrid>
         <w:gridCol w:w="1752"/>
@@ -17808,7 +17819,7 @@
         <w:pStyle w:val="TableCaption"/>
       </w:pPr>
       <w:r>
-        <w:t xml:space="preserve">Table 15. Place lookups and fingerprint-free features on the FAO file (distinct records). Upper block: RMSE of log-yield (R² in brackets) by protocol. Lower block: conformal coverage on unseen countries at nominal 90% with each feature set (gradient boosting).</w:t>
+        <w:t xml:space="preserve">Table 15. Place lookups and fingerprint-free features on the FAO file (distinct records). Upper block: RMSE of log-yield (R² in brackets) by protocol. Lower block: conformal coverage on unseen countries at nominal 90% with each feature set (gradient boosting; a separate three-seed run, so naive coverage with full features is 0.602 against 0.598 in Table 7).</w:t>
       </w:r>
     </w:p>
     <w:tbl>
@@ -17831,7 +17842,7 @@
           <w:right w:w="60" w:type="dxa"/>
         </w:tblCellMar>
         <w:tblLook w:firstRow="1" w:lastRow="0" w:firstColumn="0" w:lastColumn="0" w:noHBand="0" w:noVBand="0" w:val="0020"/>
-        <w:tblCaption w:val="Table 15. Place lookups and fingerprint-free features on the FAO file (distinct records). Upper block: RMSE of log-yield (R² in brackets) by protocol. Lower block: conformal coverage on unseen countries at nominal 90% with each feature set (gradient boosting)."/>
+        <w:tblCaption w:val="Table 15. Place lookups and fingerprint-free features on the FAO file (distinct records). Upper block: RMSE of log-yield (R² in brackets) by protocol. Lower block: conformal coverage on unseen countries at nominal 90% with each feature set (gradient boosting; a separate three-seed run, so naive coverage with full features is 0.602 against 0.598 in Table 7)."/>
       </w:tblPr>
       <w:tblGrid>
         <w:gridCol w:w="3256"/>
@@ -18883,7 +18894,7 @@
         <w:pStyle w:val="FirstParagraph"/>
       </w:pPr>
       <w:r>
-        <w:t xml:space="preserve">The group shuffle used by the split generator was corrected during the study (shuffling a pandas string array in place); we reran the FAO group-held-out point-accuracy and the first conformal experiments and the results were unchanged to the reported precision; the later experiments were run with the corrected code. The primary conformal results use distinct FAO records. Applying the same procedure to the 28,242 raw rows, naive calibration covers 0.501 of rows from unseen countries (0.598 on distinct records), while group calibration gives 0.901; duplicated calibration rows make calibration on seen groups still more optimistic. Gradient boosting in the conformal experiments uses default settings; the tuned variant was used in the point-accuracy comparison only.</w:t>
+        <w:t xml:space="preserve">The group shuffle used by the split generator was corrected during the study (shuffling a pandas string array in place); the earlier default-model runs and the later runs with the corrected code agree within about 0.01 in R² for group-held-out FAO (for example gradient boosting 0.636 and 0.643), and all later experiments use the corrected code. The primary conformal results use distinct FAO records. Applying the same procedure to the 28,242 raw rows, naive calibration covers 0.501 of rows from unseen countries (0.598 on distinct records), while group calibration gives 0.901; duplicated calibration rows make calibration on seen groups still more optimistic. Gradient boosting in the conformal experiments uses default settings; the tuned variant was used in the point-accuracy comparison only.</w:t>
       </w:r>
     </w:p>
     <w:bookmarkEnd w:id="60"/>
@@ -18929,7 +18940,7 @@
         <w:pStyle w:val="FirstParagraph"/>
       </w:pPr>
       <w:r>
-        <w:t xml:space="preserve">The duplicated rows and the collapsing intervals share a cause: the file lets a model recognise the place. The duplication itself has been noted informally in public repositories [7, 8]; what we add is the exact trace, its effect on evaluation and the consequences for intervals. The fan-out inflates the number of rows of the best-documented countries and carries no information beyond the record it copies, so random splits put copies of every test row in the training set. Beyond the duplicates, the covariates are nearly constant within a country, so even distinct records are mostly informative about which country they belong to. The result is that a random-split score of 0.93 to 0.95 means little about use in a new country, where the same models are within about 0.1 of a crop-mean predictor and the model that is given the country is no better than it. Our results do not say that yield cannot be predicted across countries; they say that this file, with these four covariates, does not support that claim, and that the benchmark rewards the wrong behaviour.</w:t>
+        <w:t xml:space="preserve">The duplicated rows and the collapsing intervals both reflect that the file lets a model recognise the place. The duplication itself has been noted informally in public repositories [7, 8]; what we add is the exact trace, its effect on evaluation and the consequences for intervals. The fan-out inflates the number of rows of the best-documented countries and carries no information beyond the record it copies, so random splits put copies of most test rows (two thirds of rows belong to a repeated record) in the training set. Beyond the duplicates, the covariates are nearly constant within a country, so even distinct records are mostly informative about which country they belong to. The result is that a random-split score of 0.93 to 0.95 means little about use in a new country, where the same models are within about 0.1 of a crop-mean predictor and the model that is given the country is no better than it. Our results do not say that yield cannot be predicted across countries; they say that this file, with these four covariates, does not support that claim, and that the benchmark rewards the wrong behaviour.</w:t>
       </w:r>
     </w:p>
     <w:p>

</xml_diff>

<commit_message>
Verify and complete references; add verification status; clarify district count
Co-Authored-By: Claude Sonnet 5.5 <noreply@anthropic.com>
Claude-Session: https://claude.ai/code/session_015BikcSiH9x3JSigSSPaTZS
</commit_message>
<xml_diff>
--- a/paper/Crop_yield_audit_conformal_manuscript.docx
+++ b/paper/Crop_yield_audit_conformal_manuscript.docx
@@ -400,7 +400,7 @@
         <w:t xml:space="preserve"> </w:t>
       </w:r>
       <w:r>
-        <w:t xml:space="preserve">Leakage has been catalogued across disciplines and is a major source of irreproducible results [2]. Benchmark duplicates are a specific form: near-duplicate images shared by training and test sets of CIFAR inflate reported accuracy [13], and general guidance on avoiding machine-learning pitfalls lists such overlap among the most common errors [14]. For data with spatial, temporal, hierarchical or phylogenetic structure, blocked cross-validation gives more realistic estimates than random folds [3], and spatial validation has overturned apparent skill in large-scale ecological mapping [4]. The WILDS benchmarks make the same point for domain shift in general [15]. Mixed-effects approaches show that standard tree ensembles ignore within-cluster dependence [16]. We build on these results by tracing the origin of duplication in a specific file, by relating the memorisation of group identity to the behaviour of conformal intervals, and by comparing model families on the same data.</w:t>
+        <w:t xml:space="preserve">Leakage has been catalogued across disciplines and is a major source of irreproducible results [2]. Benchmark duplicates are a specific form: near-duplicate images shared by training and test sets of CIFAR inflate reported accuracy [13], and general guidance on avoiding machine-learning pitfalls covers data leakage and evaluation errors of this kind [14]. For data with spatial, temporal, hierarchical or phylogenetic structure, blocked cross-validation gives more realistic estimates than random folds [3], and spatial validation has overturned apparent skill in large-scale ecological mapping [4]. The WILDS benchmarks make the same point for domain shift in general [15]. Mixed-effects approaches show that standard tree ensembles ignore within-cluster dependence [16]. We build on these results by tracing the origin of duplication in a specific file, by relating the memorisation of group identity to the behaviour of conformal intervals, and by comparing model families on the same data.</w:t>
       </w:r>
     </w:p>
     <w:p>
@@ -4868,7 +4868,7 @@
         <w:pStyle w:val="FirstParagraph"/>
       </w:pPr>
       <w:r>
-        <w:t xml:space="preserve">The second source is a district-level table of area and production by crop and season in India for 1997–2015 [11]. It has 246,091 rows, 33 states, 652 districts and 124 crops, and no weather variables. We removed rows with missing production or non-positive area or production, computed yield as production divided by area, dropped crops with fewer than 20 rows, and trimmed the extreme 0.1% in each tail of log-yield. The cleaned table has 238,191 rows, 90 crops, 33 states and 652 districts. The exact cleaning rule of earlier analyses may differ; the rule above is the one used for every result reported here. We did not verify the original publication source of this table beyond the dataset page, and treat it as a convenient public benchmark.</w:t>
+        <w:t xml:space="preserve">The second source is a district-level table of area and production by crop and season in India for 1997–2015 [11]. It has 246,091 rows, 33 states, 652 distinct state–district combinations (the dataset page counts 646 distinct district names, because some names recur in several states) and 124 crops, and no weather variables. We call each state–district combination a district. We removed rows with missing production or non-positive area or production, computed yield as production divided by area, dropped crops with fewer than 20 rows, and trimmed the extreme 0.1% in each tail of log-yield. The cleaned table has 238,191 rows, 90 crops, 33 states and 652 districts. The exact cleaning rule of earlier analyses may differ; the rule above is the one used for every result reported here. We did not verify the original publication source of this table beyond the dataset page, and treat it as a convenient public benchmark.</w:t>
       </w:r>
     </w:p>
     <w:bookmarkEnd w:id="18"/>
@@ -23104,7 +23104,7 @@
         <w:pStyle w:val="BodyText"/>
       </w:pPr>
       <w:r>
-        <w:t xml:space="preserve">[3] D.R. Roberts, V. Bahn, S. Ciuti, M.S. Boyce, J. Elith, G. Guillera-Arroita, et al., Cross-validation strategies for data with temporal, spatial, hierarchical, or phylogenetic structure, Ecography 40 (8) (2017) 913–929. doi:10.1111/ecog.02881.</w:t>
+        <w:t xml:space="preserve">[3] D.R. Roberts, V. Bahn, S. Ciuti, M.S. Boyce, J. Elith, G. Guillera-Arroita, S. Hauenstein, J.J. Lahoz-Monfort, B. Schröder, W. Thuiller, D.I. Warton, B.A. Wintle, F. Hartig, C.F. Dormann, Cross-validation strategies for data with temporal, spatial, hierarchical, or phylogenetic structure, Ecography 40 (8) (2017) 913–929. doi:10.1111/ecog.02881.</w:t>
       </w:r>
     </w:p>
     <w:p>
@@ -23112,7 +23112,7 @@
         <w:pStyle w:val="BodyText"/>
       </w:pPr>
       <w:r>
-        <w:t xml:space="preserve">[4] P. Ploton, et al., Spatial validation reveals poor predictive performance of large-scale ecological mapping models, Nature Communications 11 (2020) 4540. doi:10.1038/s41467-020-18321-y.</w:t>
+        <w:t xml:space="preserve">[4] P. Ploton, F. Mortier, M. Réjou-Méchain, N. Barbier, N. Picard, V. Rossi, C. Dormann, G. Cornu, G. Viennois, N. Bayol, A. Lyapustin, S. Gourlet-Fleury, R. Pélissier, Spatial validation reveals poor predictive performance of large-scale ecological mapping models, Nature Communications 11 (1) (2020) 4540. doi:10.1038/s41467-020-18321-y.</w:t>
       </w:r>
     </w:p>
     <w:p>
@@ -23120,7 +23120,7 @@
         <w:pStyle w:val="BodyText"/>
       </w:pPr>
       <w:r>
-        <w:t xml:space="preserve">[5] P. Filippi, S.Y. Han, T.F.A. Bishop, On crop yield modelling, predicting, and forecasting and addressing the common issues in published studies, Precision Agriculture (2024), published online 7 December 2024.</w:t>
+        <w:t xml:space="preserve">[5] P. Filippi, S.Y. Han, T.F.A. Bishop, On crop yield modelling, predicting, and forecasting and addressing the common issues in published studies, Precision Agriculture 26 (1) (2025) 8. doi:10.1007/s11119-024-10212-2.</w:t>
       </w:r>
     </w:p>
     <w:p>
@@ -23128,7 +23128,7 @@
         <w:pStyle w:val="BodyText"/>
       </w:pPr>
       <w:r>
-        <w:t xml:space="preserve">[6] Y.O. Adjei, Do foundation model embeddings improve cross-country crop yield generalisation? A leave-one-country-out evaluation in Sub-Saharan Africa, arXiv:2605.08113 (preprint).</w:t>
+        <w:t xml:space="preserve">[6] Y.O. Adjei, Do foundation model embeddings improve cross-country crop yield generalisation? A leave-one-country-out evaluation in Sub-Saharan Africa, arXiv:2605.08113 (2026), preprint.</w:t>
       </w:r>
     </w:p>
     <w:p>
@@ -23136,7 +23136,7 @@
         <w:pStyle w:val="BodyText"/>
       </w:pPr>
       <w:r>
-        <w:t xml:space="preserve">[7] pnastra, crop-yield-forecast, GitHub repository, https://github.com/pnastra/crop-yield-forecast (accessed 2026).</w:t>
+        <w:t xml:space="preserve">[7] pnastra, crop-yield-forecast, GitHub repository, https://github.com/pnastra/crop-yield-forecast (accessed October 2026).</w:t>
       </w:r>
     </w:p>
     <w:p>
@@ -23144,7 +23144,7 @@
         <w:pStyle w:val="BodyText"/>
       </w:pPr>
       <w:r>
-        <w:t xml:space="preserve">[8] sivarjun21, crop-yield-prediction, GitHub repository, https://github.com/sivarjun21/crop-yield-prediction (accessed 2026).</w:t>
+        <w:t xml:space="preserve">[8] sivarjun21, crop-yield-prediction, GitHub repository, https://github.com/sivarjun21/crop-yield-prediction (accessed October 2026).</w:t>
       </w:r>
     </w:p>
     <w:p>
@@ -23152,7 +23152,7 @@
         <w:pStyle w:val="BodyText"/>
       </w:pPr>
       <w:r>
-        <w:t xml:space="preserve">[9] R. Patel, Crop Yield Prediction Dataset, Kaggle, https://www.kaggle.com/datasets/patelris/crop-yield-prediction-dataset (accessed 2026).</w:t>
+        <w:t xml:space="preserve">[9] R. Patel, Crop Yield Prediction Dataset, Kaggle, https://www.kaggle.com/datasets/patelris/crop-yield-prediction-dataset (accessed October 2026).</w:t>
       </w:r>
     </w:p>
     <w:p>
@@ -23160,7 +23160,7 @@
         <w:pStyle w:val="BodyText"/>
       </w:pPr>
       <w:r>
-        <w:t xml:space="preserve">[10] FAO, FAOSTAT: Production: Crops and livestock products (QCL), https://www.fao.org/faostat/en/#data/QCL (accessed 2026).</w:t>
+        <w:t xml:space="preserve">[10] FAO, FAOSTAT: Production: Crops and livestock products (QCL), https://www.fao.org/faostat/en/#data/QCL (accessed October 2026).</w:t>
       </w:r>
     </w:p>
     <w:p>
@@ -23168,7 +23168,7 @@
         <w:pStyle w:val="BodyText"/>
       </w:pPr>
       <w:r>
-        <w:t xml:space="preserve">[11] Abhinand, Crop Production in India, Kaggle, https://www.kaggle.com/datasets/abhinand05/crop-production-in-india (accessed 2026).</w:t>
+        <w:t xml:space="preserve">[11] Abhinand, Crop Production in India, Kaggle, https://www.kaggle.com/datasets/abhinand05/crop-production-in-india (accessed October 2026).</w:t>
       </w:r>
     </w:p>
     <w:p>
@@ -23184,7 +23184,7 @@
         <w:pStyle w:val="BodyText"/>
       </w:pPr>
       <w:r>
-        <w:t xml:space="preserve">[13] B. Barz, J. Denzler, Do we train on test data? Purging CIFAR of near-duplicates, Journal of Imaging 6 (6) (2020) 41.</w:t>
+        <w:t xml:space="preserve">[13] B. Barz, J. Denzler, Do we train on test data? Purging CIFAR of near-duplicates, Journal of Imaging 6 (6) (2020) 41. doi:10.3390/jimaging6060041.</w:t>
       </w:r>
     </w:p>
     <w:p>
@@ -23192,7 +23192,7 @@
         <w:pStyle w:val="BodyText"/>
       </w:pPr>
       <w:r>
-        <w:t xml:space="preserve">[14] M.A. Lones, How to avoid machine learning pitfalls: a guide for academic researchers, arXiv:2108.02497 (2021).</w:t>
+        <w:t xml:space="preserve">[14] M.A. Lones, Avoiding common machine learning pitfalls, Patterns 5 (10) (2024) 101046. doi:10.1016/j.patter.2024.101046.</w:t>
       </w:r>
     </w:p>
     <w:p>
@@ -23200,7 +23200,7 @@
         <w:pStyle w:val="BodyText"/>
       </w:pPr>
       <w:r>
-        <w:t xml:space="preserve">[15] P.W. Koh, et al., WILDS: a benchmark of in-the-wild distribution shifts, Proceedings of the 38th International Conference on Machine Learning, PMLR 139 (2021) 5637–5664.</w:t>
+        <w:t xml:space="preserve">[15] P.W. Koh, S. Sagawa, H. Marklund, S.M. Xie, M. Zhang, A. Balsubramani, W. Hu, M. Yasunaga, R.L. Phillips, I. Gao, T. Lee, E. David, I. Stavness, W. Guo, B. Earnshaw, I. Haque, S.M. Beery, J. Leskovec, A. Kundaje, E. Pierson, S. Levine, C. Finn, P. Liang, WILDS: a benchmark of in-the-wild distribution shifts, in: Proceedings of the 38th International Conference on Machine Learning, PMLR 139 (2021) 5637–5664.</w:t>
       </w:r>
     </w:p>
     <w:p>
@@ -23216,7 +23216,7 @@
         <w:pStyle w:val="BodyText"/>
       </w:pPr>
       <w:r>
-        <w:t xml:space="preserve">[17] V. Vovk, A. Gammerman, G. Shafer, Algorithmic Learning in a Random World, Springer, New York, 2005. doi:10.1007/b106715.</w:t>
+        <w:t xml:space="preserve">[17] V. Vovk, A. Gammerman, G. Shafer, Algorithmic Learning in a Random World, Springer, 2005. doi:10.1007/b106715.</w:t>
       </w:r>
     </w:p>
     <w:p>
@@ -23240,7 +23240,7 @@
         <w:pStyle w:val="BodyText"/>
       </w:pPr>
       <w:r>
-        <w:t xml:space="preserve">[20] R.J. Tibshirani, R.F. Barber, E.J. Candès, A. Ramdas, Conformal prediction under covariate shift, Advances in Neural Information Processing Systems 32 (2019). arXiv:1904.06019.</w:t>
+        <w:t xml:space="preserve">[20] R.J. Tibshirani, R.F. Barber, E.J. Candès, A. Ramdas, Conformal prediction under covariate shift, in: Advances in Neural Information Processing Systems 32 (NeurIPS 2019), 2019. arXiv:1904.06019.</w:t>
       </w:r>
     </w:p>
     <w:p>
@@ -23264,7 +23264,7 @@
         <w:pStyle w:val="BodyText"/>
       </w:pPr>
       <w:r>
-        <w:t xml:space="preserve">[23] Y. Romano, E. Patterson, E.J. Candès, Conformalized quantile regression, Advances in Neural Information Processing Systems 32 (2019). arXiv:1905.03222.</w:t>
+        <w:t xml:space="preserve">[23] Y. Romano, E. Patterson, E.J. Candès, Conformalized quantile regression, in: Advances in Neural Information Processing Systems 32 (NeurIPS 2019), 2019. arXiv:1905.03222.</w:t>
       </w:r>
     </w:p>
     <w:p>
@@ -23296,7 +23296,7 @@
         <w:pStyle w:val="BodyText"/>
       </w:pPr>
       <w:r>
-        <w:t xml:space="preserve">[27] M. Farag, A. Emam, J. Leonhardt, R. Roscher, Enhancing decision support in crop production: analyzing conformal prediction for uncertainty quantification, Computers and Electronics in Agriculture 237 (2025). doi:10.1016/j.compag.2025.110559.</w:t>
+        <w:t xml:space="preserve">[27] M. Farag, A. Emam, J. Leonhardt, R. Roscher, Enhancing decision support in crop production: analyzing conformal prediction for uncertainty quantification, Computers and Electronics in Agriculture 237 (2025) 110559. doi:10.1016/j.compag.2025.110559.</w:t>
       </w:r>
     </w:p>
     <w:p>
@@ -23304,7 +23304,7 @@
         <w:pStyle w:val="BodyText"/>
       </w:pPr>
       <w:r>
-        <w:t xml:space="preserve">[28] P. Melki, L. Bombrun, B. Diallo, J. Dias, J.-P. da Costa, Group-conditional conformal prediction via quantile regression calibration for crop and weed classification, Proceedings of the IEEE/CVF International Conference on Computer Vision Workshops (2023) 614–623.</w:t>
+        <w:t xml:space="preserve">[28] P. Melki, L. Bombrun, B. Diallo, J. Dias, J.-P. Da Costa, Group-conditional conformal prediction via quantile regression calibration for crop and weed classification, in: Proceedings of the IEEE/CVF International Conference on Computer Vision (ICCV) Workshops, 2023, pp. 614–623.</w:t>
       </w:r>
     </w:p>
     <w:p>
@@ -23328,7 +23328,7 @@
         <w:pStyle w:val="BodyText"/>
       </w:pPr>
       <w:r>
-        <w:t xml:space="preserve">[31] A. Bhattacharyya, R.F. Barber, Group-weighted conformal prediction, Electronic Journal of Statistics 20 (1) (2026). doi:10.1214/26-EJS2506.</w:t>
+        <w:t xml:space="preserve">[31] A. Bhattacharyya, R.F. Barber, Group-weighted conformal prediction, Electronic Journal of Statistics 20 (1) (2026) 1171–1199. doi:10.1214/26-EJS2506.</w:t>
       </w:r>
     </w:p>
     <w:p>
@@ -23336,7 +23336,7 @@
         <w:pStyle w:val="BodyText"/>
       </w:pPr>
       <w:r>
-        <w:t xml:space="preserve">[32] H. Meyer, E. Pebesma, Predicting into unknown space? Estimating the area of applicability of spatial prediction models, Methods in Ecology and Evolution 12 (2021) 1620–1633. doi:10.1111/2041-210X.13650.</w:t>
+        <w:t xml:space="preserve">[32] H. Meyer, E. Pebesma, Predicting into unknown space? Estimating the area of applicability of spatial prediction models, Methods in Ecology and Evolution 12 (9) (2021) 1620–1633. doi:10.1111/2041-210X.13650.</w:t>
       </w:r>
     </w:p>
     <w:p>
@@ -23368,7 +23368,7 @@
         <w:pStyle w:val="BodyText"/>
       </w:pPr>
       <w:r>
-        <w:t xml:space="preserve">[36] A.E. Hoerl, R.W. Kennard, Ridge regression: biased estimation for nonorthogonal problems, Technometrics 12 (1) (1970) 55–67.</w:t>
+        <w:t xml:space="preserve">[36] A.E. Hoerl, R.W. Kennard, Ridge regression: biased estimation for nonorthogonal problems, Technometrics 12 (1) (1970) 55–67. doi:10.1080/00401706.1970.10488634.</w:t>
       </w:r>
     </w:p>
     <w:p>
@@ -23384,7 +23384,7 @@
         <w:pStyle w:val="BodyText"/>
       </w:pPr>
       <w:r>
-        <w:t xml:space="preserve">[38] F. Pedregosa, G. Varoquaux, et al., Scikit-learn: machine learning in Python, Journal of Machine Learning Research 12 (2011) 2825–2830.</w:t>
+        <w:t xml:space="preserve">[38] F. Pedregosa, G. Varoquaux, A. Gramfort, V. Michel, B. Thirion, O. Grisel, M. Blondel, P. Prettenhofer, R. Weiss, V. Dubourg, J. Vanderplas, A. Passos, D. Cournapeau, M. Brucher, M. Perrot, É. Duchesnay, Scikit-learn: machine learning in Python, Journal of Machine Learning Research 12 (2011) 2825–2830.</w:t>
       </w:r>
     </w:p>
     <w:bookmarkEnd w:id="75"/>

</xml_diff>